<commit_message>
Documentos al día: reacción de golpe, ragdoll, básico sostenido y cancelable, armadura
PENDIENTES marca como probado lo de esta semana; la arquitectura suma la interrupción
del ataque básico al ciclo de vida y los estados de aturdido/muerte/ragdoll a la
sección de animación; el glosario gana tres mecánicas (ataque sostenido, cancelar el
básico, muñeco de trapo); el LEEME del modo resume la sensación del personaje y el
balance nuevo en su estado actual.

Co-Authored-By: Claude Opus 5 <noreply@anthropic.com>
</commit_message>
<xml_diff>
--- a/DesignDocuments/GAS_Arquitectura.docx
+++ b/DesignDocuments/GAS_Arquitectura.docx
@@ -2537,6 +2537,24 @@
     </w:p>
     <w:p>
       <w:pPr>
+        <w:pStyle w:val="ListParagraph"/>
+        <w:numPr>
+          <w:ilvl w:val="0"/>
+          <w:numId w:val="3"/>
+        </w:numPr>
+        <w:spacing w:after="60"/>
+      </w:pPr>
+      <w:r>
+        <w:rPr>
+          <w:rFonts w:ascii="Consolas" w:cs="Consolas" w:eastAsia="Consolas" w:hAnsi="Consolas"/>
+          <w:sz w:val="20"/>
+          <w:szCs w:val="20"/>
+        </w:rPr>
+        <w:t xml:space="preserve">Interrupción. El ataque BÁSICO (la instancia del slot PrimaryAttack, marcada IsInterruptible al equipar, y los pasos de combo que clona) se puede cortar con cualquier otra habilidad: el servidor incrementa AbilitySystemComponent.CancelSerial al activar otro slot, y HitTimingRoutine lo compara después de cada espera — lo que ya pegó queda, los HitFrame que faltaban no salen, y la rutina termina sin EndAbility (el fin lo manda la habilidad nueva). El cooldown ya pagado no se devuelve. Del lado del dueño, HandleAbilityInput deja pasar los demás botones mientras corre el básico; ninguna otra habilidad es interrumpible. Y el básico se repite solo con el botón sostenido (AutoRepeatPrimaryAttack), pensado para el gatillo del control.</w:t>
+      </w:r>
+    </w:p>
+    <w:p>
+      <w:pPr>
         <w:pStyle w:val="Heading2"/>
         <w:spacing w:after="120" w:before="280"/>
       </w:pPr>
@@ -2893,6 +2911,23 @@
           <w:szCs w:val="20"/>
         </w:rPr>
         <w:t xml:space="preserve">Hay una quinta ranura, PLACEHOLDER_Hit, en la capa UpperBody: la reacción de golpe. La dispara NetworkAbilitySystemComponent al ver BAJAR la vida sincronizada (OnNetHealthChanged), así que corre igual en el dueño, en el host y en los observadores sin ningún RPC. La postura la resuelve el AnimatorOverrideController de cada clase reemplazando ese clip; con el escudo arriba no pasa por acá (es el HoldImpact del bloqueo). Sin el trigger HitTrigger en el Animator no hay reacción y no hay error.</w:t>
+      </w:r>
+    </w:p>
+    <w:p>
+      <w:pPr>
+        <w:pBdr>
+          <w:left w:val="single" w:color="E0A800" w:sz="14" w:space="6"/>
+        </w:pBdr>
+        <w:shd w:fill="FFF6DA" w:val="clear"/>
+        <w:spacing w:after="160" w:before="100"/>
+        <w:ind w:left="144" w:right="144"/>
+      </w:pPr>
+      <w:r>
+        <w:rPr>
+          <w:sz w:val="20"/>
+          <w:szCs w:val="20"/>
+        </w:rPr>
+        <w:t xml:space="preserve">Y dos estados más de cuerpo entero, en la capa Base, manejados por bools: IsStunned (leído del tag State_Stunned en cada copia, sin RPC) lleva a PLACEHOLDER_Stun en bucle; IsDead lleva a PLACEHOLDER_Death, en cuya ranura PlayerController mete al morir uno de sus DeathClips al azar. Si el prefab tiene un RagdollController armado, la muerte no usa la animación: suelta el cuerpo (Animator y cápsula apagados, huesos a la capa 2 para que los ataques no le peguen al cadáver) y lo empuja en la dirección del golpe, que viaja en el mismo ObserversRpc de la muerte; la cámara del dueño sigue la cadera (CameraFollowsRagdoll). Los estados etiquetados Loop no se cortan por la reacción de golpe: se decide en código, porque un trigger que no se consume queda armado y dispararía tarde.</w:t>
       </w:r>
     </w:p>
     <w:p>

</xml_diff>

<commit_message>
Multiplicadores que se multiplican, tope de ataque en 0.3 s, limpieza del proyecto y números a la altura del pecho
- AttributeValue guarda la lista de multiplicadores activos y usa el producto
  (antes se sumaban: ×0.5 y ×0.5 daban ×0). Tope de velocidad de ataque:
  MinAttackInterval = 0.3 s.
- Limpieza (herramienta de un solo uso, ya borrada): fuera el NetworkAnimator
  inerte del jugador, SampleScene, los ejemplos de TextMesh Pro y las carpetas
  vacías de Assets/FishNet; el prefab de AbilityPreview pasa a Prefabs/Tools.
- Código muerto: ASC.GetCooldownRemainingNormalized y BotController.AllyInTrouble.
- UI_DamageNumbers: los números nacen a la altura del pecho (HeightFraction 0.6
  entre los pies y la barra de vida) y suben 0.6 m.
- GE_Tiger_Buff / GE_Tiger_Buff_Rage: valores de Gustavo.
- CLAUDE.md, GAS_Arquitectura.docx y PENDIENTES actualizados (sección 9: la
  depuración).

Co-Authored-By: Claude Opus 5.5 <noreply@anthropic.com>
</commit_message>
<xml_diff>
--- a/DesignDocuments/GAS_Arquitectura.docx
+++ b/DesignDocuments/GAS_Arquitectura.docx
@@ -1118,6 +1118,21 @@
         <w:spacing w:after="120" w:line="276"/>
       </w:pPr>
       <w:r>
+        <w:rPr>
+          <w:b/>
+          <w:bCs/>
+        </w:rPr>
+        <w:t xml:space="preserve">Los multiplicadores se multiplican.</w:t>
+      </w:r>
+      <w:r>
+        <w:t xml:space="preserve"> MultiplicativeModifier es el PRODUCTO de los modificadores Multiply activos: AttributeValue guarda la lista (uno por efecto y por acumulación) y la rehace cada vez que entra o sale uno, sin dividir. ×0.5 y ×0.5 dan ×0.25. Hasta el 25 de septiembre de 2026 se SUMABAN (×0.5 y ×0.5 daban ×0): dos bonos de velocidad de ataque llevaban al tope, y la bolsa más una ralentización dejaban al portador casi quieto. La velocidad de ataque tiene además un tope: nunca menos de 0.3 s entre ataques (MinAttackInterval).</w:t>
+      </w:r>
+    </w:p>
+    <w:p>
+      <w:pPr>
+        <w:spacing w:after="120" w:line="276"/>
+      </w:pPr>
+      <w:r>
         <w:t xml:space="preserve">Ese recálculo lo hace </w:t>
       </w:r>
       <w:r>
@@ -6006,7 +6021,7 @@
         <w:t xml:space="preserve">La animación viaja a mano.</w:t>
       </w:r>
       <w:r>
-        <w:t xml:space="preserve"> El NetworkAnimator del prefab del jugador está inerte: su campo Animator quedó vacío y el Animator vive en un hijo, así que FishNet no lo encuentra y no sincroniza nada, sin avisar. Las animaciones de habilidad, golpe, stun y muerte van por RPC del NetworkASC; caminar, saltar y caer (Speed, MoveX, MoveY, IsJumping, VerticalSpeed) y la inclinación del torso (AimPitch) los manda por RPC no confiable, a 15 por segundo y solo cuando cambian, quien manda sobre el personaje: el dueño, o el servidor si es un bot. Un parámetro nuevo del Animator que tenga que verse en otras pantallas hay que mandarlo.</w:t>
+        <w:t xml:space="preserve"> El prefab del jugador NO tiene NetworkAnimator: el que tenía estaba inerte (su campo Animator vacío y el Animator en un hijo, así que FishNet no lo encontraba y no sincronizaba nada, sin avisar) y se quitó el 25 de septiembre de 2026. Las animaciones de habilidad, golpe, stun y muerte van por RPC del NetworkASC; caminar, saltar y caer (Speed, MoveX, MoveY, IsJumping, VerticalSpeed) y la inclinación del torso (AimPitch) los manda por RPC no confiable, a 15 por segundo y solo cuando cambian, quien manda sobre el personaje: el dueño, o el servidor si es un bot. Un parámetro nuevo del Animator que tenga que verse en otras pantallas hay que mandarlo.</w:t>
       </w:r>
     </w:p>
     <w:p>
@@ -11167,7 +11182,7 @@
         <w:spacing w:after="60"/>
       </w:pPr>
       <w:r>
-        <w:t xml:space="preserve">Esperar que un parámetro nuevo del Animator llegue a los demás porque “lo sincroniza el NetworkAnimator”: está inerte. Se manda a mano.</w:t>
+        <w:t xml:space="preserve">Esperar que un parámetro nuevo del Animator llegue a los demás porque “lo sincroniza el NetworkAnimator”: el jugador no tiene uno (el que había estaba inerte y se quitó). Se manda a mano.</w:t>
       </w:r>
     </w:p>
     <w:p>

</xml_diff>

<commit_message>
Documentos al día tras la prueba de 9: LEEME, arquitectura, guía, diseño de clases y PENDIENTES
- LEEME del modo: estado al 28 de septiembre (entrega de 3 s, retroalimentación
  visual, inglés, barrido entre partidas, seguro de la preparación, Unstuck,
  tótems, velocidad de ataque), tabla del Objetivo y pendientes conocidos al día.
- GAS_Arquitectura: avisos de fin con la habilidad (escudo eterno), variantes de
  TagSwitch heredan IsInterruptible, números verdes de curaciones directas, y la
  regla de los multiplicadores.
- GAS_Guia: checklist y errores frecuentes con lo mismo.
- Diseño de clases: entregar en 3 s, no entrar a la base con la bolsa, tótems.
- PENDIENTES: qué sigue rumbo al showcase, prueba de 9 cerrada.

Co-Authored-By: Claude Opus 5.5 <noreply@anthropic.com>
</commit_message>
<xml_diff>
--- a/DesignDocuments/GAS_Arquitectura.docx
+++ b/DesignDocuments/GAS_Arquitectura.docx
@@ -2573,7 +2573,7 @@
           <w:sz w:val="20"/>
           <w:szCs w:val="20"/>
         </w:rPr>
-        <w:t xml:space="preserve"> Una habilidad marcada IsInterruptible se puede cortar activando OTRA. El ataque básico lo trae siempre (EquipCharacterClass lo fuerza en el slot PrimaryAttack, y los pasos de combo lo heredan); cualquier otra lo pide marcando la casilla en su asset — hoy, los lanzamientos del Bárbaro y del Pícaro. El servidor incrementa AbilitySystemComponent.CancelSerial en CADA activación, y las rutinas interrumpibles lo comparan después de cada espera: lo que ya pegó (o ya salió) queda, lo que faltaba no pasa, y la rutina termina sin EndAbility (el fin lo manda la habilidad nueva). Una habilidad nunca se corta a sí misma: apretar su propio botón mientras corre no hace nada, así el básico encadena su combo y el lanzamiento no se reinicia en bucle. El permiso se mira en DOS lados: el servidor corta, pero antes el cliente tiene que dejar leer el botón nuevo mientras hay algo corriendo (_attackInterruptible y _runningSlot en HandleAbilityInput) — si solo se arregla un lado, marcar la casilla no cambia nada. El básico se repite solo con el botón sostenido (AutoRepeatPrimaryAttack), pensado para el gatillo del control.</w:t>
+        <w:t xml:space="preserve"> Una habilidad marcada IsInterruptible se puede cortar activando OTRA. El ataque básico lo trae siempre (EquipCharacterClass lo fuerza en el slot PrimaryAttack, y los pasos de combo y las variantes de un GA_TagSwitch lo heredan); cualquier otra lo pide marcando la casilla en su asset — hoy, los lanzamientos del Bárbaro y del Pícaro. El servidor incrementa AbilitySystemComponent.CancelSerial en CADA activación, y las rutinas interrumpibles lo comparan después de cada espera: lo que ya pegó (o ya salió) queda, lo que faltaba no pasa, y la rutina termina sin EndAbility (el fin lo manda la habilidad nueva). Una habilidad nunca se corta a sí misma: apretar su propio botón mientras corre no hace nada, así el básico encadena su combo y el lanzamiento no se reinicia en bucle. El permiso se mira en DOS lados: el servidor corta, pero antes el cliente tiene que dejar leer el botón nuevo mientras hay algo corriendo (_attackInterruptible y _runningSlot en HandleAbilityInput) — si solo se arregla un lado, marcar la casilla no cambia nada. El básico se repite solo con el botón sostenido (AutoRepeatPrimaryAttack), pensado para el gatillo del control.</w:t>
       </w:r>
     </w:p>
     <w:p>
@@ -6162,7 +6162,7 @@
           <w:sz w:val="20"/>
           <w:szCs w:val="20"/>
         </w:rPr>
-        <w:t xml:space="preserve"> también limpia el estado de mantener. Cubre los casos en que el mantenido termina sin que el jugador suelte el botón: el servidor rechaza la activación, se acaba la energía, o se abre un menú modal.</w:t>
+        <w:t xml:space="preserve"> también limpia el estado de mantener. Cubre los casos en que el mantenido termina sin que el jugador suelte el botón: el servidor rechaza la activación, se acaba la energía, o se abre un menú modal. Pero los avisos de FIN que manda el servidor dicen CUÁL habilidad terminó (FinishAttack(GameplayAbility), con el índice del registro): con un mantenido arriba, que termine OTRA —el básico que el escudo cortó al subir— no lo baja. Sin eso el dueño creía haber bajado el escudo mientras el servidor lo seguía manteniendo: podía pegar con el escudo puesto y, al soltar, el aviso ya no salía (el “escudo eterno”). Y como segunda red, el servidor rechaza cualquier activación mientras haya un mantenido arriba.</w:t>
       </w:r>
     </w:p>
     <w:p>
@@ -11195,7 +11195,33 @@
         <w:spacing w:after="60"/>
       </w:pPr>
       <w:r>
-        <w:t xml:space="preserve">Curar escribiendo la vida directo sin llamar NotifyHealedAlly: funciona, pero el Soporte no carga la definitiva con esa curación.</w:t>
+        <w:t xml:space="preserve">Curar escribiendo la vida directo sin llamar NotifyHealedAlly: funciona, pero el Soporte no carga la definitiva con esa curación. Y tampoco sale su número verde: hay que llamar también ShowCombatNumber(curado, ECombatNumber.Heal). Lo que pasa por ExecuteInstantEffect avisa las dos cosas solo.</w:t>
+      </w:r>
+    </w:p>
+    <w:p>
+      <w:pPr>
+        <w:pStyle w:val="ListParagraph"/>
+        <w:numPr>
+          <w:ilvl w:val="0"/>
+          <w:numId w:val="2"/>
+        </w:numPr>
+        <w:spacing w:after="60"/>
+      </w:pPr>
+      <w:r>
+        <w:t xml:space="preserve">Una habilidad que CLONA a otra (un switch, un combo) sin pasarle IsInterruptible: la copia no mira el corte y pega aunque la hayan cancelado. Pasó con el martillo del Paladín: clic izquierdo y enseguida el escudo, y el golpe llegaba igual. GA_TagSwitch y GA_ComboSequence ya se la pasan.</w:t>
+      </w:r>
+    </w:p>
+    <w:p>
+      <w:pPr>
+        <w:pStyle w:val="ListParagraph"/>
+        <w:numPr>
+          <w:ilvl w:val="0"/>
+          <w:numId w:val="2"/>
+        </w:numPr>
+        <w:spacing w:after="60"/>
+      </w:pPr>
+      <w:r>
+        <w:t xml:space="preserve">Sumar los multiplicadores: ×0.5 y ×0.5 daban ×0. Hoy AttributeValue guarda la lista y usa el producto; un sistema nuevo que toque atributos tiene que pasar por ApplyEffectModifiers, no escribir MultiplicativeModifier a mano.</w:t>
       </w:r>
     </w:p>
     <w:p>

</xml_diff>

<commit_message>
Pendientes y documentos al día: Clérigo base probado y pose del libro
- PENDIENTES: kit base del Clérigo marcado como probado, con los números
  que quedaron en el editor; aviso de que GE_SmiteHealing lo comparte con
  el Paladín; pasos que faltan para el libro en la mano izquierda.
- Diseño de clases: estado del Clérigo, arma en cada mano, Destello nuevo.
- Guía: GA_Teleport en el catálogo de genéricos.
- Arquitectura: la capa OffHandPose del Animator.
- Se borra MercOffHandPoseSetup (ya corrida).

Co-Authored-By: Claude Opus 5.5 <noreply@anthropic.com>
</commit_message>
<xml_diff>
--- a/DesignDocuments/GAS_Arquitectura.docx
+++ b/DesignDocuments/GAS_Arquitectura.docx
@@ -3055,6 +3055,23 @@
           <w:szCs w:val="20"/>
         </w:rPr>
         <w:t xml:space="preserve">Y dos estados más de cuerpo entero, en la capa Base, manejados por bools: IsStunned (leído del tag State_Stunned en cada copia, sin RPC) lleva a PLACEHOLDER_Stun en bucle; IsDead lleva a PLACEHOLDER_Death, en cuya ranura PlayerController mete al morir uno de sus DeathClips al azar. Si el prefab tiene un RagdollController armado, la muerte no usa la animación: suelta el cuerpo (Animator y cápsula apagados, huesos a la capa 2 para que los ataques no le peguen al cadáver) y lo empuja en la dirección del golpe, que viaja en el mismo ObserversRpc de la muerte; la cámara del dueño sigue la cadera (CameraFollowsRagdoll). Los estados etiquetados Loop no se cortan por la reacción de golpe: se decide en código, porque un trigger que no se consume queda armado y dispararía tarde.</w:t>
+      </w:r>
+    </w:p>
+    <w:p>
+      <w:pPr>
+        <w:pBdr>
+          <w:left w:val="single" w:color="E0A800" w:sz="14" w:space="6"/>
+        </w:pBdr>
+        <w:shd w:fill="FFF6DA" w:val="clear"/>
+        <w:spacing w:after="160" w:before="100"/>
+        <w:ind w:left="144" w:right="144"/>
+      </w:pPr>
+      <w:r>
+        <w:rPr>
+          <w:sz w:val="20"/>
+          <w:szCs w:val="20"/>
+        </w:rPr>
+        <w:t xml:space="preserve">Y una capa más, la última: OffHandPose, con la máscara del brazo izquierdo y un solo estado con PLACEHOLDER_OffHandPose. Es la pose fija de la mano secundaria mientras se juega una clase (el libro del Clérigo): si el CharacterClassDefinition trae un clip en OffHandPose, BuildClassAnimator lo mete en esa ranura y la capa va a peso 1; si no, queda en 0 y el brazo se anima normal. Por ir al final, el brazo sigue sosteniendo el objeto mientras UpperBody ataca con la otra mano. Cambiar de controller devuelve las capas a su peso por defecto, así que el peso se pone después de asignarlo; al morir sin ragdoll se apaga para que el brazo caiga con el cuerpo, y se vuelve a prender al revivir. No viaja por la red: cada peer arma su copia del Animator con la misma clase. Las Copias exactas del Ilusionista usan el mismo BuildClassAnimator.</w:t>
       </w:r>
     </w:p>
     <w:p>

</xml_diff>

<commit_message>
VFX de curación del aura del Paladín y documentos al día
- PaladinAuraPassive: destello sobre cada aliado que el aura cura (al
  golpear o al bloquear), en todas las pantallas. Solo si le subió la vida.
  Heal VFX, offset, pegado y duración en el componente; puesto en los
  cuatro prefabs del Paladín.
- IPassiveTargetVFX + NetworkASC.ServerPlayPassiveVFXOn: una pasiva dibuja
  un VFX sobre otro personaje; por red viaja solo el objetivo.
- Ajustes de Gustavo a los GE de las cuatro auras.
- PENDIENTES: Dominio de la vida terminado, el Orden y la Luz como lo que
  sigue. Diseño de clases, arquitectura y guía con IHealModifier,
  IPassiveTargetVFX, StartedThisActivation y la Resurrección.

Co-Authored-By: Claude Opus 5.5 <noreply@anthropic.com>
</commit_message>
<xml_diff>
--- a/DesignDocuments/GAS_Arquitectura.docx
+++ b/DesignDocuments/GAS_Arquitectura.docx
@@ -2630,6 +2630,24 @@
     </w:p>
     <w:p>
       <w:pPr>
+        <w:pStyle w:val="ListParagraph"/>
+        <w:numPr>
+          <w:ilvl w:val="0"/>
+          <w:numId w:val="3"/>
+        </w:numPr>
+        <w:spacing w:after="60"/>
+      </w:pPr>
+      <w:r>
+        <w:rPr>
+          <w:bCs/>
+          <w:sz w:val="20"/>
+          <w:szCs w:val="20"/>
+        </w:rPr>
+        <w:t xml:space="preserve">Una habilidad que cobra DESPUÉS de Activate() tiene que avisarlo. Un lanzamiento (GA_ProjectileShoot) cobra al SOLTAR el proyectil, no al empezar la animación: al salir de Activate() todavía no comprometió nada, y el servidor creía que se había plantado y no les mandaba la animación a los demás (el hacha, las dagas y el arco del Clérigo volaban sin que se viera el brazo). Por eso existe StartedThisActivation: la habilidad la marca al arrancar de verdad, ServerActivateAbility la reinicia junto con CommittedThisActivation, y la animación se manda si cualquiera de las dos está en true.</w:t>
+      </w:r>
+    </w:p>
+    <w:p>
+      <w:pPr>
         <w:pStyle w:val="Heading2"/>
         <w:spacing w:after="120" w:before="280"/>
       </w:pPr>
@@ -4464,6 +4482,14 @@
       </w:pPr>
       <w:r>
         <w:t xml:space="preserve">El pipeline trabaja sobre el TOTAL (físico + mágico) y reparte el resultado en la misma proporción, para no romper la distinción que necesitan la Defensa y el escudo más abajo.</w:t>
+      </w:r>
+    </w:p>
+    <w:p>
+      <w:pPr>
+        <w:spacing w:after="120" w:line="276"/>
+      </w:pPr>
+      <w:r>
+        <w:t xml:space="preserve">Curación saliente: IHealModifier. El mismo esquema, para las curaciones que reparte el dueño: ExecuteInstantEffect llama sourceASC.ResolveOutgoingHeal() sobre cada curación que venga de un efecto con autor (también la que uno se hace a sí mismo y los ticks de una curación con el tiempo), y los modificadores mutan la magnitud de un HealContext. El caso implementado es el Médico bendecido del Clérigo de la Vida (BlessedHealerPassive): curación × (1 + MaxBonus × vida faltante del curado). Lo que escribe la vida directo (el aura del Paladín, el escudo que cura) no pasa por acá.</w:t>
       </w:r>
     </w:p>
     <w:p>
@@ -10819,6 +10845,104 @@
           </w:p>
         </w:tc>
       </w:tr>
+      <w:tr>
+        <w:tc>
+          <w:tcPr>
+            <w:tcW w:type="dxa" w:w="2800"/>
+            <w:tcMar>
+              <w:top w:type="dxa" w:w="60"/>
+              <w:left w:type="dxa" w:w="100"/>
+              <w:bottom w:type="dxa" w:w="60"/>
+              <w:right w:type="dxa" w:w="100"/>
+            </w:tcMar>
+          </w:tcPr>
+          <w:p>
+            <w:pPr>
+              <w:spacing w:after="0"/>
+            </w:pPr>
+            <w:r>
+              <w:rPr>
+                <w:rFonts w:ascii="Consolas" w:cs="Consolas" w:eastAsia="Consolas" w:hAnsi="Consolas"/>
+                <w:sz w:val="18"/>
+                <w:szCs w:val="18"/>
+              </w:rPr>
+              <w:t xml:space="preserve">IHealModifier</w:t>
+            </w:r>
+          </w:p>
+        </w:tc>
+        <w:tc>
+          <w:tcPr>
+            <w:tcW w:type="dxa" w:w="6600"/>
+            <w:tcMar>
+              <w:top w:type="dxa" w:w="60"/>
+              <w:left w:type="dxa" w:w="100"/>
+              <w:bottom w:type="dxa" w:w="60"/>
+              <w:right w:type="dxa" w:w="100"/>
+            </w:tcMar>
+          </w:tcPr>
+          <w:p>
+            <w:pPr>
+              <w:spacing w:after="0"/>
+            </w:pPr>
+            <w:r>
+              <w:rPr>
+                <w:sz w:val="20"/>
+                <w:szCs w:val="20"/>
+              </w:rPr>
+              <w:t xml:space="preserve">Modifica la curación que REPARTE su dueño (ver 5.2).</w:t>
+            </w:r>
+          </w:p>
+        </w:tc>
+      </w:tr>
+      <w:tr>
+        <w:tc>
+          <w:tcPr>
+            <w:tcW w:type="dxa" w:w="2800"/>
+            <w:tcMar>
+              <w:top w:type="dxa" w:w="60"/>
+              <w:left w:type="dxa" w:w="100"/>
+              <w:bottom w:type="dxa" w:w="60"/>
+              <w:right w:type="dxa" w:w="100"/>
+            </w:tcMar>
+          </w:tcPr>
+          <w:p>
+            <w:pPr>
+              <w:spacing w:after="0"/>
+            </w:pPr>
+            <w:r>
+              <w:rPr>
+                <w:rFonts w:ascii="Consolas" w:cs="Consolas" w:eastAsia="Consolas" w:hAnsi="Consolas"/>
+                <w:sz w:val="18"/>
+                <w:szCs w:val="18"/>
+              </w:rPr>
+              <w:t xml:space="preserve">IPassiveTargetVFX</w:t>
+            </w:r>
+          </w:p>
+        </w:tc>
+        <w:tc>
+          <w:tcPr>
+            <w:tcW w:type="dxa" w:w="6600"/>
+            <w:tcMar>
+              <w:top w:type="dxa" w:w="60"/>
+              <w:left w:type="dxa" w:w="100"/>
+              <w:bottom w:type="dxa" w:w="60"/>
+              <w:right w:type="dxa" w:w="100"/>
+            </w:tcMar>
+          </w:tcPr>
+          <w:p>
+            <w:pPr>
+              <w:spacing w:after="0"/>
+            </w:pPr>
+            <w:r>
+              <w:rPr>
+                <w:sz w:val="20"/>
+                <w:szCs w:val="20"/>
+              </w:rPr>
+              <w:t xml:space="preserve">Una pasiva que dibuja un VFX sobre OTRO personaje en todas las pantallas (el destello de curación del aura del Paladín).</w:t>
+            </w:r>
+          </w:p>
+        </w:tc>
+      </w:tr>
     </w:tbl>
     <w:p>
       <w:pPr>
@@ -11070,6 +11194,40 @@
           <w:szCs w:val="20"/>
         </w:rPr>
         <w:t xml:space="preserve">Un VFX de impacto que tiene que SEGUIR a un personaje (la curación de GA_Target) va por ServerPlayAbilityVFXOn(habilidad, objetivo): manda el NetworkObject del objetivo en vez de una posición, y cada peer llama PlayImpactVFXOn, que en GA_Target lo pega al objetivo (Attach Impact VFX, Impact VFX Offset, Impact VFX Lifetime). ServerPlayAbilityVFX con una posición lo deja quieto donde apareció.</w:t>
+      </w:r>
+    </w:p>
+    <w:p>
+      <w:pPr>
+        <w:pStyle w:val="ListParagraph"/>
+        <w:numPr>
+          <w:ilvl w:val="0"/>
+          <w:numId w:val="2"/>
+        </w:numPr>
+        <w:spacing w:after="60"/>
+      </w:pPr>
+      <w:r>
+        <w:rPr>
+          <w:sz w:val="20"/>
+          <w:szCs w:val="20"/>
+        </w:rPr>
+        <w:t xml:space="preserve">Un VFX de una PASIVA sobre otro personaje (el destello de curación del aura del Paladín) va por NetworkASC.ServerPlayPassiveVFXOn(objetivo). Viaja solo el objetivo: cada peer busca IPassiveTargetVFX en SU copia del prefab de pasivas del jugador, y esa pasiva lo dibuja con su propio prefab y ajustes. Así la capa de red no sabe qué pasiva es.</w:t>
+      </w:r>
+    </w:p>
+    <w:p>
+      <w:pPr>
+        <w:pStyle w:val="ListParagraph"/>
+        <w:numPr>
+          <w:ilvl w:val="0"/>
+          <w:numId w:val="2"/>
+        </w:numPr>
+        <w:spacing w:after="60"/>
+      </w:pPr>
+      <w:r>
+        <w:rPr>
+          <w:sz w:val="20"/>
+          <w:szCs w:val="20"/>
+        </w:rPr>
+        <w:t xml:space="preserve">Revivir a OTRO personaje (la Resurrección del Clérigo) va por NetworkASC.ServerResurrect(fracción de vida): revive donde cayó, con sus cooldowns como estaban, y cancela su reaparición en la base con NetworkGameManager.CancelRespawn. Sin eso, la reaparición que ya estaba programada lo mandaba a la base a los pocos segundos. ASC.Revive recibe la fracción de vida (1 = llena, el respawn de siempre). Y un muerto con ragdoll no tiene cápsula en la capa Character: para elegir un cuerpo no sirve FindBestTargetInAim, hay que recorrer los jugadores (ver GA_Resurrection).</w:t>
       </w:r>
     </w:p>
     <w:p>

</xml_diff>

<commit_message>
Clérigo del Orden, combo del básico y desarme
- Combo del ataque básico del Clérigo (base, Vida y Orden): bastonazo en
  cono (físico) + el arco de luz (mágico).
- Dominio del orden: el arco aturde 1 s al primer enemigo que toca
  (GE_OrderStun, como mucho cada 3 s por enemigo); Aturdir (GA_CommandHalt:
  marca 4 s, GE_Stun si el marcado le pega a un aliado); Heroísmo (GE_Heroism:
  la Bendición + 30 % de resistencia al control, 6 s); Zona de verdad (6 m,
  5 s: todos silenciados y desarmados, los aliados se curan).
- State_Disarmed (al final del enum) + IsBasicAttack: bloquea el básico de
  cualquier clase. FirstHitEffects en GA_ProjectileShoot, AllyEffects en
  GA_ContinuousAoE.
- La entrega de la carga pasa de 3 a 6 s.
- Ícono y VFX de la Zona de verdad (Gustavo). Registros actualizados.
- PENDIENTES, LEEME, arquitectura y guía al día.

Co-Authored-By: Claude Opus 5.5 <noreply@anthropic.com>
</commit_message>
<xml_diff>
--- a/DesignDocuments/GAS_Arquitectura.docx
+++ b/DesignDocuments/GAS_Arquitectura.docx
@@ -11228,6 +11228,40 @@
           <w:szCs w:val="20"/>
         </w:rPr>
         <w:t xml:space="preserve">Revivir a OTRO personaje (la Resurrección del Clérigo) va por NetworkASC.ServerResurrect(fracción de vida): revive donde cayó, con sus cooldowns como estaban, y cancela su reaparición en la base con NetworkGameManager.CancelRespawn. Sin eso, la reaparición que ya estaba programada lo mandaba a la base a los pocos segundos. ASC.Revive recibe la fracción de vida (1 = llena, el respawn de siempre). Y un muerto con ragdoll no tiene cápsula en la capa Character: para elegir un cuerpo no sirve FindBestTargetInAim, hay que recorrer los jugadores (ver GA_Resurrection).</w:t>
+      </w:r>
+    </w:p>
+    <w:p>
+      <w:pPr>
+        <w:pStyle w:val="ListParagraph"/>
+        <w:numPr>
+          <w:ilvl w:val="0"/>
+          <w:numId w:val="2"/>
+        </w:numPr>
+        <w:spacing w:after="60"/>
+      </w:pPr>
+      <w:r>
+        <w:rPr>
+          <w:sz w:val="20"/>
+          <w:szCs w:val="20"/>
+        </w:rPr>
+        <w:t xml:space="preserve">Desarmar: el tag State_Disarmed bloquea el ATAQUE BÁSICO de cualquier clase y deja sus habilidades. Se resuelve en GameplayAbility.CanActivate con IsBasicAttack, una marca que PlayerController le pone al clic izquierdo al equipar (igual que IsUltimate a la R), así que vale para el servidor, la predicción del dueño y los bots sin tocar ningún asset. Lo da la Zona de verdad del Clérigo del Orden.</w:t>
+      </w:r>
+    </w:p>
+    <w:p>
+      <w:pPr>
+        <w:pStyle w:val="ListParagraph"/>
+        <w:numPr>
+          <w:ilvl w:val="0"/>
+          <w:numId w:val="2"/>
+        </w:numPr>
+        <w:spacing w:after="60"/>
+      </w:pPr>
+      <w:r>
+        <w:rPr>
+          <w:sz w:val="20"/>
+          <w:szCs w:val="20"/>
+        </w:rPr>
+        <w:t xml:space="preserve">Efectos de primer impacto: GA_ProjectileShoot.FirstHitEffects se aplica solo al PRIMER enemigo que toca cada proyectil (GC_Projectile le avisa a la habilidad que lo disparó). FirstHitCooldownPerTarget pone un tiempo mínimo por enemigo, guardado en un registro ESTÁTICO por (lanzador, enemigo, efecto): un combo crea copias nuevas de sus pasos en cada activación, así que un registro en la instancia se perdería en cada ataque.</w:t>
       </w:r>
     </w:p>
     <w:p>

</xml_diff>

<commit_message>
Documentos al día con el kit base del Guerrero
- Diseño de clases: Guerrero con el kit base implementado (Segundo aliento,
  combo de 180°, parry de 0.3 s, posturas +2/+2 con 1 s, carga con escudo) y
  lo decidido para sus subclases (Salto heroico por teletransporte, Guardián
  con +3 de armadura y doble energía, Venganza al máximo a media vida).
- Arquitectura: ReplacesGroup, CurrentIcon, UsableWhileHolding (y por qué el
  dash no puede liberar todo en el dueño), parry e inclinación de la barrera.
- Guía: StopAtFirstEnemy del dash, parry en la barrera, ShowVariantIcon,
  OutOfCombatRegen / EmergencyHeal y la regla de UsableWhileHolding.

Co-Authored-By: Claude Opus 5.5 <noreply@anthropic.com>
</commit_message>
<xml_diff>
--- a/DesignDocuments/GAS_Arquitectura.docx
+++ b/DesignDocuments/GAS_Arquitectura.docx
@@ -11331,6 +11331,74 @@
           <w:szCs w:val="20"/>
         </w:rPr>
         <w:t xml:space="preserve">Efectos periódicos con Refresh: reaplicarlos renueva la duración pero NO reinicia la cuenta del próximo tick (PeriodRemaining), así que un ataque rápido que refresca una quemadura de 1 tick por segundo no la acelera ni la frena. En eso se apoya el Dominio de la luz.</w:t>
+      </w:r>
+    </w:p>
+    <w:p>
+      <w:pPr>
+        <w:pStyle w:val="ListParagraph"/>
+        <w:numPr>
+          <w:ilvl w:val="0"/>
+          <w:numId w:val="2"/>
+        </w:numPr>
+        <w:spacing w:after="60"/>
+      </w:pPr>
+      <w:r>
+        <w:rPr>
+          <w:sz w:val="20"/>
+          <w:szCs w:val="20"/>
+        </w:rPr>
+        <w:t xml:space="preserve">Estados excluyentes que se alternan (las posturas del Guerrero): GameplayEffect.ReplacesGroup. Dentro de su EffectGroup, el ÚLTIMO en aplicarse reemplaza a los demás sin importar Priority, así entrar a la postura ofensiva saca la defensiva en el mismo instante y nunca están las dos. Las posturas duran 99999 s y son Hidden para que la muerte no las borre; la defensiva va en las pasivas de clase para que empiece con ella.</w:t>
+      </w:r>
+    </w:p>
+    <w:p>
+      <w:pPr>
+        <w:pStyle w:val="ListParagraph"/>
+        <w:numPr>
+          <w:ilvl w:val="0"/>
+          <w:numId w:val="2"/>
+        </w:numPr>
+        <w:spacing w:after="60"/>
+      </w:pPr>
+      <w:r>
+        <w:rPr>
+          <w:sz w:val="20"/>
+          <w:szCs w:val="20"/>
+        </w:rPr>
+        <w:t xml:space="preserve">El ícono de un botón puede cambiar en partida: GameplayAbility.CurrentIcon, que UI_AbilitySlot revisa cada frame. Un GA_TagSwitch con ShowVariantIcon devuelve el de la variante que se dispararía ahora (con Icon por variante y DefaultIcon para cambiarlo); lo usan la postura y la carga del Guerrero.</w:t>
+      </w:r>
+    </w:p>
+    <w:p>
+      <w:pPr>
+        <w:pStyle w:val="ListParagraph"/>
+        <w:numPr>
+          <w:ilvl w:val="0"/>
+          <w:numId w:val="2"/>
+        </w:numPr>
+        <w:spacing w:after="60"/>
+      </w:pPr>
+      <w:r>
+        <w:rPr>
+          <w:sz w:val="20"/>
+          <w:szCs w:val="20"/>
+        </w:rPr>
+        <w:t xml:space="preserve">Usar una habilidad con el escudo arriba: GameplayAbility.UsableWhileHolding (un GA_TagSwitch lo resuelve por variante con CanUseWhileHolding). El mantenido bloquea todo en DOS lados (PlayerController.ProcessAbilityPress y NetworkASC.IsAnotherHoldActive) y los dos respetan la casilla. La trampa: lo que termina una habilidad usada así NO puede llamar FinishAttack() general en el dueño, porque le borra el mantenido mientras el servidor lo sigue teniendo y al soltar el botón nadie avisa: el escudo eterno. Por eso DashRoutine solo libera si no hay un mantenido. Mientras se sostiene, esa habilidad tampoco se anima, para no romper la pose del escudo.</w:t>
+      </w:r>
+    </w:p>
+    <w:p>
+      <w:pPr>
+        <w:pStyle w:val="ListParagraph"/>
+        <w:numPr>
+          <w:ilvl w:val="0"/>
+          <w:numId w:val="2"/>
+        </w:numPr>
+        <w:spacing w:after="60"/>
+      </w:pPr>
+      <w:r>
+        <w:rPr>
+          <w:sz w:val="20"/>
+          <w:szCs w:val="20"/>
+        </w:rPr>
+        <w:t xml:space="preserve">El parry vive en Entity_ShieldBarrier: ParryWindow segundos desde que se levanta la barrera, un golpe que frena se frena entero y sin energía, y si el atacante está a ParryMeleeRange o menos recibe ParryStunEffect. En 0 no hay parry (el Paladín). La barrera también gira con la mira (FollowAimPitch): toma la inclinación de UpperBodyAim.CurrentPitch, que vale en todas las copias, así el servidor bloquea con la misma geometría que se ve.</w:t>
       </w:r>
     </w:p>
     <w:p>

</xml_diff>

<commit_message>
Documentos y pendientes al día con el Maestro de batalla
Diseño de clases (Maestro con sus números, estado, desarme), glosario (desarme,
silencio y enraizado por tipo de acción), arquitectura (posturas a la vista,
mantenido dentro de un switch, regla de bloqueos) y guía (GA_HoldTagSwitch,
GA_ChargedAttack, checklist de ActivationBlockedTags).

Co-Authored-By: Claude Opus 5.5 <noreply@anthropic.com>
</commit_message>
<xml_diff>
--- a/DesignDocuments/GAS_Arquitectura.docx
+++ b/DesignDocuments/GAS_Arquitectura.docx
@@ -3115,7 +3115,24 @@
           <w:sz w:val="20"/>
           <w:szCs w:val="20"/>
         </w:rPr>
-        <w:t xml:space="preserve">Y una capa más, la última: OffHandPose, con la máscara del brazo izquierdo y un solo estado con PLACEHOLDER_OffHandPose. Es la pose fija de la mano secundaria mientras se juega una clase (el libro del Clérigo): si el CharacterClassDefinition trae un clip en OffHandPose, BuildClassAnimator lo mete en esa ranura y la capa va a peso 1; si no, queda en 0 y el brazo se anima normal. Por ir al final, el brazo sigue sosteniendo el objeto mientras UpperBody ataca con la otra mano. Cambiar de controller devuelve las capas a su peso por defecto, así que el peso se pone después de asignarlo; al morir sin ragdoll se apaga para que el brazo caiga con el cuerpo, y se vuelve a prender al revivir. No viaja por la red: cada peer arma su copia del Animator con la misma clase. Las Copias exactas del Ilusionista usan el mismo BuildClassAnimator.</w:t>
+        <w:t xml:space="preserve">Y una capa más: OffHandPose, con la máscara del brazo izquierdo y un solo estado con PLACEHOLDER_OffHandPose. Es la pose fija de la mano secundaria mientras se juega una clase (el libro del Clérigo): si el CharacterClassDefinition trae un clip en OffHandPose (y el tag de OffHandPoseRequiredTag, si pide uno), BuildClassAnimator lo mete en esa ranura y la capa va a peso 1; si no, queda en 0 y el brazo se anima normal. Desde el 1 de octubre va DEBAJO de UpperBody: los ataques mueven también ese brazo, y la pose se ve caminando o quieto. Ojo con el peso: cambiar de controller Y cambiar cualquier clip del override (lo hace cada habilidad) hacen un rebind que devuelve las capas a su peso por defecto, así que PlayerController.TickStanceVisuals compara el peso REAL de la capa cada frame y lo repone. Al morir sin ragdoll se apaga para que el brazo caiga con el cuerpo. No viaja por la red: cada peer arma su copia del Animator con la misma clase. Las Copias exactas del Ilusionista usan el mismo BuildClassAnimator.</w:t>
+      </w:r>
+    </w:p>
+    <w:p>
+      <w:pPr>
+        <w:pBdr>
+          <w:left w:val="single" w:color="E0A800" w:sz="14" w:space="6"/>
+        </w:pBdr>
+        <w:shd w:fill="FFF6DA" w:val="clear"/>
+        <w:spacing w:after="160" w:before="100"/>
+        <w:ind w:left="144" w:right="144"/>
+      </w:pPr>
+      <w:r>
+        <w:rPr>
+          <w:sz w:val="20"/>
+          <w:szCs w:val="20"/>
+        </w:rPr>
+        <w:t xml:space="preserve">Las posturas se ven sin RPC, porque cada copia lee los tags sincronizados (TickStanceVisuals). StanceAnimatorOverride + StanceAnimatorTag en la clase cambian sus clips (quieto, caminar...) por los de otro AnimatorOverrideController mientras se tenga el tag: el Maestro de batalla pasa de AOC_Paladin_SwordAndShield a AOC_Paladin_2Handed en ofensiva. Se aplican con ApplyOverrides sobre el controller de runtime, sin rearmarlo, y se saltean las ranuras PLACEHOLDER_ para no cortar una habilidad; tiene que estar armado sobre el mismo Animator base. Y StowOffHandTag cuelga el arma secundaria del hueso del pecho (StowedOffHandPosition/RotationOffset) mientras se tenga el tag, sin crear sockets.</w:t>
       </w:r>
     </w:p>
     <w:p>
@@ -6243,6 +6260,24 @@
       </w:r>
     </w:p>
     <w:p>
+      <w:pPr>
+        <w:pBdr>
+          <w:left w:val="single" w:color="E0A800" w:sz="14" w:space="6"/>
+        </w:pBdr>
+        <w:shd w:fill="FFF6DA" w:val="clear"/>
+        <w:spacing w:after="160" w:before="100"/>
+        <w:ind w:left="144" w:right="144"/>
+      </w:pPr>
+      <w:r>
+        <w:rPr>
+          <w:rFonts w:ascii="Consolas" w:cs="Consolas" w:eastAsia="Consolas" w:hAnsi="Consolas"/>
+          <w:sz w:val="18"/>
+          <w:szCs w:val="18"/>
+        </w:rPr>
+        <w:t xml:space="preserve">Un mantenido dentro de un switch (GA_HoldTagSwitch: el clic derecho del Maestro de batalla, escudo en defensiva y carga en ofensiva) le pasa a la variante el soltar, los clips de mantener y el cooldown que muestra el HUD (CooldownEffectForDisplay). La variante es un clon y avisa su fin con el nombre del switch (GameplayAbility.ReportEndAs): si no, cuando el servidor la corta solo (sin energía, la carga al tope) el aviso de fin no coincide con lo que el dueño está manteniendo y queda trabado.</w:t>
+      </w:r>
+    </w:p>
+    <w:p>
       <w:r>
         <w:br w:type="page"/>
       </w:r>
@@ -8621,7 +8656,7 @@
                 <w:sz w:val="20"/>
                 <w:szCs w:val="20"/>
               </w:rPr>
-              <w:t xml:space="preserve">Bloquea solo el movimiento.</w:t>
+              <w:t xml:space="preserve">Bloquea el movimiento y las habilidades de MOVIMIENTO (las que lo llevan en ActivationBlockedTags).</w:t>
             </w:r>
           </w:p>
         </w:tc>
@@ -8670,7 +8705,56 @@
                 <w:sz w:val="20"/>
                 <w:szCs w:val="20"/>
               </w:rPr>
-              <w:t xml:space="preserve">Bloquea habilidades; el movimiento sigue permitido.</w:t>
+              <w:t xml:space="preserve">Bloquea las habilidades de MAGIA o fantasía (las que lo llevan en ActivationBlockedTags); el movimiento y los ataques con arma siguen.</w:t>
+            </w:r>
+          </w:p>
+        </w:tc>
+      </w:tr>
+      <w:tr>
+        <w:tc>
+          <w:tcPr>
+            <w:tcW w:type="dxa" w:w="2600"/>
+            <w:tcMar>
+              <w:top w:type="dxa" w:w="60"/>
+              <w:left w:type="dxa" w:w="100"/>
+              <w:bottom w:type="dxa" w:w="60"/>
+              <w:right w:type="dxa" w:w="100"/>
+            </w:tcMar>
+          </w:tcPr>
+          <w:p>
+            <w:pPr>
+              <w:spacing w:after="0"/>
+            </w:pPr>
+            <w:r>
+              <w:rPr>
+                <w:rFonts w:ascii="Consolas" w:cs="Consolas" w:eastAsia="Consolas" w:hAnsi="Consolas"/>
+                <w:sz w:val="18"/>
+                <w:szCs w:val="18"/>
+              </w:rPr>
+              <w:t xml:space="preserve">State_Disarmed</w:t>
+            </w:r>
+          </w:p>
+        </w:tc>
+        <w:tc>
+          <w:tcPr>
+            <w:tcW w:type="dxa" w:w="6800"/>
+            <w:tcMar>
+              <w:top w:type="dxa" w:w="60"/>
+              <w:left w:type="dxa" w:w="100"/>
+              <w:bottom w:type="dxa" w:w="60"/>
+              <w:right w:type="dxa" w:w="100"/>
+            </w:tcMar>
+          </w:tcPr>
+          <w:p>
+            <w:pPr>
+              <w:spacing w:after="0"/>
+            </w:pPr>
+            <w:r>
+              <w:rPr>
+                <w:sz w:val="20"/>
+                <w:szCs w:val="20"/>
+              </w:rPr>
+              <w:t xml:space="preserve">Bloquea las acciones de ARMA: golpear con ella o lanzarla (las que lo llevan en ActivationBlockedTags). El bloqueo con escudo no cuenta.</w:t>
             </w:r>
           </w:p>
         </w:tc>
@@ -11279,7 +11363,7 @@
           <w:sz w:val="20"/>
           <w:szCs w:val="20"/>
         </w:rPr>
-        <w:t xml:space="preserve">Desarmar: el tag State_Disarmed bloquea el ATAQUE BÁSICO de cualquier clase y deja sus habilidades. Se resuelve en GameplayAbility.CanActivate con IsBasicAttack, una marca que PlayerController le pone al clic izquierdo al equipar (igual que IsUltimate a la R), así que vale para el servidor, la predicción del dueño y los bots sin tocar ningún asset. Lo da la Zona de verdad del Clérigo del Orden.</w:t>
+        <w:t xml:space="preserve">Qué bloquea a cada habilidad lo dice su ActivationBlockedTags, por TIPO de acción (desde el 1 de octubre de 2026): State_Stunned en todas las que se aprietan; State_Disarmed en las de ARMA (golpear con ella o lanzarla; el bloqueo con escudo NO); State_Silenced en las de MAGIA o fantasía; State_Rooted en las de MOVIMIENTO. Una que mezcla dos tipos lleva los dos tags y la bloquea cualquiera. Las de salir de apuros (Comida de emergencia, Protección divina) solo llevan el aturdido. No hay nada por código: el desarme antes se resolvía con IsBasicAttack en CanActivate, y eso se quitó. Una habilidad nueva tiene que traer los suyos.</w:t>
       </w:r>
     </w:p>
     <w:p>

</xml_diff>

<commit_message>
Documentos y pendientes al día con el Comandante y los lanzamientos apuntados
Diseño de clases (Comandante con sus números, el apuntado del hacha y las dagas),
glosario (Apuntar un lanzamiento, Cancelar una habilidad), arquitectura (HoldInput,
el flujo del apuntado, ActivateAt/ExecuteTeleport, materiales sin sombra) y guía
(AimBeforeThrow, ExecuteTeleport, ActivateAt, UsesHoldInput).

Co-Authored-By: Claude Opus 5.5 <noreply@anthropic.com>
</commit_message>
<xml_diff>
--- a/DesignDocuments/GAS_Arquitectura.docx
+++ b/DesignDocuments/GAS_Arquitectura.docx
@@ -6278,6 +6278,42 @@
       </w:r>
     </w:p>
     <w:p>
+      <w:pPr>
+        <w:pBdr>
+          <w:left w:val="single" w:color="E0A800" w:sz="14" w:space="6"/>
+        </w:pBdr>
+        <w:shd w:fill="FFF6DA" w:val="clear"/>
+        <w:spacing w:after="160" w:before="100"/>
+        <w:ind w:left="144" w:right="144"/>
+      </w:pPr>
+      <w:r>
+        <w:rPr>
+          <w:rFonts w:ascii="Consolas" w:cs="Consolas" w:eastAsia="Consolas" w:hAnsi="Consolas"/>
+          <w:sz w:val="18"/>
+          <w:szCs w:val="18"/>
+        </w:rPr>
+        <w:t xml:space="preserve">¿Es un mantenido? Se pregunta HoldInput.IsHold(habilidad), no "is IHoldAbility" (desde el 1 de octubre de 2026). GA_ProjectileShoot implementa la interfaz pero solo es un mantenido con su casilla AimBeforeThrow (IHoldAbility.UsesHoldInput): así los castigos y el arco del combo del Clérigo siguen saliendo al apretar. Lo usan el input del dueño (PlayerController.ProcessAbilityPress), el aviso de animación del servidor y los bots.</w:t>
+      </w:r>
+    </w:p>
+    <w:p>
+      <w:pPr>
+        <w:pBdr>
+          <w:left w:val="single" w:color="E0A800" w:sz="14" w:space="6"/>
+        </w:pBdr>
+        <w:shd w:fill="FFF6DA" w:val="clear"/>
+        <w:spacing w:after="160" w:before="100"/>
+        <w:ind w:left="144" w:right="144"/>
+      </w:pPr>
+      <w:r>
+        <w:rPr>
+          <w:rFonts w:ascii="Consolas" w:cs="Consolas" w:eastAsia="Consolas" w:hAnsi="Consolas"/>
+          <w:sz w:val="18"/>
+          <w:szCs w:val="18"/>
+        </w:rPr>
+        <w:t xml:space="preserve">Los lanzamientos apuntados (AimBeforeThrow: el hacha, las dagas, la lanza). Apretar: Activate() no lanza, arranca el mantenido con AimHoldClip (el arma atrás); GameplayAbility.AimsCameraWhileHeld hace que PlayerController ponga ThirdPersonOrbitCam.Aiming, que acerca la cámara (AimCamOffset), baja la sensibilidad y esconde el modelo del dueño. Soltar: el dueño se muestra el lanzamiento en el acto (PredictOwnerReleaseVisuals: AimReleaseClip por la ranura de acción y el arma escondida a tiempo); el servidor, en EndHold, lo manda a los DEMÁS con NetworkASC.ServerBroadcastStepAnimationToOthers (saltea a todos los dueños, para no repetírselo) y lanza cuando el clip de soltar marca su evento de impacto (o a AimReleaseDelay). AimReleaseClip es una toma del mismo FBX que arranca en el cuadro más parecido a la pose de apuntar. Un aturdido o la muerte cortan el apuntado sin lanzar ni cobrar.</w:t>
+      </w:r>
+    </w:p>
+    <w:p>
       <w:r>
         <w:br w:type="page"/>
       </w:r>
@@ -10745,7 +10781,7 @@
                 <w:sz w:val="20"/>
                 <w:szCs w:val="20"/>
               </w:rPr>
-              <w:t xml:space="preserve">Presionar activa, soltar termina (ver 6.3).</w:t>
+              <w:t xml:space="preserve">Presionar activa, soltar termina (ver 6.3). Solo si UsesHoldInput: preguntar con HoldInput.IsHold.</w:t>
             </w:r>
           </w:p>
         </w:tc>
@@ -11364,6 +11400,40 @@
           <w:szCs w:val="20"/>
         </w:rPr>
         <w:t xml:space="preserve">Qué bloquea a cada habilidad lo dice su ActivationBlockedTags, por TIPO de acción (desde el 1 de octubre de 2026): State_Stunned en todas las que se aprietan; State_Disarmed en las de ARMA (golpear con ella o lanzarla; el bloqueo con escudo NO); State_Silenced en las de MAGIA o fantasía; State_Rooted en las de MOVIMIENTO. Una que mezcla dos tipos lleva los dos tags y la bloquea cualquiera. Las de salir de apuros (Comida de emergencia, Protección divina) solo llevan el aturdido. No hay nada por código: el desarme antes se resolvía con IsBasicAttack en CanActivate, y eso se quitó. Una habilidad nueva tiene que traer los suyos.</w:t>
+      </w:r>
+    </w:p>
+    <w:p>
+      <w:pPr>
+        <w:pStyle w:val="ListParagraph"/>
+        <w:numPr>
+          <w:ilvl w:val="0"/>
+          <w:numId w:val="2"/>
+        </w:numPr>
+        <w:spacing w:after="60"/>
+      </w:pPr>
+      <w:r>
+        <w:rPr>
+          <w:sz w:val="20"/>
+          <w:szCs w:val="20"/>
+        </w:rPr>
+        <w:t xml:space="preserve">Una habilidad que despliega OTRA en un punto (la bandera del Salto heroico): se clona como un paso de combo y se llama GA_ContinuousAoE.ActivateAt(punto), que la hace nacer fija ahí y sin animación propia. Y para un viaje distinto con el mismo destino seguro, se hereda de GA_Teleport y se reemplaza ExecuteTeleport (GA_HeroicLeap: despega, aparece, golpea y clava la bandera).</w:t>
+      </w:r>
+    </w:p>
+    <w:p>
+      <w:pPr>
+        <w:pStyle w:val="ListParagraph"/>
+        <w:numPr>
+          <w:ilvl w:val="0"/>
+          <w:numId w:val="2"/>
+        </w:numPr>
+        <w:spacing w:after="60"/>
+      </w:pPr>
+      <w:r>
+        <w:rPr>
+          <w:sz w:val="20"/>
+          <w:szCs w:val="20"/>
+        </w:rPr>
+        <w:t xml:space="preserve">Un material con un shader viejo de Unity (Unlit/Texture, el que traía el muñeco de Kevin Iglesias) se dibuja en URP pero NO proyecta sombra ni recibe luz: no tiene la pasada de sombra que URP usa. Los personajes usan URP/Lit.</w:t>
       </w:r>
     </w:p>
     <w:p>

</xml_diff>

<commit_message>
Documentos al día con el Guardián
Diseño de clases (el Guardián con sus números, el Guerrero completo, los escudos
cargan la definitiva por golpe frenado), glosario (Devolver daño, Crecer, la carga
por bloqueo, la espera de 1 s al apuntar), arquitectura (devolver daño y proyectiles,
MeleeRangeBonus, Status_Avatar, crecer y la cámara, la carga por bloqueo) y guía
(la barrera del Guardián, OnEnemyHit después del daño, MeleeReach).

Co-Authored-By: Claude Opus 5.5 <noreply@anthropic.com>
</commit_message>
<xml_diff>
--- a/DesignDocuments/GAS_Arquitectura.docx
+++ b/DesignDocuments/GAS_Arquitectura.docx
@@ -2811,14 +2811,7 @@
           <w:sz w:val="20"/>
           <w:szCs w:val="20"/>
         </w:rPr>
-        <w:t xml:space="preserve">La definitiva.</w:t>
-      </w:r>
-      <w:r>
-        <w:rPr>
-          <w:sz w:val="20"/>
-          <w:szCs w:val="20"/>
-        </w:rPr>
-        <w:t xml:space="preserve"> Todas comparten un cooldown, GE_Cooldown_Ultimate (180 s, tag Ability_Cooldown_Ultimate), y cargarla es adelantarlo con ReduceCooldownByTag. Carga por tres vías: cada golpe que conecta (UltimateChargeAmount de la habilidad), el tiempo, y HACER EL ROL de la clase (EClassRole en el CharacterClassDefinition): el Tanque al aguantar daño (OnDamageEndured), el Daño al matar un personaje enemigo (lo avisa la víctima en HandlePlayerDeath) y el Soporte al curar a un aliado (OnHealedAlly; una curación que escribe la vida directo, como el aura del Paladín, lo tiene que avisar a mano con NotifyHealedAlly). Las cantidades están en el PlayerController del prefab.</w:t>
+        <w:t xml:space="preserve">La definitiva. Todas comparten un cooldown, GE_Cooldown_Ultimate (180 s, tag Ability_Cooldown_Ultimate), y cargarla es adelantarlo con ReduceCooldownByTag. Carga por tres vías: cada golpe que conecta (UltimateChargeAmount de la habilidad), el tiempo, y HACER EL ROL de la clase (EClassRole en el CharacterClassDefinition): el Tanque al aguantar daño (OnDamageEndured), el Daño al matar un personaje enemigo (lo avisa la víctima en HandlePlayerDeath) y el Soporte al curar a un aliado (OnHealedAlly; una curación que escribe la vida directo, como el aura del Paladín, lo tiene que avisar a mano con NotifyHealedAlly). Las cantidades están en el PlayerController del prefab. Y los ESCUDOS, sin importar el rol (desde el 5 de octubre de 2026): Entity_ShieldBarrier le descuenta UltimateSecondsPerBlock (1 s) al dueño por cada golpe que frena —la cantidad, no el daño—, también por un aliado, los proyectiles y el parry; el mismo atacante frenado para varios en el mismo frame cuenta una vez.</w:t>
       </w:r>
     </w:p>
     <w:p>
@@ -3133,6 +3126,23 @@
           <w:szCs w:val="20"/>
         </w:rPr>
         <w:t xml:space="preserve">Las posturas se ven sin RPC, porque cada copia lee los tags sincronizados (TickStanceVisuals). StanceAnimatorOverride + StanceAnimatorTag en la clase cambian sus clips (quieto, caminar...) por los de otro AnimatorOverrideController mientras se tenga el tag: el Maestro de batalla pasa de AOC_Paladin_SwordAndShield a AOC_Paladin_2Handed en ofensiva. Se aplican con ApplyOverrides sobre el controller de runtime, sin rearmarlo, y se saltean las ranuras PLACEHOLDER_ para no cortar una habilidad; tiene que estar armado sobre el mismo Animator base. Y StowOffHandTag cuelga el arma secundaria del hueso del pecho (StowedOffHandPosition/RotationOffset) mientras se tenga el tag, sin crear sockets.</w:t>
+      </w:r>
+    </w:p>
+    <w:p>
+      <w:pPr>
+        <w:pBdr>
+          <w:left w:val="single" w:color="E0A800" w:sz="14" w:space="6"/>
+        </w:pBdr>
+        <w:shd w:fill="FFF6DA" w:val="clear"/>
+        <w:spacing w:after="160" w:before="100"/>
+        <w:ind w:left="144" w:right="144"/>
+      </w:pPr>
+      <w:r>
+        <w:rPr>
+          <w:sz w:val="20"/>
+          <w:szCs w:val="20"/>
+        </w:rPr>
+        <w:t xml:space="preserve">Crecer funciona igual (el Avatar del Guardián): GrowTag + GrowScale escalan de a poco solo el MODELO (el hijo con el Animator); la cápsula que recibe los golpes no cambia. La cámara del dueño lo acompaña (ThirdPersonOrbitCam.TargetScale: el punto que mira sube entero y la distancia crece según GrowDistanceFactor). OffHandScale agranda el arma secundaria (el escudo del Guardián, sin modelo propio).</w:t>
       </w:r>
     </w:p>
     <w:p>
@@ -6314,6 +6324,24 @@
       </w:r>
     </w:p>
     <w:p>
+      <w:pPr>
+        <w:pBdr>
+          <w:left w:val="single" w:color="E0A800" w:sz="14" w:space="6"/>
+        </w:pBdr>
+        <w:shd w:fill="FFF6DA" w:val="clear"/>
+        <w:spacing w:after="160" w:before="100"/>
+        <w:ind w:left="144" w:right="144"/>
+      </w:pPr>
+      <w:r>
+        <w:rPr>
+          <w:rFonts w:ascii="Consolas" w:cs="Consolas" w:eastAsia="Consolas" w:hAnsi="Consolas"/>
+          <w:sz w:val="18"/>
+          <w:szCs w:val="18"/>
+        </w:rPr>
+        <w:t xml:space="preserve">La cámara recién se acerca después de AimDelay (1 s) de mantener: un lanzamiento rápido no la mueve ni esconde el modelo. Un lanzamiento apuntado sin AimHoldClip (el Guiding Bolt) no entra al bucle de mantener: ApplyHoldAnimation lo saltea y el personaje sigue con su animación normal.</w:t>
+      </w:r>
+    </w:p>
+    <w:p>
       <w:r>
         <w:br w:type="page"/>
       </w:r>
@@ -8092,6 +8120,78 @@
                 <w:sz w:val="18"/>
                 <w:szCs w:val="18"/>
               </w:rPr>
+              <w:t xml:space="preserve">MeleeRangeBonus</w:t>
+            </w:r>
+          </w:p>
+        </w:tc>
+        <w:tc>
+          <w:tcPr>
+            <w:tcW w:type="dxa" w:w="1800"/>
+            <w:tcMar>
+              <w:top w:type="dxa" w:w="60"/>
+              <w:left w:type="dxa" w:w="100"/>
+              <w:bottom w:type="dxa" w:w="60"/>
+              <w:right w:type="dxa" w:w="100"/>
+            </w:tcMar>
+          </w:tcPr>
+          <w:p>
+            <w:pPr>
+              <w:spacing w:after="0"/>
+            </w:pPr>
+            <w:r>
+              <w:rPr>
+                <w:sz w:val="20"/>
+                <w:szCs w:val="20"/>
+              </w:rPr>
+              <w:t xml:space="preserve">Derivado</w:t>
+            </w:r>
+          </w:p>
+        </w:tc>
+        <w:tc>
+          <w:tcPr>
+            <w:tcW w:type="dxa" w:w="5200"/>
+            <w:tcMar>
+              <w:top w:type="dxa" w:w="60"/>
+              <w:left w:type="dxa" w:w="100"/>
+              <w:bottom w:type="dxa" w:w="60"/>
+              <w:right w:type="dxa" w:w="100"/>
+            </w:tcMar>
+          </w:tcPr>
+          <w:p>
+            <w:pPr>
+              <w:spacing w:after="0"/>
+            </w:pPr>
+            <w:r>
+              <w:rPr>
+                <w:sz w:val="20"/>
+                <w:szCs w:val="20"/>
+              </w:rPr>
+              <w:t xml:space="preserve">% EXTRA de alcance de los conos y las líneas (0.5 = ×1.5); lo leen con GameplayAbility.MeleeReach. Sin declarar vale 0. Lo da el Avatar del Guardián.</w:t>
+            </w:r>
+          </w:p>
+        </w:tc>
+      </w:tr>
+      <w:tr>
+        <w:tc>
+          <w:tcPr>
+            <w:tcW w:type="dxa" w:w="2400"/>
+            <w:tcMar>
+              <w:top w:type="dxa" w:w="60"/>
+              <w:left w:type="dxa" w:w="100"/>
+              <w:bottom w:type="dxa" w:w="60"/>
+              <w:right w:type="dxa" w:w="100"/>
+            </w:tcMar>
+          </w:tcPr>
+          <w:p>
+            <w:pPr>
+              <w:spacing w:after="0"/>
+            </w:pPr>
+            <w:r>
+              <w:rPr>
+                <w:rFonts w:ascii="Consolas" w:cs="Consolas" w:eastAsia="Consolas" w:hAnsi="Consolas"/>
+                <w:sz w:val="18"/>
+                <w:szCs w:val="18"/>
+              </w:rPr>
               <w:t xml:space="preserve">MovSpeed</w:t>
             </w:r>
           </w:p>
@@ -10048,6 +10148,55 @@
                 <w:sz w:val="18"/>
                 <w:szCs w:val="18"/>
               </w:rPr>
+              <w:t xml:space="preserve">Status_Avatar</w:t>
+            </w:r>
+          </w:p>
+        </w:tc>
+        <w:tc>
+          <w:tcPr>
+            <w:tcW w:type="dxa" w:w="6800"/>
+            <w:tcMar>
+              <w:top w:type="dxa" w:w="60"/>
+              <w:left w:type="dxa" w:w="100"/>
+              <w:bottom w:type="dxa" w:w="60"/>
+              <w:right w:type="dxa" w:w="100"/>
+            </w:tcMar>
+          </w:tcPr>
+          <w:p>
+            <w:pPr>
+              <w:spacing w:after="0"/>
+            </w:pPr>
+            <w:r>
+              <w:rPr>
+                <w:sz w:val="20"/>
+                <w:szCs w:val="20"/>
+              </w:rPr>
+              <w:t xml:space="preserve">Avatar del Guardián: el modelo crece (GrowTag de la clase) y pega más lejos (MeleeRangeBonus). Lo da GE_Avatar junto con Status_Unstoppable.</w:t>
+            </w:r>
+          </w:p>
+        </w:tc>
+      </w:tr>
+      <w:tr>
+        <w:tc>
+          <w:tcPr>
+            <w:tcW w:type="dxa" w:w="2600"/>
+            <w:tcMar>
+              <w:top w:type="dxa" w:w="60"/>
+              <w:left w:type="dxa" w:w="100"/>
+              <w:bottom w:type="dxa" w:w="60"/>
+              <w:right w:type="dxa" w:w="100"/>
+            </w:tcMar>
+          </w:tcPr>
+          <w:p>
+            <w:pPr>
+              <w:spacing w:after="0"/>
+            </w:pPr>
+            <w:r>
+              <w:rPr>
+                <w:rFonts w:ascii="Consolas" w:cs="Consolas" w:eastAsia="Consolas" w:hAnsi="Consolas"/>
+                <w:sz w:val="18"/>
+                <w:szCs w:val="18"/>
+              </w:rPr>
               <w:t xml:space="preserve">Status_Buff_*</w:t>
             </w:r>
             <w:r>
@@ -11553,6 +11702,23 @@
           <w:szCs w:val="20"/>
         </w:rPr>
         <w:t xml:space="preserve">El parry vive en Entity_ShieldBarrier: ParryWindow segundos desde que se levanta la barrera, un golpe que frena se frena entero y sin energía, y si el atacante está a ParryMeleeRange o menos recibe ParryStunEffect. En 0 no hay parry (el Paladín). La barrera también gira con la mira (FollowAimPitch): toma la inclinación de UpperBodyAim.CurrentPitch, que vale en todas las copias, así el servidor bloquea con la misma geometría que se ve.</w:t>
+      </w:r>
+    </w:p>
+    <w:p>
+      <w:pPr>
+        <w:pStyle w:val="ListParagraph"/>
+        <w:numPr>
+          <w:ilvl w:val="0"/>
+          <w:numId w:val="2"/>
+        </w:numPr>
+        <w:spacing w:after="60"/>
+      </w:pPr>
+      <w:r>
+        <w:rPr>
+          <w:sz w:val="20"/>
+          <w:szCs w:val="20"/>
+        </w:rPr>
+        <w:t xml:space="preserve">Devolver (el escudo del Guardián). ReflectMeleeFraction le devuelve al atacante cuerpo a cuerpo (a ParryMeleeRange o menos) lo frenado, con un GE de daño plano creado en runtime: es físico normal, pasa por su armadura y su propio escudo lo puede frenar pero no devolver (candado estático s_reflecting; todo corre sincrónico en el servidor). ReflectProjectilesOnParry: en el parry, GC_Projectile.Reflect cambia el dueño del proyectil, limpia los ya golpeados y los efectos para aliados, no repite los de primer impacto y lleva el daño que traía como un GE plano (con el efecto original se recalcularía con los stats del nuevo dueño); sale hacia AimDirection (el giro del cuerpo más la inclinación de UpperBodyAim). Una sola vez por proyectil.</w:t>
       </w:r>
     </w:p>
     <w:p>

</xml_diff>

<commit_message>
Vuelo libre (GA_Flight + Status_Flying), Ctrl pasa a bajar, docs y pendientes
- GA_Flight: despega y vuela en 3D hacia la cámara mientras dure Status_Flying;
  Espacio sube, Ctrl/L3 (acción nueva Descend) baja; quieto cae despacio
  (IdleSinkSpeed); no aterriza. Daño de otro o enraizado lo terminan; al terminar
  en el aire, o aturdido, cae lento. Los bots no lo usan.
- Ctrl deja de ser ataque principal.
- El Bárbaro vuelve a su salto en la ranura de movimiento.
- Documentos y PENDIENTES: barra de carga, repeler / atraer y vuelo libre.

Co-Authored-By: Claude Opus 5.5 <noreply@anthropic.com>
</commit_message>
<xml_diff>
--- a/DesignDocuments/GAS_Arquitectura.docx
+++ b/DesignDocuments/GAS_Arquitectura.docx
@@ -3159,6 +3159,40 @@
           <w:sz w:val="20"/>
           <w:szCs w:val="20"/>
         </w:rPr>
+        <w:t xml:space="preserve">Vuelo libre (GA_Flight, desde el 6 de octubre de 2026). Es un GA_SelfBuff cuyo GE otorga Status_Flying; además manda por TargetRpc al dueño los números del vuelo (LaunchSpeed, SpeedMultiplier, ForwardBoost, VerticalSpeed, IdleSinkSpeed). El movimiento lo hace el dueño en HandleMovementInput mientras exista el tag: sin gravedad, cámara 3D, Espacio (Jump) sube y la acción nueva Descend (Ctrl / L3; Ctrl dejó de ser ataque principal) baja; quieto, cae hasta IdleSinkSpeed. Al perder el tag en el aire cae con la gravedad de la caída de pluma (sin aleteos); aturdido en pleno vuelo también, y enraizado queda quieto un instante hasta que el ASC le quita el tag. El Animator lo ve siempre en el aire. Los bots no la usan (MovesThroughOwner).</w:t>
+      </w:r>
+    </w:p>
+    <w:p>
+      <w:pPr>
+        <w:pBdr>
+          <w:left w:val="single" w:color="E0A800" w:sz="14" w:space="6"/>
+        </w:pBdr>
+        <w:shd w:fill="FFF6DA" w:val="clear"/>
+        <w:spacing w:after="160" w:before="100"/>
+        <w:ind w:left="144" w:right="144"/>
+      </w:pPr>
+      <w:r>
+        <w:rPr>
+          <w:sz w:val="20"/>
+          <w:szCs w:val="20"/>
+        </w:rPr>
+        <w:t xml:space="preserve">Repeler / atraer (desde el 6 de octubre de 2026). Vive en el GameplayEffect, no en la habilidad: KnockbackDistance, KnockbackDirection (AwayFromSource, TowardSource, SourceForward), KnockbackDuration, KnockbackUpVelocity y PullStopDistance. ApplyGameplayEffect llama a TryApplyKnockback al aplicarse el efecto (una vez, no en cada tick): nada si el objetivo está muerto o tiene Status_Unstoppable; CCResistance recorta la distancia con el mismo tope que la duración de un CC; el escudo no interviene. El origen es el transform del ASC fuente (por eso una trampa todavía empuja desde quien la puso). NetworkASC.ServerApplyKnockback reparte como el dash: al jugador, TargetRpc a su dueño (PlayerController.ApplyKnockback/TickKnockback: corre antes del corte por aturdido, choca con paredes, arranca rápido y frena al final, y suma el input × knockbackSteerControl salvo aturdido o enraizado); al bot, BotController.ServerDash; al NPC, agent.Move en el servidor.</w:t>
+      </w:r>
+    </w:p>
+    <w:p>
+      <w:pPr>
+        <w:pBdr>
+          <w:left w:val="single" w:color="E0A800" w:sz="14" w:space="6"/>
+        </w:pBdr>
+        <w:shd w:fill="FFF6DA" w:val="clear"/>
+        <w:spacing w:after="160" w:before="100"/>
+        <w:ind w:left="144" w:right="144"/>
+      </w:pPr>
+      <w:r>
+        <w:rPr>
+          <w:sz w:val="20"/>
+          <w:szCs w:val="20"/>
+        </w:rPr>
         <w:t xml:space="preserve">El SONIDO va por el mismo camino que la animación y el VFX: CastSound suena en ApplyAbilityAnimation (dueño y observadores), ImpactSound donde se reproduce el VFX de impacto (servidor local y ObserversPlayAbilityVFX), TargetSound de un efecto donde se instancia su TargetVFX, y el golpe recibido donde baja la vida. Nada de audio viaja por la red.</w:t>
       </w:r>
     </w:p>
@@ -6342,6 +6376,24 @@
       </w:r>
     </w:p>
     <w:p>
+      <w:pPr>
+        <w:pBdr>
+          <w:left w:val="single" w:color="E0A800" w:sz="14" w:space="6"/>
+        </w:pBdr>
+        <w:shd w:fill="FFF6DA" w:val="clear"/>
+        <w:spacing w:after="160" w:before="100"/>
+        <w:ind w:left="144" w:right="144"/>
+      </w:pPr>
+      <w:r>
+        <w:rPr>
+          <w:rFonts w:ascii="Consolas" w:cs="Consolas" w:eastAsia="Consolas" w:hAnsi="Consolas"/>
+          <w:sz w:val="18"/>
+          <w:szCs w:val="18"/>
+        </w:rPr>
+        <w:t xml:space="preserve">La barra de carga por etapas (UI_ChargeBar, desde el 5 de octubre de 2026) se arma sola en runtime y la ve solo el dueño: lee PlayerController.HeldAbility y HoldStartedAt (el momento en que apretó) y pregunta GetChargeStages a la habilidad (GA_ChargedAttack; GA_HoldTagSwitch lo pasa a su variante). Se cuenta en el cliente, sin red.</w:t>
+      </w:r>
+    </w:p>
+    <w:p>
       <w:r>
         <w:br w:type="page"/>
       </w:r>
@@ -10172,6 +10224,55 @@
                 <w:szCs w:val="20"/>
               </w:rPr>
               <w:t xml:space="preserve">Avatar del Guardián: el modelo crece (GrowTag de la clase) y pega más lejos (MeleeRangeBonus). Lo da GE_Avatar junto con Status_Unstoppable.</w:t>
+            </w:r>
+          </w:p>
+        </w:tc>
+      </w:tr>
+      <w:tr>
+        <w:tc>
+          <w:tcPr>
+            <w:tcW w:type="dxa" w:w="2600"/>
+            <w:tcMar>
+              <w:top w:type="dxa" w:w="60"/>
+              <w:left w:type="dxa" w:w="100"/>
+              <w:bottom w:type="dxa" w:w="60"/>
+              <w:right w:type="dxa" w:w="100"/>
+            </w:tcMar>
+          </w:tcPr>
+          <w:p>
+            <w:pPr>
+              <w:spacing w:after="0"/>
+            </w:pPr>
+            <w:r>
+              <w:rPr>
+                <w:rFonts w:ascii="Consolas" w:cs="Consolas" w:eastAsia="Consolas" w:hAnsi="Consolas"/>
+                <w:sz w:val="18"/>
+                <w:szCs w:val="18"/>
+              </w:rPr>
+              <w:t xml:space="preserve">Status_Flying</w:t>
+            </w:r>
+          </w:p>
+        </w:tc>
+        <w:tc>
+          <w:tcPr>
+            <w:tcW w:type="dxa" w:w="6800"/>
+            <w:tcMar>
+              <w:top w:type="dxa" w:w="60"/>
+              <w:left w:type="dxa" w:w="100"/>
+              <w:bottom w:type="dxa" w:w="60"/>
+              <w:right w:type="dxa" w:w="100"/>
+            </w:tcMar>
+          </w:tcPr>
+          <w:p>
+            <w:pPr>
+              <w:spacing w:after="0"/>
+            </w:pPr>
+            <w:r>
+              <w:rPr>
+                <w:sz w:val="20"/>
+                <w:szCs w:val="20"/>
+              </w:rPr>
+              <w:t xml:space="preserve">Vuelo libre (GA_Flight): sin gravedad, se mueve en 3D hacia la cámara, Espacio sube y Ctrl baja, no aterriza. El ASC lo quita al recibir daño de otro o al ganar State_Rooted.</w:t>
             </w:r>
           </w:p>
         </w:tc>

</xml_diff>

<commit_message>
Molinete y Golpe final visibles en todas las pantallas; VFX de buffs en sus GE y GE en Effects
- GA_Whirlwind y GA_FinalBlow declaran BroadcastsOwnAnimation: el clip suelto que el
  servidor mandaba después de Activate() pisaba la pose sostenida en las otras pantallas.
  El mandoble del Golpe final sale al terminar la carga para todos (RPC nueva
  ServerPlayAbilityAnimationOnAll) y el dueño ya no lo anticipa al apretar.
- RageBuff del Frenesí e Invencible conquistador pasa al TargetVFX de su GE. Prefab
  nuevo VFX_AvengingAngel (alas + aura) en GE_AvengingAngelTag.
- FadeOutEffectVfx apaga al instante lo que no es partícula.
- 11 GE movidos a Effects/ (mismo GUID); GE_AvenginAngelBuffs -> GE_AvengingAngelBuffs.
- Pendientes, CLAUDE.md, arquitectura y guía al día.

Co-Authored-By: Claude Opus 5.5 <noreply@anthropic.com>
</commit_message>
<xml_diff>
--- a/DesignDocuments/GAS_Arquitectura.docx
+++ b/DesignDocuments/GAS_Arquitectura.docx
@@ -2393,6 +2393,15 @@
     </w:p>
     <w:p>
       <w:pPr>
+        <w:spacing w:after="120" w:line="276"/>
+      </w:pPr>
+      <w:r>
+        <w:rPr/>
+        <w:t xml:space="preserve">Un GE tiene UN solo TargetVFX. Si un buff necesita dos piezas (las alas y el aura del Ángel vengador), se juntan en un prefab que las tenga de hijas (VFX_AvengingAngel, VFX_FrenzyBuff). Al terminar el efecto, lo que no es partícula (un modelo, como las alas) se apaga en el acto y solo las partículas se desvanecen (8 de octubre de 2026). Los GE viven en Effects/ por tipo (Buffs, Debuffs, CC, Damage, Cooldowns), no al lado de la habilidad que los usa.</w:t>
+      </w:r>
+    </w:p>
+    <w:p>
+      <w:pPr>
         <w:pStyle w:val="Heading1"/>
         <w:spacing w:after="160" w:before="360"/>
       </w:pPr>
@@ -2635,6 +2644,23 @@
           <w:szCs w:val="20"/>
         </w:rPr>
         <w:t xml:space="preserve"> El servidor manda a los observadores la animación de la habilidad solo si de verdad se ejecutó: CommitAbility marca CommittedThisActivation, y una habilidad que sale sin comprometer nada (el Golpe mortal sin nadie a tiro) no se anima. Un combo declara BroadcastsOwnAnimation porque cada paso manda la suya; si el servidor mandara además la del padre, pisaría la del primer paso. Del lado del dueño, que anticipa la animación al apretar, CanPredictActivation deja que las habilidades de objetivo único digan que no cuando no hay nadie a tiro, y PredictOwnerVisuals anticipa lo que acompaña a la animación (esconder el hacha en el frame en que sale de la mano).</w:t>
+      </w:r>
+    </w:p>
+    <w:p>
+      <w:pPr>
+        <w:pStyle w:val="ListParagraph"/>
+        <w:numPr>
+          <w:ilvl w:val="0"/>
+          <w:numId w:val="3"/>
+        </w:numPr>
+        <w:spacing w:after="60"/>
+      </w:pPr>
+      <w:r>
+        <w:rPr>
+          <w:sz w:val="20"/>
+          <w:szCs w:val="20"/>
+        </w:rPr>
+        <w:t xml:space="preserve">Un canalizado con animación (el molinete, la carga del Golpe final) también declara BroadcastsOwnAnimation: su pose sostenida llega por ObserversPlayChannelAnimation, y el clip suelto que el servidor mandaría después de Activate() la pisaba en las otras pantallas — el molinete solo se veía en la del dueño, a quien ese RPC se saltea (8 de octubre de 2026). Si el golpe sale cuando lo decide el servidor y no al apretar (el mandoble al terminar la carga), la habilidad no deja que el dueño lo anticipe (CanPredictActivation en false) y lo manda con ServerPlayAbilityAnimationOnAll, que llega a todas las pantallas, dueño incluido.</w:t>
       </w:r>
     </w:p>
     <w:p>

</xml_diff>

<commit_message>
Documentos al día y la etapa 3 de los idiomas en pendientes
- Arquitectura: listas de efectos y VFX con el inspector por secciones, acumulaciones,
  campos nuevos del GE (ExecuteBelowHealth, JumpVFX), paredes, mira en vivo, nada de
  texto escrito por red, tags nuevos, ILineTargetAbility, OnKilledTarget y archivos.
- Guía: genéricos nuevos (GA_RushAttack, GA_ChanneledCone, GA_ChainStrike) y lo nuevo de
  los existentes, acumulaciones, ApplyHitEffects y la lista Visuals, y el checklist.
- Diseño de clases: el Monje y sus tres subclases como quedaron, paredes del Pícaro,
  pasivas nuevas del Asesino y las zonas de la Quemadura santa.
- Glosario: ejecutar, esquivar proyectiles, el daño cura, Ki, gastar acumulaciones,
  paredes, franja, zonas e idioma; revelar ya implementado.
- Pendientes: la etapa 3 (clases, habilidades, ruedas y la barra de casteo) con la
  propuesta de cómo hacerla.

Co-Authored-By: Claude Opus 5.5 <noreply@anthropic.com>
</commit_message>
<xml_diff>
--- a/DesignDocuments/GAS_Arquitectura.docx
+++ b/DesignDocuments/GAS_Arquitectura.docx
@@ -2402,6 +2402,15 @@
     </w:p>
     <w:p>
       <w:pPr>
+        <w:spacing w:after="120" w:line="276"/>
+      </w:pPr>
+      <w:r>
+        <w:rPr/>
+        <w:t xml:space="preserve">Campos nuevos del GE (8 de octubre de 2026). ExecuteBelowHealth (0 a 1): mientras el efecto está puesto, si la vida del objetivo queda en ese porcentaje o menos, muere. Lo revisa ASC.CheckExecute después de cada golpe que daña y al aplicarse el efecto; la baja es de quien puso el efecto (LastAttacker) y no mata a un inmune ni a un inmortal. Lo usa la marca del Corte final del Samurái (5 %). JumpVFX: mientras dura, cada salto del portador (del piso o desde una pared) deja ese VFX donde saltó. El salto lo hace el dueño, que ve sus efectos por NetActiveEffectDuration: lo dibuja en el acto y le pide al servidor que lo repita en las demás pantallas (el humo del Manto de oscuridad del Shinobi).</w:t>
+      </w:r>
+    </w:p>
+    <w:p>
+      <w:pPr>
         <w:pStyle w:val="Heading1"/>
         <w:spacing w:after="160" w:before="360"/>
       </w:pPr>
@@ -3219,6 +3228,23 @@
           <w:sz w:val="20"/>
           <w:szCs w:val="20"/>
         </w:rPr>
+        <w:t xml:space="preserve">Movimiento en paredes (desde el 8 de octubre de 2026). Lo define un WallMovementProfile en CharacterClassDefinition.WallMovement: el Pícaro se PEGA (ClingTime quieto, SlideTime resbalando) y el Monje CORRE a lo largo bajando de a poco (SlideGravity). Todo corre en el dueño, en la sección MOVIMIENTO EN PAREDES de PlayerController: se engancha en el aire yendo con el WASD contra una pared casi vertical (MaxNormalY, MinInputIntoWall, MinHeightAboveGround). Espacio salta hacia afuera, desviado hacia donde mira la cámara hasta JumpAimMaxAngle; ese impulso va por la inercia y se corta al tocar el piso. No vuelve a la misma pared sin tocar el piso. No cuentan como pared lo que está en Ignore Raycast, lo que tiene ASC o Rigidbody, ni los triggers. La inclinación del modelo viaja en la RPC de locomoción (dos bytes). Todo lo que mueve al jugador por su cuenta (aturdido, empuje, dash, impulso, teletransporte, muerte, cambio de clase) lo suelta con StopWall. El teletransporte con AllowWallLanding deja un instante en que se engancha solo a la pared de enfrente.</w:t>
+      </w:r>
+    </w:p>
+    <w:p>
+      <w:pPr>
+        <w:pBdr>
+          <w:left w:val="single" w:color="E0A800" w:sz="14" w:space="6"/>
+        </w:pBdr>
+        <w:shd w:fill="FFF6DA" w:val="clear"/>
+        <w:spacing w:after="160" w:before="100"/>
+        <w:ind w:left="144" w:right="144"/>
+      </w:pPr>
+      <w:r>
+        <w:rPr>
+          <w:sz w:val="20"/>
+          <w:szCs w:val="20"/>
+        </w:rPr>
         <w:t xml:space="preserve">El SONIDO va por el mismo camino que la animación y el VFX: CastSound suena en ApplyAbilityAnimation (dueño y observadores), ImpactSound donde se reproduce el VFX de impacto (servidor local y ObserversPlayAbilityVFX), TargetSound de un efecto donde se instancia su TargetVFX, y el golpe recibido donde baja la vida. Nada de audio viaja por la red.</w:t>
       </w:r>
     </w:p>
@@ -3235,7 +3261,7 @@
           <w:sz w:val="26"/>
           <w:szCs w:val="26"/>
         </w:rPr>
-        <w:t xml:space="preserve">4.5 Efectos al objetivo no dañado</w:t>
+        <w:t xml:space="preserve">4.5 Efectos y VFX: las dos listas</w:t>
       </w:r>
     </w:p>
     <w:p>
@@ -3243,29 +3269,12 @@
         <w:spacing w:after="120" w:line="276"/>
       </w:pPr>
       <w:r>
-        <w:t xml:space="preserve">La clase base expone </w:t>
-      </w:r>
-      <w:r>
-        <w:rPr>
-          <w:rFonts w:ascii="Consolas" w:cs="Consolas" w:eastAsia="Consolas" w:hAnsi="Consolas"/>
-          <w:sz w:val="20"/>
-          <w:szCs w:val="20"/>
-        </w:rPr>
-        <w:t xml:space="preserve">TargetEffects</w:t>
-      </w:r>
-      <w:r>
-        <w:t xml:space="preserve">: lo que la habilidad le hace a un objetivo SIN dañarlo. En las habilidades de área son los ALIADOS que alcance — los campos de daño siguen siendo lo que se le aplica a los enemigos. Con la lista vacía, la habilidad ignora a los aliados como siempre; en cuanto tiene algo, los empieza a considerar objetivos válidos. En las de objetivo único (</w:t>
-      </w:r>
-      <w:r>
-        <w:rPr>
-          <w:rFonts w:ascii="Consolas" w:cs="Consolas" w:eastAsia="Consolas" w:hAnsi="Consolas"/>
-          <w:sz w:val="20"/>
-          <w:szCs w:val="20"/>
-        </w:rPr>
-        <w:t xml:space="preserve">GA_Target</w:t>
-      </w:r>
-      <w:r>
-        <w:t xml:space="preserve">) son simplemente los efectos que recibe el elegido, sea aliado o enemigo.</w:t>
+        <w:rPr>
+          <w:rFonts w:ascii="Consolas" w:cs="Consolas" w:eastAsia="Consolas" w:hAnsi="Consolas"/>
+          <w:sz w:val="20"/>
+          <w:szCs w:val="20"/>
+        </w:rPr>
+        <w:t xml:space="preserve">Desde el 7 de octubre de 2026 cada habilidad tiene UNA lista Effects (AbilityEffect). Cada entrada dice cuándo (Al golpear, Al primer golpe, Al activarse, Al matar), a quién (Enemigos, Aliados y uno mismo, El lanzador, Todos), el GE y una condición opcional (solo si el objetivo tiene un tag); el orden de la lista es el orden en que se aplican. Reemplaza a DamageEffect, AdditionalEffects, TargetEffects, FirstHitEffects, EffectsToApply, BuffEffect y compañía: los campos viejos quedan ocultos y OnUpgradeLegacyData los pasa a la lista al cargar el asset. En código: ApplyHitEffects(objetivo, primerGolpe) aplica lo que le toca a un objetivo alcanzado (devuelve false si no había nada para él) y, si el golpe lo mató, las entradas "al matar"; las "al activarse" las aplica CommitAbility (ApplyActivationEffects). Los VFX, igual: UNA lista Visuals (AbilityVisual) con su momento (Al lanzar, Al golpear, En el impacto), y en código BroadcastHitVFX(objetivo) y BroadcastImpactVFX(punto).</w:t>
       </w:r>
     </w:p>
     <w:p>
@@ -3273,18 +3282,41 @@
         <w:spacing w:after="120" w:line="276"/>
       </w:pPr>
       <w:r>
-        <w:t xml:space="preserve">El reparto lo hace </w:t>
-      </w:r>
-      <w:r>
-        <w:rPr>
-          <w:rFonts w:ascii="Consolas" w:cs="Consolas" w:eastAsia="Consolas" w:hAnsi="Consolas"/>
-          <w:sz w:val="20"/>
-          <w:szCs w:val="20"/>
-        </w:rPr>
-        <w:t xml:space="preserve">ApplyAffiliationEffects(objetivo, daño)</w:t>
-      </w:r>
-      <w:r>
-        <w:t xml:space="preserve">, que devuelve false si el objetivo no era válido. Es lo que convierte un ataque normal en uno que daña enemigos y cura aliados a su paso.</w:t>
+        <w:rPr>
+          <w:rFonts w:ascii="Consolas" w:cs="Consolas" w:eastAsia="Consolas" w:hAnsi="Consolas"/>
+          <w:sz w:val="20"/>
+          <w:szCs w:val="20"/>
+        </w:rPr>
+        <w:t xml:space="preserve">El inspector (SectionedInspector, el mismo para GE, clases y ASDef) agrupa los campos en secciones plegables con nombres comunes (AbilitySection: General, Costo y cooldown, Forma y alcance, Tiempos, Acumulaciones, Efectos, VFX, Animación...) y esconde los que no aplican con [ShowIf]. Marca en rojo las entradas que nunca se aplicarían (un "al golpear" en un buff propio). Una habilidad con forma sobreescribe DrawGizmos y DrawSceneHandles (manijas con AbilityHandles): se ve y se ajusta arrastrando sobre el muñeco de prueba (AbilityPreview).</w:t>
+      </w:r>
+    </w:p>
+    <w:p>
+      <w:pPr>
+        <w:pStyle w:val="Heading2"/>
+        <w:spacing w:after="120" w:before="280"/>
+      </w:pPr>
+      <w:r>
+        <w:rPr>
+          <w:b/>
+          <w:bCs/>
+          <w:color w:val="2E74B5"/>
+          <w:sz w:val="26"/>
+          <w:szCs w:val="26"/>
+        </w:rPr>
+        <w:t xml:space="preserve">4.6 Acumulaciones (gastar las Artes marciales)</w:t>
+      </w:r>
+    </w:p>
+    <w:p>
+      <w:pPr>
+        <w:spacing w:after="120" w:line="276"/>
+      </w:pPr>
+      <w:r>
+        <w:rPr>
+          <w:rFonts w:ascii="Consolas" w:cs="Consolas" w:eastAsia="Consolas" w:hAnsi="Consolas"/>
+          <w:sz w:val="20"/>
+          <w:szCs w:val="20"/>
+        </w:rPr>
+        <w:t xml:space="preserve">Desde el 8 de octubre de 2026. Una habilidad puede GASTAR las acumulaciones de un tag: StacksTag (hoy Status_MartialArts, que da cada acumulación de Artes marciales del Monje) y ConsumeStacks (no, al activarse o al terminar). CommitAbility las lee (ReadStacks, que deja StackSnapshot) ANTES de gastarlas, así los efectos usan lo que había; las que se gastan al terminar las quita EndAbility. Cada entrada de Effects elige cómo escala con ese número (StackScaling): sin escalar, solo con acumulaciones, una vez por acumulación, o duración por acumulación (PerStack segundos cada una). La regla de diseño: sin acumulaciones, lo que escala no se aplica; con ellas, más. Un combo les pasa su StackSnapshot a sus pasos (la Ráfaga aturdidora), y GA_InstantAoE.ExtraHitsPerStack repite el golpe una vez por acumulación (los Cortes devastadores).</w:t>
       </w:r>
     </w:p>
     <w:p>
@@ -4174,37 +4206,7 @@
                 <w:sz w:val="20"/>
                 <w:szCs w:val="20"/>
               </w:rPr>
-              <w:t xml:space="preserve">Con </w:t>
-            </w:r>
-            <w:r>
-              <w:rPr>
-                <w:rFonts w:ascii="Consolas" w:cs="Consolas" w:eastAsia="Consolas" w:hAnsi="Consolas"/>
-                <w:sz w:val="18"/>
-                <w:szCs w:val="18"/>
-              </w:rPr>
-              <w:t xml:space="preserve">Status_Immortal</w:t>
-            </w:r>
-            <w:r>
-              <w:rPr>
-                <w:sz w:val="20"/>
-                <w:szCs w:val="20"/>
-              </w:rPr>
-              <w:t xml:space="preserve"> la vida no baja de 1. Si llega a 0, dispara </w:t>
-            </w:r>
-            <w:r>
-              <w:rPr>
-                <w:rFonts w:ascii="Consolas" w:cs="Consolas" w:eastAsia="Consolas" w:hAnsi="Consolas"/>
-                <w:sz w:val="18"/>
-                <w:szCs w:val="18"/>
-              </w:rPr>
-              <w:t xml:space="preserve">Die()</w:t>
-            </w:r>
-            <w:r>
-              <w:rPr>
-                <w:sz w:val="20"/>
-                <w:szCs w:val="20"/>
-              </w:rPr>
-              <w:t xml:space="preserve">.</w:t>
+              <w:t xml:space="preserve">Con Status_Immortal la vida no baja de 1. Si llega a 0, dispara Die(). Die() avisa OnKilledTarget(víctima) a quien lo mató (LastAttacker), solo en el servidor. Con Status_DamageToHeal el daño que llega se convierte en curación, con su número verde.</w:t>
             </w:r>
           </w:p>
         </w:tc>
@@ -4548,28 +4550,12 @@
         <w:spacing w:after="120" w:line="276"/>
       </w:pPr>
       <w:r>
-        <w:t xml:space="preserve">El caso implementado es el escudo del Paladín (</w:t>
-      </w:r>
-      <w:r>
-        <w:rPr>
-          <w:rFonts w:ascii="Consolas" w:cs="Consolas" w:eastAsia="Consolas" w:hAnsi="Consolas"/>
-          <w:sz w:val="20"/>
-          <w:szCs w:val="20"/>
-        </w:rPr>
-        <w:t xml:space="preserve">Entity_ShieldBarrier</w:t>
-      </w:r>
-      <w:r>
-        <w:t xml:space="preserve">). Decide si bloquea con </w:t>
-      </w:r>
-      <w:r>
-        <w:rPr>
-          <w:b/>
-          <w:bCs/>
-        </w:rPr>
-        <w:t xml:space="preserve">un raycast del atacante a la víctima contra su BoxCollider</w:t>
-      </w:r>
-      <w:r>
-        <w:t xml:space="preserve">, lo que da tres cosas gratis: la geometría de bloqueo es exactamente la que se ve, protege a los aliados que queden detrás, y el mismo componente sirve para un escudo puesto sobre otro jugador.</w:t>
+        <w:rPr>
+          <w:rFonts w:ascii="Consolas" w:cs="Consolas" w:eastAsia="Consolas" w:hAnsi="Consolas"/>
+          <w:sz w:val="20"/>
+          <w:szCs w:val="20"/>
+        </w:rPr>
+        <w:t xml:space="preserve">El caso implementado es el escudo del Paladín (Entity_ShieldBarrier). Decide si bloquea con un raycast del atacante a la víctima contra su BoxCollider, lo que da tres cosas gratis: la geometría de bloqueo es exactamente la que se ve, protege a los aliados que queden detrás, y el mismo componente sirve para un escudo puesto sobre otro jugador. Cada golpe que frena la barrera puede ponerle un GE al atacante (OnBlockAttackerEffect, una vez por atacante por frame: el Samurái hiere al que le pega al bloqueo), y si su dueño tiene Status_DodgeProjectiles, la barrera no frena proyectiles: lo atraviesan sin dañarlo (el Shinobi).</w:t>
       </w:r>
     </w:p>
     <w:p>
@@ -6234,6 +6220,22 @@
     </w:p>
     <w:p>
       <w:pPr>
+        <w:spacing w:after="120" w:line="276"/>
+      </w:pPr>
+      <w:r>
+        <w:t xml:space="preserve">Mira en vivo (desde el 8 de octubre de 2026). El servidor conoce la mira del dueño solo al activar: NetworkAimPoint viaja con el pedido. Un canalizado que apunta mientras dura (el Aliento del dragón rojo) llama PlayerController.ServerStreamAimFor(segundos), y el dueño manda su mira unas diez veces por segundo, por canal no confiable, mientras dure. En el host no hace falta: GetAimPoint lee su cámara en vivo.</w:t>
+      </w:r>
+    </w:p>
+    <w:p>
+      <w:pPr>
+        <w:spacing w:after="120" w:line="276"/>
+      </w:pPr>
+      <w:r>
+        <w:t xml:space="preserve">Nada de texto escrito por red (desde el 8 de octubre de 2026, el juego en español e inglés). Lo que el servidor les avisa a los clientes va como QUÉ pasó (un enum, un índice, una clave) y cada pantalla lo escribe con Loc en su idioma: el anunciador (EMatchAnnouncement), el registro de bajas y la pantalla de muerte (nombre del jugador, índice de su clase y ENpcLabel si fue un NPC), los motivos del desatascarse (la clave del texto). Falta la barra de casteo, que todavía recibe el AbilityName (etapa 3 de los idiomas).</w:t>
+      </w:r>
+    </w:p>
+    <w:p>
+      <w:pPr>
         <w:pStyle w:val="Heading2"/>
         <w:spacing w:after="120" w:before="280"/>
       </w:pPr>
@@ -9357,6 +9359,104 @@
           </w:p>
         </w:tc>
       </w:tr>
+      <w:tr>
+        <w:tc>
+          <w:tcPr>
+            <w:tcW w:type="dxa" w:w="2600"/>
+            <w:tcMar>
+              <w:top w:type="dxa" w:w="60"/>
+              <w:left w:type="dxa" w:w="100"/>
+              <w:bottom w:type="dxa" w:w="60"/>
+              <w:right w:type="dxa" w:w="100"/>
+            </w:tcMar>
+          </w:tcPr>
+          <w:p>
+            <w:pPr>
+              <w:spacing w:after="0"/>
+            </w:pPr>
+            <w:r>
+              <w:rPr>
+                <w:rFonts w:ascii="Consolas" w:cs="Consolas" w:eastAsia="Consolas" w:hAnsi="Consolas"/>
+                <w:sz w:val="18"/>
+                <w:szCs w:val="18"/>
+              </w:rPr>
+              <w:t xml:space="preserve">Status_DamageToHeal</w:t>
+            </w:r>
+          </w:p>
+        </w:tc>
+        <w:tc>
+          <w:tcPr>
+            <w:tcW w:type="dxa" w:w="6800"/>
+            <w:tcMar>
+              <w:top w:type="dxa" w:w="60"/>
+              <w:left w:type="dxa" w:w="100"/>
+              <w:bottom w:type="dxa" w:w="60"/>
+              <w:right w:type="dxa" w:w="100"/>
+            </w:tcMar>
+          </w:tcPr>
+          <w:p>
+            <w:pPr>
+              <w:spacing w:after="0"/>
+            </w:pPr>
+            <w:r>
+              <w:rPr>
+                <w:sz w:val="20"/>
+                <w:szCs w:val="20"/>
+              </w:rPr>
+              <w:t xml:space="preserve">El daño que recibe lo CURA (con su número verde). Lo da la Defensa de agua del Maestro elemental.</w:t>
+            </w:r>
+          </w:p>
+        </w:tc>
+      </w:tr>
+      <w:tr>
+        <w:tc>
+          <w:tcPr>
+            <w:tcW w:type="dxa" w:w="2600"/>
+            <w:tcMar>
+              <w:top w:type="dxa" w:w="60"/>
+              <w:left w:type="dxa" w:w="100"/>
+              <w:bottom w:type="dxa" w:w="60"/>
+              <w:right w:type="dxa" w:w="100"/>
+            </w:tcMar>
+          </w:tcPr>
+          <w:p>
+            <w:pPr>
+              <w:spacing w:after="0"/>
+            </w:pPr>
+            <w:r>
+              <w:rPr>
+                <w:rFonts w:ascii="Consolas" w:cs="Consolas" w:eastAsia="Consolas" w:hAnsi="Consolas"/>
+                <w:sz w:val="18"/>
+                <w:szCs w:val="18"/>
+              </w:rPr>
+              <w:t xml:space="preserve">Status_DodgeProjectiles</w:t>
+            </w:r>
+          </w:p>
+        </w:tc>
+        <w:tc>
+          <w:tcPr>
+            <w:tcW w:type="dxa" w:w="6800"/>
+            <w:tcMar>
+              <w:top w:type="dxa" w:w="60"/>
+              <w:left w:type="dxa" w:w="100"/>
+              <w:bottom w:type="dxa" w:w="60"/>
+              <w:right w:type="dxa" w:w="100"/>
+            </w:tcMar>
+          </w:tcPr>
+          <w:p>
+            <w:pPr>
+              <w:spacing w:after="0"/>
+            </w:pPr>
+            <w:r>
+              <w:rPr>
+                <w:sz w:val="20"/>
+                <w:szCs w:val="20"/>
+              </w:rPr>
+              <w:t xml:space="preserve">Los proyectiles lo atraviesan sin dañarlo y su barrera no los frena; el cuerpo a cuerpo lo alcanza normal. El bloqueo del Shinobi.</w:t>
+            </w:r>
+          </w:p>
+        </w:tc>
+      </w:tr>
     </w:tbl>
     <w:p>
       <w:pPr>
@@ -10324,6 +10424,153 @@
                 <w:sz w:val="18"/>
                 <w:szCs w:val="18"/>
               </w:rPr>
+              <w:t xml:space="preserve">Status_Ki</w:t>
+            </w:r>
+          </w:p>
+        </w:tc>
+        <w:tc>
+          <w:tcPr>
+            <w:tcW w:type="dxa" w:w="6800"/>
+            <w:tcMar>
+              <w:top w:type="dxa" w:w="60"/>
+              <w:left w:type="dxa" w:w="100"/>
+              <w:bottom w:type="dxa" w:w="60"/>
+              <w:right w:type="dxa" w:w="100"/>
+            </w:tcMar>
+          </w:tcPr>
+          <w:p>
+            <w:pPr>
+              <w:spacing w:after="0"/>
+            </w:pPr>
+            <w:r>
+              <w:rPr>
+                <w:sz w:val="20"/>
+                <w:szCs w:val="20"/>
+              </w:rPr>
+              <w:t xml:space="preserve">Ki del Monje: la próxima acción sale con Ki (su variante del GA_TagSwitch) y lo gasta.</w:t>
+            </w:r>
+          </w:p>
+        </w:tc>
+      </w:tr>
+      <w:tr>
+        <w:tc>
+          <w:tcPr>
+            <w:tcW w:type="dxa" w:w="2600"/>
+            <w:tcMar>
+              <w:top w:type="dxa" w:w="60"/>
+              <w:left w:type="dxa" w:w="100"/>
+              <w:bottom w:type="dxa" w:w="60"/>
+              <w:right w:type="dxa" w:w="100"/>
+            </w:tcMar>
+          </w:tcPr>
+          <w:p>
+            <w:pPr>
+              <w:spacing w:after="0"/>
+            </w:pPr>
+            <w:r>
+              <w:rPr>
+                <w:rFonts w:ascii="Consolas" w:cs="Consolas" w:eastAsia="Consolas" w:hAnsi="Consolas"/>
+                <w:sz w:val="18"/>
+                <w:szCs w:val="18"/>
+              </w:rPr>
+              <w:t xml:space="preserve">Status_MartialArts</w:t>
+            </w:r>
+          </w:p>
+        </w:tc>
+        <w:tc>
+          <w:tcPr>
+            <w:tcW w:type="dxa" w:w="6800"/>
+            <w:tcMar>
+              <w:top w:type="dxa" w:w="60"/>
+              <w:left w:type="dxa" w:w="100"/>
+              <w:bottom w:type="dxa" w:w="60"/>
+              <w:right w:type="dxa" w:w="100"/>
+            </w:tcMar>
+          </w:tcPr>
+          <w:p>
+            <w:pPr>
+              <w:spacing w:after="0"/>
+            </w:pPr>
+            <w:r>
+              <w:rPr>
+                <w:sz w:val="20"/>
+                <w:szCs w:val="20"/>
+              </w:rPr>
+              <w:t xml:space="preserve">Una acumulación de Artes marciales del Monje (hasta 4). Lo cuentan y lo gastan las habilidades con StacksTag (ver 4.6).</w:t>
+            </w:r>
+          </w:p>
+        </w:tc>
+      </w:tr>
+      <w:tr>
+        <w:tc>
+          <w:tcPr>
+            <w:tcW w:type="dxa" w:w="2600"/>
+            <w:tcMar>
+              <w:top w:type="dxa" w:w="60"/>
+              <w:left w:type="dxa" w:w="100"/>
+              <w:bottom w:type="dxa" w:w="60"/>
+              <w:right w:type="dxa" w:w="100"/>
+            </w:tcMar>
+          </w:tcPr>
+          <w:p>
+            <w:pPr>
+              <w:spacing w:after="0"/>
+            </w:pPr>
+            <w:r>
+              <w:rPr>
+                <w:rFonts w:ascii="Consolas" w:cs="Consolas" w:eastAsia="Consolas" w:hAnsi="Consolas"/>
+                <w:sz w:val="18"/>
+                <w:szCs w:val="18"/>
+              </w:rPr>
+              <w:t xml:space="preserve">Status_PeaceOfMind</w:t>
+            </w:r>
+          </w:p>
+        </w:tc>
+        <w:tc>
+          <w:tcPr>
+            <w:tcW w:type="dxa" w:w="6800"/>
+            <w:tcMar>
+              <w:top w:type="dxa" w:w="60"/>
+              <w:left w:type="dxa" w:w="100"/>
+              <w:bottom w:type="dxa" w:w="60"/>
+              <w:right w:type="dxa" w:w="100"/>
+            </w:tcMar>
+          </w:tcPr>
+          <w:p>
+            <w:pPr>
+              <w:spacing w:after="0"/>
+            </w:pPr>
+            <w:r>
+              <w:rPr>
+                <w:sz w:val="20"/>
+                <w:szCs w:val="20"/>
+              </w:rPr>
+              <w:t xml:space="preserve">Paz mental del Maestro elemental: las variantes con Ki salen sin gastar el Ki (TagVariant.AlsoActiveWithTag).</w:t>
+            </w:r>
+          </w:p>
+        </w:tc>
+      </w:tr>
+      <w:tr>
+        <w:tc>
+          <w:tcPr>
+            <w:tcW w:type="dxa" w:w="2600"/>
+            <w:tcMar>
+              <w:top w:type="dxa" w:w="60"/>
+              <w:left w:type="dxa" w:w="100"/>
+              <w:bottom w:type="dxa" w:w="60"/>
+              <w:right w:type="dxa" w:w="100"/>
+            </w:tcMar>
+          </w:tcPr>
+          <w:p>
+            <w:pPr>
+              <w:spacing w:after="0"/>
+            </w:pPr>
+            <w:r>
+              <w:rPr>
+                <w:rFonts w:ascii="Consolas" w:cs="Consolas" w:eastAsia="Consolas" w:hAnsi="Consolas"/>
+                <w:sz w:val="18"/>
+                <w:szCs w:val="18"/>
+              </w:rPr>
               <w:t xml:space="preserve">Status_Buff_*</w:t>
             </w:r>
             <w:r>
@@ -10959,7 +11206,56 @@
                 <w:sz w:val="20"/>
                 <w:szCs w:val="20"/>
               </w:rPr>
-              <w:t xml:space="preserve">Mantener ▸ marcador en el suelo ▸ soltar lanza.</w:t>
+              <w:t xml:space="preserve">Mantener ▸ marcador en el suelo ▸ soltar lanza. El marcador (UI_GroundTargetIndicator) se crea solo y dibuja un círculo relleno con borde.</w:t>
+            </w:r>
+          </w:p>
+        </w:tc>
+      </w:tr>
+      <w:tr>
+        <w:tc>
+          <w:tcPr>
+            <w:tcW w:type="dxa" w:w="2800"/>
+            <w:tcMar>
+              <w:top w:type="dxa" w:w="60"/>
+              <w:left w:type="dxa" w:w="100"/>
+              <w:bottom w:type="dxa" w:w="60"/>
+              <w:right w:type="dxa" w:w="100"/>
+            </w:tcMar>
+          </w:tcPr>
+          <w:p>
+            <w:pPr>
+              <w:spacing w:after="0"/>
+            </w:pPr>
+            <w:r>
+              <w:rPr>
+                <w:rFonts w:ascii="Consolas" w:cs="Consolas" w:eastAsia="Consolas" w:hAnsi="Consolas"/>
+                <w:sz w:val="18"/>
+                <w:szCs w:val="18"/>
+              </w:rPr>
+              <w:t xml:space="preserve">ILineTargetAbility</w:t>
+            </w:r>
+          </w:p>
+        </w:tc>
+        <w:tc>
+          <w:tcPr>
+            <w:tcW w:type="dxa" w:w="6600"/>
+            <w:tcMar>
+              <w:top w:type="dxa" w:w="60"/>
+              <w:left w:type="dxa" w:w="100"/>
+              <w:bottom w:type="dxa" w:w="60"/>
+              <w:right w:type="dxa" w:w="100"/>
+            </w:tcMar>
+          </w:tcPr>
+          <w:p>
+            <w:pPr>
+              <w:spacing w:after="0"/>
+            </w:pPr>
+            <w:r>
+              <w:rPr>
+                <w:sz w:val="20"/>
+                <w:szCs w:val="20"/>
+              </w:rPr>
+              <w:t xml:space="preserve">Mantener ▸ franja en el suelo (LineLength × LineWidth) que se corta en la primera pared y marca con un contorno a los enemigos de adentro ▸ soltar. El Corte final (GA_RushAttack con AimFirst).</w:t>
             </w:r>
           </w:p>
         </w:tc>
@@ -11692,7 +11988,7 @@
           <w:sz w:val="20"/>
           <w:szCs w:val="20"/>
         </w:rPr>
-        <w:t xml:space="preserve">Una habilidad que despliega OTRA en un punto (la bandera del Salto heroico): se clona como un paso de combo y se llama GA_ContinuousAoE.ActivateAt(punto), que la hace nacer fija ahí y sin animación propia. Y para un viaje distinto con el mismo destino seguro, se hereda de GA_Teleport y se reemplaza ExecuteTeleport (GA_HeroicLeap: despega, aparece, golpea y clava la bandera).</w:t>
+        <w:t xml:space="preserve">Una habilidad que despliega OTRA en un punto (la bandera del Salto heroico): se clona como un paso de combo y se llama GA_ContinuousAoE.ActivateAt(punto), que la hace nacer fija ahí y sin animación propia. Y para un viaje distinto con el mismo destino seguro, se hereda de GA_Teleport y se reemplaza ExecuteTeleport (GA_HeroicLeap: despega, aparece, golpea y clava la bandera). Si la que despliega sigue corriendo (un canalizado que suelta zonas por tick, un cono que deja zonas al golpear), no se activa la zona: se usa GA_ContinuousAoE.Deployable + DeployZoneAt (o DeployConeZones, en fila o rellenando un cono), que corre solo el área, sin costo, cooldown, animación ni EndAbility. Un EndAbility de la zona le avisaría al dueño que terminó su ataque en pleno canalizado.</w:t>
       </w:r>
     </w:p>
     <w:p>
@@ -12063,6 +12359,19 @@
       </w:pPr>
       <w:r>
         <w:t xml:space="preserve">Un raycast de mira que no descarta lo que hay entre la cámara y el personaje: un compañero parado detrás devuelve un punto de mira a tu espalda y todo sale para atrás.</w:t>
+      </w:r>
+    </w:p>
+    <w:p>
+      <w:pPr>
+        <w:pStyle w:val="ListParagraph"/>
+        <w:numPr>
+          <w:ilvl w:val="0"/>
+          <w:numId w:val="2"/>
+        </w:numPr>
+        <w:spacing w:after="60"/>
+      </w:pPr>
+      <w:r>
+        <w:t xml:space="preserve">Escribir en el código un texto que ve el jugador: va por Loc.T(clave), con su fila en Resources/Localization.csv (español e inglés). Y nunca se manda escrito por red: viaja qué es, y cada pantalla lo escribe en su idioma.</w:t>
       </w:r>
     </w:p>
     <w:p>
@@ -12572,6 +12881,104 @@
                 <w:szCs w:val="20"/>
               </w:rPr>
               <w:t xml:space="preserve">Input, movimiento, animación y equipamiento de clase.</w:t>
+            </w:r>
+          </w:p>
+        </w:tc>
+      </w:tr>
+      <w:tr>
+        <w:tc>
+          <w:tcPr>
+            <w:tcW w:type="dxa" w:w="3400"/>
+            <w:tcMar>
+              <w:top w:type="dxa" w:w="60"/>
+              <w:left w:type="dxa" w:w="100"/>
+              <w:bottom w:type="dxa" w:w="60"/>
+              <w:right w:type="dxa" w:w="100"/>
+            </w:tcMar>
+          </w:tcPr>
+          <w:p>
+            <w:pPr>
+              <w:spacing w:after="0"/>
+            </w:pPr>
+            <w:r>
+              <w:rPr>
+                <w:rFonts w:ascii="Consolas" w:cs="Consolas" w:eastAsia="Consolas" w:hAnsi="Consolas"/>
+                <w:sz w:val="18"/>
+                <w:szCs w:val="18"/>
+              </w:rPr>
+              <w:t xml:space="preserve">WallMovementProfile.cs</w:t>
+            </w:r>
+          </w:p>
+        </w:tc>
+        <w:tc>
+          <w:tcPr>
+            <w:tcW w:type="dxa" w:w="6000"/>
+            <w:tcMar>
+              <w:top w:type="dxa" w:w="60"/>
+              <w:left w:type="dxa" w:w="100"/>
+              <w:bottom w:type="dxa" w:w="60"/>
+              <w:right w:type="dxa" w:w="100"/>
+            </w:tcMar>
+          </w:tcPr>
+          <w:p>
+            <w:pPr>
+              <w:spacing w:after="0"/>
+            </w:pPr>
+            <w:r>
+              <w:rPr>
+                <w:sz w:val="20"/>
+                <w:szCs w:val="20"/>
+              </w:rPr>
+              <w:t xml:space="preserve">Cómo se mueve una clase en las paredes (pegarse o correr); lo usa PlayerController.</w:t>
+            </w:r>
+          </w:p>
+        </w:tc>
+      </w:tr>
+      <w:tr>
+        <w:tc>
+          <w:tcPr>
+            <w:tcW w:type="dxa" w:w="3400"/>
+            <w:tcMar>
+              <w:top w:type="dxa" w:w="60"/>
+              <w:left w:type="dxa" w:w="100"/>
+              <w:bottom w:type="dxa" w:w="60"/>
+              <w:right w:type="dxa" w:w="100"/>
+            </w:tcMar>
+          </w:tcPr>
+          <w:p>
+            <w:pPr>
+              <w:spacing w:after="0"/>
+            </w:pPr>
+            <w:r>
+              <w:rPr>
+                <w:rFonts w:ascii="Consolas" w:cs="Consolas" w:eastAsia="Consolas" w:hAnsi="Consolas"/>
+                <w:sz w:val="18"/>
+                <w:szCs w:val="18"/>
+              </w:rPr>
+              <w:t xml:space="preserve">Localization/ (Loc, LocalizedText)</w:t>
+            </w:r>
+          </w:p>
+        </w:tc>
+        <w:tc>
+          <w:tcPr>
+            <w:tcW w:type="dxa" w:w="6000"/>
+            <w:tcMar>
+              <w:top w:type="dxa" w:w="60"/>
+              <w:left w:type="dxa" w:w="100"/>
+              <w:bottom w:type="dxa" w:w="60"/>
+              <w:right w:type="dxa" w:w="100"/>
+            </w:tcMar>
+          </w:tcPr>
+          <w:p>
+            <w:pPr>
+              <w:spacing w:after="0"/>
+            </w:pPr>
+            <w:r>
+              <w:rPr>
+                <w:sz w:val="20"/>
+                <w:szCs w:val="20"/>
+              </w:rPr>
+              <w:t xml:space="preserve">Los textos del juego por clave, en español e inglés; la tabla es Resources/Localization.csv. El idioma lo guarda GameSettings.Language (arranca en español).</w:t>
             </w:r>
           </w:p>
         </w:tc>

</xml_diff>

<commit_message>
Español e inglés, etapa 3: nombres y descripciones de clases, habilidades y tótems
- Campos en español en el propio asset (ClassNameEs, DescriptionEs, AbilityNameEs,
  NameEs/DescriptionEs de los tótems); la UI lee DisplayName/DisplayDescription (Loc.Pick).
- La barra de casteo recibe el índice de la habilidad y cada pantalla escribe el nombre.
- Herramienta Mercenarios > Idiomas (exportar/importar) y DesignDocuments/Traduccion_Contenido.csv
  con los 242 textos en español, por GUID.
- Pendientes, CLAUDE.md, arquitectura y guía al día.

Co-Authored-By: Claude Opus 5.5 <noreply@anthropic.com>
</commit_message>
<xml_diff>
--- a/DesignDocuments/GAS_Arquitectura.docx
+++ b/DesignDocuments/GAS_Arquitectura.docx
@@ -6232,6 +6232,14 @@
       </w:pPr>
       <w:r>
         <w:t xml:space="preserve">Nada de texto escrito por red (desde el 8 de octubre de 2026, el juego en español e inglés). Lo que el servidor les avisa a los clientes va como QUÉ pasó (un enum, un índice, una clave) y cada pantalla lo escribe con Loc en su idioma: el anunciador (EMatchAnnouncement), el registro de bajas y la pantalla de muerte (nombre del jugador, índice de su clase y ENpcLabel si fue un NPC), los motivos del desatascarse (la clave del texto). Falta la barra de casteo, que todavía recibe el AbilityName (etapa 3 de los idiomas).</w:t>
+      </w:r>
+    </w:p>
+    <w:p>
+      <w:pPr>
+        <w:spacing w:after="120" w:line="276"/>
+      </w:pPr>
+      <w:r>
+        <w:t xml:space="preserve">El CONTENIDO no va en la tabla sino en el propio asset (9 de octubre de 2026): cada clase trae ClassName/ClassNameEs y Description/DescriptionEs, cada habilidad AbilityName/AbilityNameEs, y cada opción de rueda Name/NameEs. La UI lee DisplayName y DisplayDescription (Loc.Pick: el español si está cargado, si no el inglés). Por red viaja el índice de la habilidad, no su nombre (la barra de casteo lo escribe cada pantalla). Se cargan todos de una con DesignDocuments/Traduccion_Contenido.csv y Mercenarios &gt; Idiomas &gt; Importar nombres traducidos.</w:t>
       </w:r>
     </w:p>
     <w:p>

</xml_diff>

<commit_message>
Documentos y pendientes al día con el Explorador
- Diseño de clases: kit base del Explorador como quedó, la Espada mágica del Filo danzante,
  volver a la misma pared después de saltar y la espera por enemigo de las ráfagas.
- Arquitectura del GAS: Inspector en español, espera por enemigo, revelar a un equipo,
  arma principal a la espalda, zoom por etapa, carga completa con tag, enganche en un salto.
- Arquitectura de red: el revelado por equipo, el salto que termina en una pared y las flechas.
- Guía y glosario: lo nuevo de GA_ProjectileShoot, GA_LeapAttack y GA_ChargedAttack, y los
  términos nuevos.

Co-Authored-By: Claude Opus 5.5 <noreply@anthropic.com>
</commit_message>
<xml_diff>
--- a/DesignDocuments/GAS_Arquitectura.docx
+++ b/DesignDocuments/GAS_Arquitectura.docx
@@ -3245,6 +3245,57 @@
           <w:sz w:val="20"/>
           <w:szCs w:val="20"/>
         </w:rPr>
+        <w:t xml:space="preserve">Volver a la misma pared y engancharse en un salto (13 de octubre de 2026). Después de SALTAR de una pared se puede volver a la misma (WallMovementProfile.SameWallAfterJump, prendido por defecto); a la que se soltó sola, resbalando o al terminar de correr, no se vuelve sin tocar el piso, o se quedaría colgado para siempre empujando contra ella. Y el impulso de un salto de habilidad (GA_LeapAttack, la Retirada del Explorador) ya no impide engancharse: StartWall corta el salto (ClearAbilityVelocity) y la corutina del dueño que esperaba el aterrizaje lo da por terminado al ver PlayerController.IsOnWall. El dash, la embestida y el empujón siguen sin dejar engancharse.</w:t>
+      </w:r>
+    </w:p>
+    <w:p>
+      <w:pPr>
+        <w:pBdr>
+          <w:left w:val="single" w:color="E0A800" w:sz="14" w:space="6"/>
+        </w:pBdr>
+        <w:shd w:fill="FFF6DA" w:val="clear"/>
+        <w:spacing w:after="160" w:before="100"/>
+        <w:ind w:left="144" w:right="144"/>
+      </w:pPr>
+      <w:r>
+        <w:rPr>
+          <w:sz w:val="20"/>
+          <w:szCs w:val="20"/>
+        </w:rPr>
+        <w:t xml:space="preserve">El arma principal a la espalda (13 de octubre de 2026). CharacterClassDefinition.DrawMainHandTag hace lo inverso de StowOffHandTag: el arma de la mano derecha va colgada del pecho (StowedMainHandPositionOffset / RotationOffset) y solo sale a la mano MIENTRAS el personaje tenga ese tag. La espada corta del Explorador: su corte da Status_BladesDrawn por 1 s (GE_BladesDrawn, al activarse). Como los tags viajan, se ve igual en todas las pantallas sin RPC (TickStanceVisuals).</w:t>
+      </w:r>
+    </w:p>
+    <w:p>
+      <w:pPr>
+        <w:pBdr>
+          <w:left w:val="single" w:color="E0A800" w:sz="14" w:space="6"/>
+        </w:pBdr>
+        <w:shd w:fill="FFF6DA" w:val="clear"/>
+        <w:spacing w:after="160" w:before="100"/>
+        <w:ind w:left="144" w:right="144"/>
+      </w:pPr>
+      <w:r>
+        <w:rPr>
+          <w:sz w:val="20"/>
+          <w:szCs w:val="20"/>
+        </w:rPr>
+        <w:t xml:space="preserve">Zoom de cámara (13 de octubre de 2026). GameplayAbility.HeldCameraZoom(segundos) dice cuánto se acerca la cámara del dueño mientras mantiene la habilidad (el campo de visión × eso); PlayerController se lo pasa a ThirdPersonOrbitCam.ZoomFov, que lo suaviza. GA_ChargedAttack lo saca de la etapa a la que llegó (ChargeStage.CameraZoom): el arco del Explorador se acerca en cada fase.</w:t>
+      </w:r>
+    </w:p>
+    <w:p>
+      <w:pPr>
+        <w:pBdr>
+          <w:left w:val="single" w:color="E0A800" w:sz="14" w:space="6"/>
+        </w:pBdr>
+        <w:shd w:fill="FFF6DA" w:val="clear"/>
+        <w:spacing w:after="160" w:before="100"/>
+        <w:ind w:left="144" w:right="144"/>
+      </w:pPr>
+      <w:r>
+        <w:rPr>
+          <w:sz w:val="20"/>
+          <w:szCs w:val="20"/>
+        </w:rPr>
         <w:t xml:space="preserve">El SONIDO va por el mismo camino que la animación y el VFX: CastSound suena en ApplyAbilityAnimation (dueño y observadores), ImpactSound donde se reproduce el VFX de impacto (servidor local y ObserversPlayAbilityVFX), TargetSound de un efecto donde se instancia su TargetVFX, y el golpe recibido donde baja la vida. Nada de audio viaja por la red.</w:t>
       </w:r>
     </w:p>
@@ -3288,6 +3339,32 @@
           <w:szCs w:val="20"/>
         </w:rPr>
         <w:t xml:space="preserve">El inspector (SectionedInspector, el mismo para GE, clases y ASDef) agrupa los campos en secciones plegables con nombres comunes (AbilitySection: General, Costo y cooldown, Forma y alcance, Tiempos, Acumulaciones, Efectos, VFX, Animación...) y esconde los que no aplican con [ShowIf]. Marca en rojo las entradas que nunca se aplicarían (un "al golpear" en un buff propio). Una habilidad con forma sobreescribe DrawGizmos y DrawSceneHandles (manijas con AbilityHandles): se ve y se ajusta arrastrando sobre el muñeco de prueba (AbilityPreview).</w:t>
+      </w:r>
+    </w:p>
+    <w:p>
+      <w:pPr>
+        <w:spacing w:after="120" w:line="276"/>
+      </w:pPr>
+      <w:r>
+        <w:rPr>
+          <w:rFonts w:ascii="Consolas" w:cs="Consolas" w:eastAsia="Consolas" w:hAnsi="Consolas"/>
+          <w:sz w:val="20"/>
+          <w:szCs w:val="20"/>
+        </w:rPr>
+        <w:t xml:space="preserve">El Inspector en español (13 de octubre de 2026). Cada campo lleva [Label("…")] con su nombre en español; el campo sigue llamándose igual en el código y en los assets (renombrarlo borraría lo guardado). Lo leen SectionedInspector (GA, GE, clases, ASDef, perfiles de pared), LabeledComponentEditor (el inspector general de los MonoBehaviour nuestros; uno sin [Label], como los de los packs, se ve igual que siempre) y LabeledFieldsDrawer (las entradas de lista que Unity dibuja campo por campo). Los enums que se eligen en el Inspector llevan [InspectorName("…")] en cada valor. Un campo nuevo sin [Label] sale en inglés.</w:t>
+      </w:r>
+    </w:p>
+    <w:p>
+      <w:pPr>
+        <w:spacing w:after="120" w:line="276"/>
+      </w:pPr>
+      <w:r>
+        <w:rPr>
+          <w:rFonts w:ascii="Consolas" w:cs="Consolas" w:eastAsia="Consolas" w:hAnsi="Consolas"/>
+          <w:sz w:val="20"/>
+          <w:szCs w:val="20"/>
+        </w:rPr>
+        <w:t xml:space="preserve">Espera por enemigo (AbilityEffect.PerTargetCooldown, 13 de octubre de 2026). Una entrada de efectos con espera no se le vuelve a aplicar al MISMO objetivo hasta pasados esos segundos; a otros sí. El registro vive en el ASC del objetivo (TryStartEffectCooldown) por (habilidad, efecto, lanzador). La "habilidad" es GameplayAbility.CooldownKey: un combo se la pone a sus pasos (EffectCooldownKey), así los 4 golpes de una ráfaga comparten la espera, y es el asset y no la instancia, así dura entre un uso y el siguiente. Lo usan el aturdido de la Ráfaga aturdidora y el daño de Artes oscuras de los kunais (2 s), para que la Paz mental no deje a nadie aturdido o desangrándose sin parar.</w:t>
       </w:r>
     </w:p>
     <w:p>
@@ -6231,6 +6308,14 @@
         <w:spacing w:after="120" w:line="276"/>
       </w:pPr>
       <w:r>
+        <w:t xml:space="preserve">Revelar a un equipo (13 de octubre de 2026). NetworkAbilitySystemComponent.NetRevealedUntilTick es un diccionario equipo → tick hasta el que ese equipo ve al personaje a través de las paredes; lo escribe ServerRevealToTeam(equipo, segundos) y lo consulta IsRevealedToTeam. No es un tag porque un tag no dice quién lo puso, y en un 3c3c3 el tercer equipo no tiene por qué verlo. Cada pantalla dibuja la silueta con TeamReveal (shader Mercenaries/XRay, ZTest Greater: solo donde algo lo tapa) si el equipo de SU jugador local está revelado; el NetASC la agrega sola a todo personaje en red al aparecer. Lo usa la Marca del cazador del Explorador.</w:t>
+      </w:r>
+    </w:p>
+    <w:p>
+      <w:pPr>
+        <w:spacing w:after="120" w:line="276"/>
+      </w:pPr>
+      <w:r>
         <w:t xml:space="preserve">Nada de texto escrito por red (desde el 8 de octubre de 2026, el juego en español e inglés). Lo que el servidor les avisa a los clientes va como QUÉ pasó (un enum, un índice, una clave) y cada pantalla lo escribe con Loc en su idioma: el anunciador (EMatchAnnouncement), el registro de bajas y la pantalla de muerte (nombre del jugador, índice de su clase y ENpcLabel si fue un NPC), los motivos del desatascarse (la clave del texto). Falta la barra de casteo, que todavía recibe el AbilityName (etapa 3 de los idiomas).</w:t>
       </w:r>
     </w:p>
@@ -6427,6 +6512,24 @@
           <w:szCs w:val="18"/>
         </w:rPr>
         <w:t xml:space="preserve">La barra de carga por etapas (UI_ChargeBar, desde el 5 de octubre de 2026) se arma sola en runtime y la ve solo el dueño: lee PlayerController.HeldAbility y HoldStartedAt (el momento en que apretó) y pregunta GetChargeStages a la habilidad (GA_ChargedAttack; GA_HoldTagSwitch lo pasa a su variante). Se cuenta en el cliente, sin red.</w:t>
+      </w:r>
+    </w:p>
+    <w:p>
+      <w:pPr>
+        <w:pBdr>
+          <w:left w:val="single" w:color="E0A800" w:sz="14" w:space="6"/>
+        </w:pBdr>
+        <w:shd w:fill="FFF6DA" w:val="clear"/>
+        <w:spacing w:after="160" w:before="100"/>
+        <w:ind w:left="144" w:right="144"/>
+      </w:pPr>
+      <w:r>
+        <w:rPr>
+          <w:rFonts w:ascii="Consolas" w:cs="Consolas" w:eastAsia="Consolas" w:hAnsi="Consolas"/>
+          <w:sz w:val="18"/>
+          <w:szCs w:val="18"/>
+        </w:rPr>
+        <w:t xml:space="preserve">Carga completa con tag y fin de disparos (13 de octubre de 2026). Con GA_ChargedAttack.FullChargeTag (Status_QuickShot del Ataque rápido) la habilidad deja de ser de mantener (UsesHoldInput mira el tag, que el dueño también tiene): apretar suelta YA la última etapa y gasta una acumulación, sin pose ni barra de carga. Y cada disparo lleva su número (_shotId): el aviso de fin de uno viejo, que llega cuando termina su animación, no corta una carga nueva que ya empezó. Mientras se tensa un arco el dueño ve la curva de la flecha y dónde cae (TrajectoryPreview, solo en su pantalla, en un objeto aparte para que la cámara no lo esconda con el modelo).</w:t>
       </w:r>
     </w:p>
     <w:p>
@@ -12384,6 +12487,32 @@
     </w:p>
     <w:p>
       <w:pPr>
+        <w:pStyle w:val="ListParagraph"/>
+        <w:numPr>
+          <w:ilvl w:val="0"/>
+          <w:numId w:val="2"/>
+        </w:numPr>
+        <w:spacing w:after="60"/>
+      </w:pPr>
+      <w:r>
+        <w:t xml:space="preserve">Un proyectil que no es el arma de la mano (la flecha del Explorador) con GC_Projectile.UseShooterWeapon prendido: vuela una copia del ARCO. El proyectil con modelo propio lo apaga. Y si tiene que ir exacto a la mira y después caer, GA_ProjectileShoot.StraightFlightTime lo deja volar sin gravedad esos segundos (GC_Projectile.HoldGravity); con AlignToVelocity la punta sigue la curva.</w:t>
+      </w:r>
+    </w:p>
+    <w:p>
+      <w:pPr>
+        <w:pStyle w:val="ListParagraph"/>
+        <w:numPr>
+          <w:ilvl w:val="0"/>
+          <w:numId w:val="2"/>
+        </w:numPr>
+        <w:spacing w:after="60"/>
+      </w:pPr>
+      <w:r>
+        <w:t xml:space="preserve">Un campo nuevo sin [Label]: el Inspector lo muestra en inglés en medio de todo lo demás en español. Y un enum nuevo que se elige en el Inspector, sin [InspectorName] en sus valores.</w:t>
+      </w:r>
+    </w:p>
+    <w:p>
+      <w:pPr>
         <w:pStyle w:val="Heading1"/>
         <w:spacing w:after="160" w:before="360"/>
       </w:pPr>
@@ -12938,6 +13067,104 @@
                 <w:szCs w:val="20"/>
               </w:rPr>
               <w:t xml:space="preserve">Cómo se mueve una clase en las paredes (pegarse o correr); lo usa PlayerController.</w:t>
+            </w:r>
+          </w:p>
+        </w:tc>
+      </w:tr>
+      <w:tr>
+        <w:tc>
+          <w:tcPr>
+            <w:tcW w:type="dxa" w:w="3400"/>
+            <w:tcMar>
+              <w:top w:type="dxa" w:w="60"/>
+              <w:left w:type="dxa" w:w="100"/>
+              <w:bottom w:type="dxa" w:w="60"/>
+              <w:right w:type="dxa" w:w="100"/>
+            </w:tcMar>
+          </w:tcPr>
+          <w:p>
+            <w:pPr>
+              <w:spacing w:after="0"/>
+            </w:pPr>
+            <w:r>
+              <w:rPr>
+                <w:rFonts w:ascii="Consolas" w:cs="Consolas" w:eastAsia="Consolas" w:hAnsi="Consolas"/>
+                <w:sz w:val="18"/>
+                <w:szCs w:val="18"/>
+              </w:rPr>
+              <w:t xml:space="preserve">TeamReveal.cs · TrajectoryPreview.cs</w:t>
+            </w:r>
+          </w:p>
+        </w:tc>
+        <w:tc>
+          <w:tcPr>
+            <w:tcW w:type="dxa" w:w="6000"/>
+            <w:tcMar>
+              <w:top w:type="dxa" w:w="60"/>
+              <w:left w:type="dxa" w:w="100"/>
+              <w:bottom w:type="dxa" w:w="60"/>
+              <w:right w:type="dxa" w:w="100"/>
+            </w:tcMar>
+          </w:tcPr>
+          <w:p>
+            <w:pPr>
+              <w:spacing w:after="0"/>
+            </w:pPr>
+            <w:r>
+              <w:rPr>
+                <w:sz w:val="20"/>
+                <w:szCs w:val="20"/>
+              </w:rPr>
+              <w:t xml:space="preserve">La silueta a través de paredes para el equipo que reveló (shader Shaders/Resources/MercXRay), y la curva de la flecha al tensar. Las dos se crean solas en runtime.</w:t>
+            </w:r>
+          </w:p>
+        </w:tc>
+      </w:tr>
+      <w:tr>
+        <w:tc>
+          <w:tcPr>
+            <w:tcW w:type="dxa" w:w="3400"/>
+            <w:tcMar>
+              <w:top w:type="dxa" w:w="60"/>
+              <w:left w:type="dxa" w:w="100"/>
+              <w:bottom w:type="dxa" w:w="60"/>
+              <w:right w:type="dxa" w:w="100"/>
+            </w:tcMar>
+          </w:tcPr>
+          <w:p>
+            <w:pPr>
+              <w:spacing w:after="0"/>
+            </w:pPr>
+            <w:r>
+              <w:rPr>
+                <w:rFonts w:ascii="Consolas" w:cs="Consolas" w:eastAsia="Consolas" w:hAnsi="Consolas"/>
+                <w:sz w:val="18"/>
+                <w:szCs w:val="18"/>
+              </w:rPr>
+              <w:t xml:space="preserve">Editor/SectionedInspector.cs · LabeledComponentEditor.cs · LabeledFieldsDrawer.cs</w:t>
+            </w:r>
+          </w:p>
+        </w:tc>
+        <w:tc>
+          <w:tcPr>
+            <w:tcW w:type="dxa" w:w="6000"/>
+            <w:tcMar>
+              <w:top w:type="dxa" w:w="60"/>
+              <w:left w:type="dxa" w:w="100"/>
+              <w:bottom w:type="dxa" w:w="60"/>
+              <w:right w:type="dxa" w:w="100"/>
+            </w:tcMar>
+          </w:tcPr>
+          <w:p>
+            <w:pPr>
+              <w:spacing w:after="0"/>
+            </w:pPr>
+            <w:r>
+              <w:rPr>
+                <w:sz w:val="20"/>
+                <w:szCs w:val="20"/>
+              </w:rPr>
+              <w:t xml:space="preserve">Los inspectores en español: [Label] en GA/GE/clases/ASDef, en los componentes y en las entradas de lista.</w:t>
             </w:r>
           </w:p>
         </w:tc>

</xml_diff>

<commit_message>
Maestro de bestias (los tres compañeros) y la UI del jugador en el prefab de la cámara
- Compañeros del Maestro de bestias: Lobo, Oso y Búho con IA en el servidor
  (Entity_Companion), el CompanionManager, la rueda para cambiarlos y su panel
  en el HUD. Saltan entre pisos, no hay bucle de reaparecer y los fantasmas
  prefieren al Oso.
- La UI del jugador vive armada en Player Camera: barras de canalizar y de
  carga, X / calavera / arco de daño, viñeta de poca vida, la rueda (con
  UI_RingWedge), la curva del lanzamiento y el material de la silueta.
  Variables en unidades absolutas; nada se crea por código encima.
- La curva del lanzamiento sale en todos los apuntados (hacha, dagas, lanza
  del Comandante, Guiding Bolt): GameplayAbility.ProjectileToPreview.
- Documentos, PENDIENTES y CLAUDE.md al día.

Co-Authored-By: Claude Opus 5.5 <noreply@anthropic.com>
</commit_message>
<xml_diff>
--- a/DesignDocuments/GAS_Arquitectura.docx
+++ b/DesignDocuments/GAS_Arquitectura.docx
@@ -6308,7 +6308,15 @@
         <w:spacing w:after="120" w:line="276"/>
       </w:pPr>
       <w:r>
-        <w:t xml:space="preserve">Revelar a un equipo (13 de octubre de 2026). NetworkAbilitySystemComponent.NetRevealedUntilTick es un diccionario equipo → tick hasta el que ese equipo ve al personaje a través de las paredes; lo escribe ServerRevealToTeam(equipo, segundos) y lo consulta IsRevealedToTeam. No es un tag porque un tag no dice quién lo puso, y en un 3c3c3 el tercer equipo no tiene por qué verlo. Cada pantalla dibuja la silueta con TeamReveal (shader Mercenaries/XRay, ZTest Greater: solo donde algo lo tapa) si el equipo de SU jugador local está revelado; el NetASC la agrega sola a todo personaje en red al aparecer. Lo usa la Marca del cazador del Explorador.</w:t>
+        <w:t xml:space="preserve">Revelar a un equipo (13 de octubre de 2026). NetworkAbilitySystemComponent.NetRevealedUntilTick es un diccionario equipo → tick hasta el que ese equipo ve al personaje a través de las paredes; lo escribe ServerRevealToTeam(equipo, segundos) y lo consulta IsRevealedToTeam. No es un tag porque un tag no dice quién lo puso, y en un 3c3c3 el tercer equipo no tiene por qué verlo. Cada pantalla dibuja la silueta con TeamReveal si el equipo de SU jugador local está revelado; el NetASC la agrega sola a todo personaje en red al aparecer, y el material (Mat_TeamReveal, shader Mercenaries/XRay, ZTest Greater: solo donde algo lo tapa) se lo da la cámara del jugador local (TeamRevealStyle, en el prefab Player Camera). Lo usan la Marca del cazador del Explorador y el picotazo del Búho.</w:t>
+      </w:r>
+    </w:p>
+    <w:p>
+      <w:pPr>
+        <w:spacing w:after="120" w:line="276"/>
+      </w:pPr>
+      <w:r>
+        <w:t xml:space="preserve">Compañeros (el Maestro de bestias, 14 de octubre de 2026). Entity_Companion es un NetworkBehaviour con la IA solo en el servidor, como los NPCs: su Explorador viaja en un SyncVar, se mueve por NavMesh (y salta entre pisos en arco si el camino da mucha vuelta), y sus golpes pasan por el pipeline como daño DEL Explorador (escalan con su ataque y la baja es suya). El CompanionManager vive en las pasivas del Maestro de bestias: cuál está activo lo dicen tags ocultos (GE_Companion*Active), la espera de cada uno muerto es un GE visible, y escucha los golpes que da y recibe el Explorador para mandarlo (Command) o para que lo defienda (Defend); los golpes del propio compañero se marcan con BeginPetHit/EndPetHit para que no se manden solos. La UI no sabe nada de esto: UI_CompanionPanel busca el manager del jugador local y lo lee.</w:t>
       </w:r>
     </w:p>
     <w:p>
@@ -6511,7 +6519,7 @@
           <w:sz w:val="18"/>
           <w:szCs w:val="18"/>
         </w:rPr>
-        <w:t xml:space="preserve">La barra de carga por etapas (UI_ChargeBar, desde el 5 de octubre de 2026) se arma sola en runtime y la ve solo el dueño: lee PlayerController.HeldAbility y HoldStartedAt (el momento en que apretó) y pregunta GetChargeStages a la habilidad (GA_ChargedAttack; GA_HoldTagSwitch lo pasa a su variante). Se cuenta en el cliente, sin red.</w:t>
+        <w:t xml:space="preserve">La barra de carga por etapas (UI_ChargeBar, desde el 5 de octubre de 2026) vive en el prefab de la cámara (un molde de tramo que se copia por etapa) y la ve solo el dueño: lee PlayerController.HeldAbility y HoldStartedAt (el momento en que apretó) y pregunta GetChargeStages a la habilidad (GA_ChargedAttack; GA_HoldTagSwitch lo pasa a su variante). Se cuenta en el cliente, sin red.</w:t>
       </w:r>
     </w:p>
     <w:p>
@@ -6529,7 +6537,25 @@
           <w:sz w:val="18"/>
           <w:szCs w:val="18"/>
         </w:rPr>
-        <w:t xml:space="preserve">Carga completa con tag y fin de disparos (13 de octubre de 2026). Con GA_ChargedAttack.FullChargeTag (Status_QuickShot del Ataque rápido) la habilidad deja de ser de mantener (UsesHoldInput mira el tag, que el dueño también tiene): apretar suelta YA la última etapa y gasta una acumulación, sin pose ni barra de carga. Y cada disparo lleva su número (_shotId): el aviso de fin de uno viejo, que llega cuando termina su animación, no corta una carga nueva que ya empezó. Mientras se tensa un arco el dueño ve la curva de la flecha y dónde cae (TrajectoryPreview, solo en su pantalla, en un objeto aparte para que la cámara no lo esconda con el modelo).</w:t>
+        <w:t xml:space="preserve">Carga completa con tag y fin de disparos (13 de octubre de 2026). Con GA_ChargedAttack.FullChargeTag (Status_QuickShot del Ataque rápido) la habilidad deja de ser de mantener (UsesHoldInput mira el tag, que el dueño también tiene): apretar suelta YA la última etapa y gasta una acumulación, sin pose ni barra de carga. Y cada disparo lleva su número (_shotId): el aviso de fin de uno viejo, que llega cuando termina su animación, no corta una carga nueva que ya empezó. Mientras se tensa un arco el dueño ve la curva de la flecha y dónde cae (TrajectoryPreview, ver el párrafo siguiente).</w:t>
+      </w:r>
+    </w:p>
+    <w:p>
+      <w:pPr>
+        <w:pBdr>
+          <w:left w:val="single" w:color="E0A800" w:sz="14" w:space="6"/>
+        </w:pBdr>
+        <w:shd w:fill="FFF6DA" w:val="clear"/>
+        <w:spacing w:after="160" w:before="100"/>
+        <w:ind w:left="144" w:right="144"/>
+      </w:pPr>
+      <w:r>
+        <w:rPr>
+          <w:rFonts w:ascii="Consolas" w:cs="Consolas" w:eastAsia="Consolas" w:hAnsi="Consolas"/>
+          <w:sz w:val="18"/>
+          <w:szCs w:val="18"/>
+        </w:rPr>
+        <w:t xml:space="preserve">La curva del proyectil al apuntar (14 de octubre de 2026). Cualquier mantenido responde GameplayAbility.ProjectileToPreview(segundos mantenidos): el proyectil que saldría si soltara ahora, o null. Lo responden GA_ProjectileShoot (si es un lanzamiento apuntado y tiene prendida “Curva para el que apunta”), GA_ChargedAttack (la fase que saldría) y GA_HoldTagSwitch (por su variante). PlayerController le pasa a TrajectoryPreview la mano, la dirección de la mira (la misma GetLaunchDirection del disparo), la velocidad, si cae, el Vuelo recto y el tiempo de vuelo; la curva vive en el prefab de la cámara, con sus dos LineRenderer. Solo en la pantalla del dueño: no toca la red. La tienen el arco del Explorador, el hacha, las dagas, la lanza del Comandante y el Guiding Bolt.</w:t>
       </w:r>
     </w:p>
     <w:p>
@@ -12513,6 +12539,19 @@
     </w:p>
     <w:p>
       <w:pPr>
+        <w:pStyle w:val="ListParagraph"/>
+        <w:numPr>
+          <w:ilvl w:val="0"/>
+          <w:numId w:val="2"/>
+        </w:numPr>
+        <w:spacing w:after="60"/>
+      </w:pPr>
+      <w:r>
+        <w:t xml:space="preserve">Armar UI por código encima de todo (un canvas propio creado en runtime). Desde el 14 de octubre de 2026 la UI del jugador vive en el prefab Player Camera, con sus piezas armadas ahí (un molde si se repite) y referenciadas en el Inspector; el script solo lee el juego y las anima. Lo que se ve quieto se cambia en las piezas; lo que cambia en juego, con campos en unidades absolutas (px del HUD, segundos, %). Una pieza nueva se pone con una herramienta de una vez y después se edita a mano. Y un Graphic propio (Reticle, UI_RingWedge) necesita su CanvasRenderer: sin él no se dibuja y no avisa (por eso lo pide con [RequireComponent]).</w:t>
+      </w:r>
+    </w:p>
+    <w:p>
+      <w:pPr>
         <w:pStyle w:val="Heading1"/>
         <w:spacing w:after="160" w:before="360"/>
       </w:pPr>
@@ -13092,7 +13131,7 @@
                 <w:sz w:val="18"/>
                 <w:szCs w:val="18"/>
               </w:rPr>
-              <w:t xml:space="preserve">TeamReveal.cs · TrajectoryPreview.cs</w:t>
+              <w:t xml:space="preserve">TeamReveal.cs · TeamRevealStyle.cs · TrajectoryPreview.cs</w:t>
             </w:r>
           </w:p>
         </w:tc>
@@ -13115,7 +13154,105 @@
                 <w:sz w:val="20"/>
                 <w:szCs w:val="20"/>
               </w:rPr>
-              <w:t xml:space="preserve">La silueta a través de paredes para el equipo que reveló (shader Shaders/Resources/MercXRay), y la curva de la flecha al tensar. Las dos se crean solas en runtime.</w:t>
+              <w:t xml:space="preserve">La silueta a través de paredes para el equipo que reveló (el material lo da TeamRevealStyle, en la cámara), y la curva del proyectil al apuntar (en la cámara, con sus dos LineRenderer).</w:t>
+            </w:r>
+          </w:p>
+        </w:tc>
+      </w:tr>
+      <w:tr>
+        <w:tc>
+          <w:tcPr>
+            <w:tcW w:type="dxa" w:w="3400"/>
+            <w:tcMar>
+              <w:top w:type="dxa" w:w="60"/>
+              <w:left w:type="dxa" w:w="100"/>
+              <w:bottom w:type="dxa" w:w="60"/>
+              <w:right w:type="dxa" w:w="100"/>
+            </w:tcMar>
+          </w:tcPr>
+          <w:p>
+            <w:pPr>
+              <w:spacing w:after="0"/>
+            </w:pPr>
+            <w:r>
+              <w:rPr>
+                <w:rFonts w:ascii="Consolas" w:cs="Consolas" w:eastAsia="Consolas" w:hAnsi="Consolas"/>
+                <w:sz w:val="18"/>
+                <w:szCs w:val="18"/>
+              </w:rPr>
+              <w:t xml:space="preserve">UI/ (UI_CastBar, UI_ChargeBar, UI_CombatFeedback, UI_LowHealthVignette, UI_RadialMenu, UI_RingWedge, UI_CompanionPanel)</w:t>
+            </w:r>
+          </w:p>
+        </w:tc>
+        <w:tc>
+          <w:tcPr>
+            <w:tcW w:type="dxa" w:w="6000"/>
+            <w:tcMar>
+              <w:top w:type="dxa" w:w="60"/>
+              <w:left w:type="dxa" w:w="100"/>
+              <w:bottom w:type="dxa" w:w="60"/>
+              <w:right w:type="dxa" w:w="100"/>
+            </w:tcMar>
+          </w:tcPr>
+          <w:p>
+            <w:pPr>
+              <w:spacing w:after="0"/>
+            </w:pPr>
+            <w:r>
+              <w:rPr>
+                <w:sz w:val="20"/>
+                <w:szCs w:val="20"/>
+              </w:rPr>
+              <w:t xml:space="preserve">El HUD del jugador: piezas armadas en el prefab Player Camera (moldes si se repiten); los scripts solo leen el juego y las animan. UI_RingWedge dibuja trozos de anillo en px (la rueda), sin sprite.</w:t>
+            </w:r>
+          </w:p>
+        </w:tc>
+      </w:tr>
+      <w:tr>
+        <w:tc>
+          <w:tcPr>
+            <w:tcW w:type="dxa" w:w="3400"/>
+            <w:tcMar>
+              <w:top w:type="dxa" w:w="60"/>
+              <w:left w:type="dxa" w:w="100"/>
+              <w:bottom w:type="dxa" w:w="60"/>
+              <w:right w:type="dxa" w:w="100"/>
+            </w:tcMar>
+          </w:tcPr>
+          <w:p>
+            <w:pPr>
+              <w:spacing w:after="0"/>
+            </w:pPr>
+            <w:r>
+              <w:rPr>
+                <w:rFonts w:ascii="Consolas" w:cs="Consolas" w:eastAsia="Consolas" w:hAnsi="Consolas"/>
+                <w:sz w:val="18"/>
+                <w:szCs w:val="18"/>
+              </w:rPr>
+              <w:t xml:space="preserve">Entities/Entity_Companion.cs · Ranger/BeastMaster/CompanionManager.cs</w:t>
+            </w:r>
+          </w:p>
+        </w:tc>
+        <w:tc>
+          <w:tcPr>
+            <w:tcW w:type="dxa" w:w="6000"/>
+            <w:tcMar>
+              <w:top w:type="dxa" w:w="60"/>
+              <w:left w:type="dxa" w:w="100"/>
+              <w:bottom w:type="dxa" w:w="60"/>
+              <w:right w:type="dxa" w:w="100"/>
+            </w:tcMar>
+          </w:tcPr>
+          <w:p>
+            <w:pPr>
+              <w:spacing w:after="0"/>
+            </w:pPr>
+            <w:r>
+              <w:rPr>
+                <w:sz w:val="20"/>
+                <w:szCs w:val="20"/>
+              </w:rPr>
+              <w:t xml:space="preserve">Los compañeros del Maestro de bestias: la IA de cada uno en el servidor, y cuál está activo, sus esperas y las órdenes.</w:t>
             </w:r>
           </w:p>
         </w:tc>

</xml_diff>

<commit_message>
Cazador: subclase del Explorador, hecha y probada
- Arco largo: 3 fases a los 0 / 0.8 / 1.6 s, ×1.2 / ×2 / ×3 del ataque, recto
  30 / 55 m y la carga completa sin caer.
- Presa (E): marca 8 s al jugador enemigo de la mira (no NPCs); beneficio según
  su rol (Tanque +2 % de su vida máx., Daño +3 % de la faltante, Soporte −40 %
  de curación); matarla lo da contra todos 6 s. HunterPreyPassive, como
  modificador de daño. FindBestTargetInAim acepta un filtro opcional.
- Tácticas defensivas: acumulaciones de velocidad y resistencia por golpe
  recibido; con 3, la Retirada lo vuelve invisible 3 s.
- Depredador definitivo (R): 8 s, todos los jugadores enemigos son presa,
  marcados y revelados; cada baja +3 s.
- Tags nuevos al final: Status_Prey, Status_ApexPredator,
  Status_DefensiveTactics, Status_TacticsReady.
- Ajuste de Gustavo: zoom del arco del Explorador.
- Documentos y PENDIENTES al día.

Co-Authored-By: Claude Opus 5.5 <noreply@anthropic.com>
</commit_message>
<xml_diff>
--- a/DesignDocuments/GAS_Arquitectura.docx
+++ b/DesignDocuments/GAS_Arquitectura.docx
@@ -6338,6 +6338,14 @@
       </w:pPr>
       <w:r>
         <w:t xml:space="preserve">La Ira primal (15 de octubre de 2026), la definitiva del Maestro de bestias, es un GA_SelfBuff que se aplica GE_PrimalFury (10 s, tag Status_PrimalFury). Todo lo demás lo hace el código mirando ese tag: el CompanionManager saca como EXTRAS a los compañeros que faltan (los otros dos y el elegido si estaba muerto), les pasa las órdenes y la defensa a todos, y al terminar los saca sin guardar su vida ni empezarles espera; cada Entity_Companion ataca con FuryAttackIntervalMultiplier (×0.5) y aplica además su FuryPresenceEffect (una copia oculta de su presencia: vale doble). El Cambio de compañero lleva Status_PrimalFury en sus tags que la bloquean. Cada compañero guarda qué opción de la rueda es (OptionIndex, un SyncVar) para que el HUD de un cliente encuentre al elegido entre los tres.</w:t>
+      </w:r>
+    </w:p>
+    <w:p>
+      <w:pPr>
+        <w:spacing w:after="120" w:line="276"/>
+      </w:pPr>
+      <w:r>
+        <w:t xml:space="preserve">El Cazador (15 de octubre de 2026). La Presa (GA_Prey) solo ELIGE: busca al jugador enemigo más centrado en la mira (FindBestTargetInAim tiene un filtro opcional; acá, HunterPreyPassive.IsPlayer: un jugador o un bot, nunca un NPC) y le pide a HunterPreyPassive que lo marque. La pasiva guarda cada presa con su ROL (el DisplayRole de su clase) y hasta cuándo dura, y es un IDamageModifier: en cada golpe directo del Cazador a una presa le suma el 2 % de su vida máxima (Tanque) o el 3 % de su vida faltante (Daño); a un Soporte le aplicó al marcarlo GE_PreyHealingCut (−0.4 de HealingReceived). Escucha OnKilledTarget: matar a la presa activa la cacería (6 s, el mismo beneficio contra todos los jugadores enemigos). La definitiva es un GA_SelfBuff con GE_ApexPredator (Status_ApexPredator): mientras dura, la pasiva repasa cada 0.5 s a los jugadores enemigos y los marca, con la Marca del cazador y revelados al equipo; cada baja vuelve a aplicar el GE con lo que le quedaba más 3 s (el Refresh con durationOverride). Tácticas defensivas (DefensiveTacticsPassive) suma GE_DefensiveTactics por cada golpe recibido y, con 3, da Status_TacticsReady; la Retirada del Cazador lleva un "al activarse, el lanzador, solo si tiene Status_TacticsReady" que la vuelve invisible (GE_HunterVanish), y la pasiva gasta todo al verla invisible. Todos los efectos se aplican en el Update, nunca dentro de un aviso del pipeline.</w:t>
       </w:r>
     </w:p>
     <w:p>

</xml_diff>

<commit_message>
Trampero: subclase del Explorador, hecha y probada; el Explorador queda completo
- Entity_Trap: una pieza en red para todas las trampas (se arma en 1.5 s, salta solo
  con jugadores y bots, invisible para los enemigos, empuja desde la trampa con su
  propio ASC, zona con golpes, explota al vencerse, límite de 6 por dueño).
- GA_PlaceTrap (rueda de 3 trampas, en el piso o en una pared), GA_BombBarrage
  (la definitiva: bombas que son trampas de 60 s), estocada con la lanza del
  Comandante y PatientHunterPassive (sigilo, velocidad, curación, crítico asegurado).
- GameplayEffect.CritIfTargetHas: crítico si el golpeado tiene un tag.
- La rueda deja la cámara quieta mientras se elige (UICursor.Free).
- Modelos de las bombas y trampas, efectos, prefabs y Class_Trapper.
- Documentos (diseño de clases, arquitectura del GAS y de red, guía, glosario) y
  PENDIENTES al día.

Co-Authored-By: Claude Opus 5.5 <noreply@anthropic.com>
</commit_message>
<xml_diff>
--- a/DesignDocuments/GAS_Arquitectura.docx
+++ b/DesignDocuments/GAS_Arquitectura.docx
@@ -6346,6 +6346,30 @@
       </w:pPr>
       <w:r>
         <w:t xml:space="preserve">El Cazador (15 de octubre de 2026). La Presa (GA_Prey) solo ELIGE: busca al jugador enemigo más centrado en la mira (FindBestTargetInAim tiene un filtro opcional; acá, HunterPreyPassive.IsPlayer: un jugador o un bot, nunca un NPC) y le pide a HunterPreyPassive que lo marque. La pasiva guarda cada presa con su ROL (el DisplayRole de su clase) y hasta cuándo dura, y es un IDamageModifier: en cada golpe directo del Cazador a una presa le suma el 2 % de su vida máxima (Tanque) o el 3 % de su vida faltante (Daño); a un Soporte le aplicó al marcarlo GE_PreyHealingCut (−0.4 de HealingReceived). Escucha OnKilledTarget: matar a la presa activa la cacería (6 s, el mismo beneficio contra todos los jugadores enemigos). La definitiva es un GA_SelfBuff con GE_ApexPredator (Status_ApexPredator): mientras dura, la pasiva repasa cada 0.5 s a los jugadores enemigos y los marca, con la Marca del cazador y revelados al equipo; cada baja vuelve a aplicar el GE con lo que le quedaba más 3 s (el Refresh con durationOverride). Tácticas defensivas (DefensiveTacticsPassive) suma GE_DefensiveTactics por cada golpe recibido y, con 3, da Status_TacticsReady; la Retirada del Cazador lleva un "al activarse, el lanzador, solo si tiene Status_TacticsReady" que la vuelve invisible (GE_HunterVanish), y la pasiva gasta todo al verla invisible. Todos los efectos se aplican en el Update, nunca dentro de un aviso del pipeline.</w:t>
+      </w:r>
+    </w:p>
+    <w:p>
+      <w:pPr>
+        <w:spacing w:after="120" w:line="276"/>
+      </w:pPr>
+      <w:r>
+        <w:t xml:space="preserve">El Trampero (15 de octubre de 2026). Todas las trampas, y las bombas de su definitiva, son UNA pieza en red, Entity_Trap, configurada por datos en cada prefab: se arma en, salta a, dura, aviso antes de explotar, radio, efectos (con el Trampero como autor: daño, aturdido, ralentización; la baja es suya), efectos desde la trampa (con la trampa como autor: el empuje sale desde ella, por eso lleva un AbilitySystemComponent como los tótems), una zona con golpes cada tanto (la de espinas), explota al vencerse y cuenta para el límite (un diccionario estático por dueño saca la más vieja). Solo la activan y la sufren jugadores y bots. Su equipo viaja en un SyncVar y cada pantalla dibuja el modelo solo si es de su equipo (o durante el aviso, otro SyncVar). GA_PlaceTrap es la rueda: el servidor traza un rayo desde los ojos del Trampero hasta el punto de la mira y la trampa queda en esa superficie (piso o pared), con su arriba en la normal. GA_BombBarrage es la zona de la definitiva, con distribución al azar, en anillo o rellenando el círculo. PatientHunterPassive aplica el sigilo con efectos que llevan todos Status_Invisible, así BreakInvisibility los corta juntos al pelear.</w:t>
+      </w:r>
+    </w:p>
+    <w:p>
+      <w:pPr>
+        <w:spacing w:after="120" w:line="276"/>
+      </w:pPr>
+      <w:r>
+        <w:t xml:space="preserve">La rueda deja la cámara quieta (15 de octubre de 2026). La rueda pide el cursor sin apagar el input de juego (elige con el stick), así que el mouse también giraba la cámara. ThirdPersonOrbitCam no lee el giro mientras UICursor.Free: la mira se queda donde estaba al abrir la rueda y lo que sale al soltar (una trampa, un tótem) cae ahí.</w:t>
+      </w:r>
+    </w:p>
+    <w:p>
+      <w:pPr>
+        <w:spacing w:after="120" w:line="276"/>
+      </w:pPr>
+      <w:r>
+        <w:t xml:space="preserve">Crítico por tag (15 de octubre de 2026). GameplayEffect.CritIfTargetHas: el daño de ese efecto sale crítico si el golpeado tiene ese tag (la estocada del Trampero contra Status_Wound). ExecuteInstantEffect se lo pasa a ResolveOutgoingDamage como forceCrit: es la misma capa que el golpe por la espalda (no se suma) y no vale en los ticks.</w:t>
       </w:r>
     </w:p>
     <w:p>

</xml_diff>

<commit_message>
Base de invocaciones completa (cuchilla, copia y compañero); documentos al día
Probado por Gustavo:
- La cuchilla ilusoria, la copia del Ilusionista y el compañero del Explorador heredan de
  Entity_Summon: con esto TODAS las invocaciones usan la base. El PlayerCopyManager solo
  crea las copias (el límite y la muerte del Ilusionista los resuelve la base); el
  CompanionManager sigue con lo suyo y crea con Entity_Summon.Spawn. La base sincroniza
  el dueño a todas las pantallas (SummonerObject) y resuelve la muerte propia en Update.
- La copia sigue el piso (lanzada en el aire caía flotando).

Documentos: arquitectura del GAS y de red, guía (5.2 Canalizar e invocaciones),
glosario (Canalizar, Invocación, Barra de vida) y diseño de clases con lo del 15 al 20 de
octubre. CLAUDE.md con las reglas de canalizar, invocaciones, choque por barrido y el
prefab de las barras. PENDIENTES al día.

Co-Authored-By: Claude Opus 5.5 <noreply@anthropic.com>
</commit_message>
<xml_diff>
--- a/DesignDocuments/GAS_Arquitectura.docx
+++ b/DesignDocuments/GAS_Arquitectura.docx
@@ -6377,6 +6377,46 @@
         <w:spacing w:after="120" w:line="276"/>
       </w:pPr>
       <w:r>
+        <w:t xml:space="preserve">El proyectil devuelto por el parry hace el daño que traía (15 de octubre de 2026). GC_Projectile.Reflect, antes de cambiar de dueño, cambia cada efecto de la habilidad que escala con un stat del que lo tiró por una COPIA CONGELADA (GameplayEffect.CreateFrozenCopy): el número queda fijo y el tipo también (lo mágico sigue escalando "del daño mágico", con coeficiente 0, así sigue ignorando la armadura). ApplyHitEffects recibe el mapa original → copia. La copia viaja por red como su original (SourceTemplate: GameplayEffectRegistry.GetIndex usa Template), con su ícono y su VFX. Antes se devolvía solo el daño principal, plano y físico: la quemadura del Clérigo de la Luz devuelta no hacía nada y lo mágico pasaba por la armadura.</w:t>
+      </w:r>
+    </w:p>
+    <w:p>
+      <w:pPr>
+        <w:spacing w:after="120" w:line="276"/>
+      </w:pPr>
+      <w:r>
+        <w:t xml:space="preserve">Canalizar, en cualquier habilidad (19 de octubre de 2026). Sección Canalizar de GameplayAbility: CastMode (no canaliza / se lanza al terminar / continuo), CastSeconds, CastTickSeconds, CastBlocksOthers, CastBreaksOnDamage y los clips de empezar, bucle y soltar. NetworkASC.ServerActivateAbility llama a BeginCast en vez de Activate: CastRoutine pone Status_Channeling, la barra del dueño (UI_CastBar), el bucle en todas las pantallas (ServerPlayChannelAnimation, que ahora sirve para cualquier GA) y pide la mira en vivo. Lo corta lo que la bloquea (sus ActivationBlockedTags), morir, otra habilidad si es interrumpible o el daño si se marcó, y cortada CUENTA COMO LANZADA (PayCostAndCooldown). Al terminar corre Activate() y manda el clip de soltar a todos menos al personaje del host, que ya lo hizo (ServerPlayAbilityAnimationAfterCast). El continuo repite Activate() cada CastTickSeconds: la primera cobra y las demás no (_castPaid), CanActivate las deja pasar (_castTicking) y no animan (SuppressesOwnAnimation). El dueño no anticipa la animación de una que canaliza. En un lanzamiento apuntado (mantener y soltar: el Haz guía) lo resuelve GA_ProjectileShoot: mantener canaliza y soltar antes de que se llene se guarda hasta que se llene (HoldCastSeconds; del lado del dueño, PlayerController.ProcessHoldRelease). No vale en las de rueda ni en las que ya canalizan solas (IChanneledAbility).</w:t>
+      </w:r>
+    </w:p>
+    <w:p>
+      <w:pPr>
+        <w:spacing w:after="120" w:line="276"/>
+      </w:pPr>
+      <w:r>
+        <w:t xml:space="preserve">El choque de los proyectiles es un BARRIDO (19 de octubre de 2026). GC_Projectile ya no usa OnTriggerEnter: en cada FixedUpdate el servidor barre el tramo que recorrió con la forma del proyectil (BoxCast o SphereCast contra paredes, escudos y gente, con la matriz de colisiones de su capa) y con una esfera de CharacterHitRadius solo contra personajes, y procesa lo encontrado en orden de distancia: un escudo frena antes que el que está detrás, y cada collider cuenta una vez. Antes, a 100 m/s avanzaba 2 m por paso y se saltaba paredes o escudos finos. El primer tramo sale del cuerpo del que tira (pegado a una pared, de frente, pega en la pared). La caja se ajusta al arma que se ve volar (FitColliderToModel), así un tiro que pasa cerca de una pared ya no pega en ella; acertarle a la gente lo decide el radio aparte (0.5 m; la flecha, 0: su caja).</w:t>
+      </w:r>
+    </w:p>
+    <w:p>
+      <w:pPr>
+        <w:spacing w:after="120" w:line="276"/>
+      </w:pPr>
+      <w:r>
+        <w:t xml:space="preserve">Las invocaciones tienen una base (19 y 20 de octubre de 2026): Entity_Summon. Tótems, trampas, cuchillas ilusorias, copias del Ilusionista y compañeros heredan de ella. Se crean con Entity_Summon.Spawn (instancia, spawnea en red, dueño y equipo, y el límite por dueño: la más vieja se va; un grupo por tipo o LimitGroup; CountsTowardLimit) y la base resuelve el equipo y el dueño en SyncVars (SummonerObject en todas las pantallas), "Dura", "Si el dueño muere" (se queda o desaparece), irse si el dueño se va o cambia de clase, su ASC propio (con la vida a 0, OnOwnDeath, en Update y no en medio del daño; puede ser autor de efectos), la visibilidad (todos o solo su equipo; SetRevealed y SetModelHidden) y una regla de enemigo y aliado (la del ASC). Cada subclase sobreescribe OnSummoned, OnExpired, OnOwnerGone, OnOwnDeath y OnZoneEnded. Summon_Zone es la pieza de zona: a los que estén en el radio, cada tanto, sus efectos (a aliados o a enemigos, solo jugadores si se marca, con el dueño o la invocación como autor, potenciada si el dueño tiene un tag, con su propio "Dura" y su VFX del tamaño del radio, que se prende por un SyncVar de la invocación); el aura de los tótems y la zona de espinas son una. Para apoyarlas en el piso: GroundUnderAim (busca desde un poco antes del punto, del lado desde donde se miró: nunca arriba de un techo) y GroundNear (lo que se reparte alrededor). Las trampas son variantes de Prefabs/Summons/Trap_Base.</w:t>
+      </w:r>
+    </w:p>
+    <w:p>
+      <w:pPr>
+        <w:spacing w:after="120" w:line="276"/>
+      </w:pPr>
+      <w:r>
+        <w:t xml:space="preserve">Las barras de vida son un prefab (19 de octubre de 2026): Prefabs/UI/Nameplate, con UI_Nameplate (las piezas: vida, buffs, nombre, aviso de crítico, ícono de clase, y los colores). Cada personaje lleva una instancia a la altura de su cabeza y UI_WorldHealthbar, en su raíz, la encuentra sola: cambiar cómo se ven las vidas es cambiar el prefab. UI_WorldHealthbar.Mirror muestra los datos de otro personaje: la copia del Ilusionista muestra la barra del jugador copiado (nombre, vida, buffs, clase).</w:t>
+      </w:r>
+    </w:p>
+    <w:p>
+      <w:pPr>
+        <w:spacing w:after="120" w:line="276"/>
+      </w:pPr>
+      <w:r>
         <w:t xml:space="preserve">Nada de texto escrito por red (desde el 8 de octubre de 2026, el juego en español e inglés). Lo que el servidor les avisa a los clientes va como QUÉ pasó (un enum, un índice, una clave) y cada pantalla lo escribe con Loc en su idioma: el anunciador (EMatchAnnouncement), el registro de bajas y la pantalla de muerte (nombre del jugador, índice de su clase y ENpcLabel si fue un NPC), los motivos del desatascarse (la clave del texto). Falta la barra de casteo, que todavía recibe el AbilityName (etapa 3 de los idiomas).</w:t>
       </w:r>
     </w:p>
@@ -12331,7 +12371,7 @@
           <w:sz w:val="20"/>
           <w:szCs w:val="20"/>
         </w:rPr>
-        <w:t xml:space="preserve">Devolver (el escudo del Guardián). ReflectMeleeFraction le devuelve al atacante cuerpo a cuerpo (a ParryMeleeRange o menos) lo frenado, con un GE de daño plano creado en runtime: es físico normal, pasa por su armadura y su propio escudo lo puede frenar pero no devolver (candado estático s_reflecting; todo corre sincrónico en el servidor). ReflectProjectilesOnParry: en el parry, GC_Projectile.Reflect cambia el dueño del proyectil, limpia los ya golpeados y los efectos para aliados, no repite los de primer impacto y lleva el daño que traía como un GE plano (con el efecto original se recalcularía con los stats del nuevo dueño); sale hacia AimDirection (el giro del cuerpo más la inclinación de UpperBodyAim). Una sola vez por proyectil.</w:t>
+        <w:t xml:space="preserve">Devolver (el escudo del Guardián). ReflectMeleeFraction le devuelve al atacante cuerpo a cuerpo (a ParryMeleeRange o menos) lo frenado, con un GE de daño plano creado en runtime: es físico normal, pasa por su armadura y su propio escudo lo puede frenar pero no devolver (candado estático s_reflecting; todo corre sincrónico en el servidor). ReflectProjectilesOnParry: en el parry, GC_Projectile.Reflect cambia el dueño del proyectil, limpia los ya golpeados y los efectos para aliados, no repite los de primer impacto y lleva el daño que traía: cada efecto que escala con un stat del que lo tiró va como copia congelada con esos stats (GameplayEffect.CreateFrozenCopy; con el efecto original se recalcularía con los del nuevo dueño), y lo mágico sigue siendo mágico; sale hacia AimDirection (el giro del cuerpo más la inclinación de UpperBodyAim). Una sola vez por proyectil.</w:t>
       </w:r>
     </w:p>
     <w:p>
@@ -13233,7 +13273,7 @@
                 <w:sz w:val="18"/>
                 <w:szCs w:val="18"/>
               </w:rPr>
-              <w:t xml:space="preserve">UI/ (UI_CastBar, UI_ChargeBar, UI_CombatFeedback, UI_LowHealthVignette, UI_RadialMenu, UI_RingWedge, UI_CompanionPanel; UI_KillFeed, UI_DamageNumbers, UI_ScreenFeedback, UI_MainMenu, UI_SettingsPanel, UI_LobbyPanel)</w:t>
+              <w:t xml:space="preserve">UI/ (UI_Nameplate, UI_WorldHealthbar, UI_CastBar, UI_ChargeBar, UI_CombatFeedback, UI_LowHealthVignette, UI_RadialMenu, UI_RingWedge, UI_CompanionPanel; UI_KillFeed, UI_DamageNumbers, UI_ScreenFeedback, UI_MainMenu, UI_SettingsPanel, UI_LobbyPanel)</w:t>
             </w:r>
           </w:p>
         </w:tc>
@@ -13501,7 +13541,7 @@
                 <w:sz w:val="20"/>
                 <w:szCs w:val="20"/>
               </w:rPr>
-              <w:t xml:space="preserve">Los objetos que las habilidades crean: proyectiles (GC_Projectile), tótems, barreras, el señuelo del Ilusionista.</w:t>
+              <w:t xml:space="preserve">Los objetos que las habilidades crean: proyectiles (GC_Projectile), barreras y las invocaciones: Entity_Summon (la base) y Summon_Zone (la zona), de las que salen tótems, trampas, cuchillas, copias y compañeros.</w:t>
             </w:r>
           </w:p>
         </w:tc>

</xml_diff>

<commit_message>
Documentos: cómo funcionan las invocaciones por dentro
- GAS_Arquitectura: sección nueva "8. Profundización IV — Las invocaciones" (cómo nacen, qué
  revisan cada frame, los campos del Inspector, la zona, qué hay en cada pantalla, las que
  existen hoy y cómo hacer una nueva). Las secciones siguientes pasan a ser 9 a 13; el
  resumen de 6.2 apunta a la 8 y hay una regla nueva en "Reglas que rompen fácil".
- Guía de habilidades y arquitectura de red: referencia a esa sección.

Co-Authored-By: Claude Opus 5.5 <noreply@anthropic.com>
</commit_message>
<xml_diff>
--- a/DesignDocuments/GAS_Arquitectura.docx
+++ b/DesignDocuments/GAS_Arquitectura.docx
@@ -6401,7 +6401,7 @@
         <w:spacing w:after="120" w:line="276"/>
       </w:pPr>
       <w:r>
-        <w:t xml:space="preserve">Las invocaciones tienen una base (19 y 20 de octubre de 2026): Entity_Summon. Tótems, trampas, cuchillas ilusorias, copias del Ilusionista y compañeros heredan de ella. Se crean con Entity_Summon.Spawn (instancia, spawnea en red, dueño y equipo, y el límite por dueño: la más vieja se va; un grupo por tipo o LimitGroup; CountsTowardLimit) y la base resuelve el equipo y el dueño en SyncVars (SummonerObject en todas las pantallas), "Dura", "Si el dueño muere" (se queda o desaparece), irse si el dueño se va o cambia de clase, su ASC propio (con la vida a 0, OnOwnDeath, en Update y no en medio del daño; puede ser autor de efectos), la visibilidad (todos o solo su equipo; SetRevealed y SetModelHidden) y una regla de enemigo y aliado (la del ASC). Cada subclase sobreescribe OnSummoned, OnExpired, OnOwnerGone, OnOwnDeath y OnZoneEnded. Summon_Zone es la pieza de zona: a los que estén en el radio, cada tanto, sus efectos (a aliados o a enemigos, solo jugadores si se marca, con el dueño o la invocación como autor, potenciada si el dueño tiene un tag, con su propio "Dura" y su VFX del tamaño del radio, que se prende por un SyncVar de la invocación); el aura de los tótems y la zona de espinas son una. Para apoyarlas en el piso: GroundUnderAim (busca desde un poco antes del punto, del lado desde donde se miró: nunca arriba de un techo) y GroundNear (lo que se reparte alrededor). Las trampas son variantes de Prefabs/Summons/Trap_Base. Para crear una nueva sin código hay dos PLANTILLAS en Prefabs/Summons (Summon_Base, con vida, barra y collider en la capa 7; SummonZone_Base, solo zona) de las que se hace una variante, y un genérico que la pone, GA_SpawnSummon (donde apunta con marcador, a los pies o delante; "Máximo a la vez"). El límite de una invocación genérica (Entity_Summon sin subclase) se agrupa por su prefab; el de una subclase, por su clase (todos los tótems juntos). Los pasos están en la guía (7.1).</w:t>
+        <w:t xml:space="preserve">Las invocaciones tienen una base (19 y 20 de octubre de 2026): Entity_Summon, con Summon_Zone para las zonas. Cómo nacen, qué revisan cada frame, qué viaja por red y cómo se hace una nueva: sección 8.</w:t>
       </w:r>
     </w:p>
     <w:p>
@@ -7477,7 +7477,2365 @@
           <w:sz w:val="32"/>
           <w:szCs w:val="32"/>
         </w:rPr>
-        <w:t xml:space="preserve">8. Glosario — EAttributeType</w:t>
+        <w:t xml:space="preserve">8. Profundización IV — Las invocaciones</w:t>
+      </w:r>
+    </w:p>
+    <w:p>
+      <w:pPr>
+        <w:spacing w:after="120" w:line="276"/>
+      </w:pPr>
+      <w:r>
+        <w:t xml:space="preserve">Archivos: </w:t>
+      </w:r>
+      <w:r>
+        <w:rPr>
+          <w:rFonts w:ascii="Consolas" w:cs="Consolas" w:eastAsia="Consolas" w:hAnsi="Consolas"/>
+          <w:sz w:val="20"/>
+          <w:szCs w:val="20"/>
+        </w:rPr>
+        <w:t xml:space="preserve">Assets/Scripts/GAS/Entities/Entity_Summon.cs</w:t>
+      </w:r>
+      <w:r>
+        <w:t xml:space="preserve"> y </w:t>
+      </w:r>
+      <w:r>
+        <w:rPr>
+          <w:rFonts w:ascii="Consolas" w:cs="Consolas" w:eastAsia="Consolas" w:hAnsi="Consolas"/>
+          <w:sz w:val="20"/>
+          <w:szCs w:val="20"/>
+        </w:rPr>
+        <w:t xml:space="preserve">Summon_Zone.cs</w:t>
+      </w:r>
+      <w:r>
+        <w:t xml:space="preserve">. Todo lo que una habilidad DEJA en el mundo —un tótem, una trampa, una copia, un compañero, una cuchilla— es una </w:t>
+      </w:r>
+      <w:r>
+        <w:rPr>
+          <w:b/>
+          <w:bCs/>
+        </w:rPr>
+        <w:t xml:space="preserve">invocación</w:t>
+      </w:r>
+      <w:r>
+        <w:t xml:space="preserve">: un prefab con </w:t>
+      </w:r>
+      <w:r>
+        <w:rPr>
+          <w:rFonts w:ascii="Consolas" w:cs="Consolas" w:eastAsia="Consolas" w:hAnsi="Consolas"/>
+          <w:sz w:val="20"/>
+          <w:szCs w:val="20"/>
+        </w:rPr>
+        <w:t xml:space="preserve">Entity_Summon</w:t>
+      </w:r>
+      <w:r>
+        <w:t xml:space="preserve">, un NetworkBehaviour. Antes cada una tenía su propia versión del límite, de quién es enemigo y de qué pasa si el dueño muere; desde el 19 de octubre de 2026 eso está una sola vez en la base, y lo propio de cada una va en una subclase.</w:t>
+      </w:r>
+    </w:p>
+    <w:tbl>
+      <w:tblPr>
+        <w:tblW w:type="dxa" w:w="9400"/>
+        <w:tblBorders>
+          <w:top w:val="single" w:color="auto" w:sz="4"/>
+          <w:left w:val="single" w:color="auto" w:sz="4"/>
+          <w:bottom w:val="single" w:color="auto" w:sz="4"/>
+          <w:right w:val="single" w:color="auto" w:sz="4"/>
+          <w:insideH w:val="single" w:color="auto" w:sz="4"/>
+          <w:insideV w:val="single" w:color="auto" w:sz="4"/>
+        </w:tblBorders>
+      </w:tblPr>
+      <w:tblGrid>
+        <w:gridCol w:w="2800"/>
+        <w:gridCol w:w="2400"/>
+        <w:gridCol w:w="4200"/>
+      </w:tblGrid>
+      <w:tr>
+        <w:trPr>
+          <w:tblHeader/>
+        </w:trPr>
+        <w:tc>
+          <w:tcPr>
+            <w:tcW w:type="dxa" w:w="2800"/>
+            <w:shd w:fill="DCE6F1" w:val="clear"/>
+            <w:tcMar>
+              <w:top w:type="dxa" w:w="60"/>
+              <w:left w:type="dxa" w:w="100"/>
+              <w:bottom w:type="dxa" w:w="60"/>
+              <w:right w:type="dxa" w:w="100"/>
+            </w:tcMar>
+          </w:tcPr>
+          <w:p>
+            <w:pPr>
+              <w:spacing w:after="0"/>
+            </w:pPr>
+            <w:r>
+              <w:rPr>
+                <w:b/>
+                <w:bCs/>
+                <w:sz w:val="20"/>
+                <w:szCs w:val="20"/>
+              </w:rPr>
+              <w:t xml:space="preserve">Pieza</w:t>
+            </w:r>
+          </w:p>
+        </w:tc>
+        <w:tc>
+          <w:tcPr>
+            <w:tcW w:type="dxa" w:w="2400"/>
+            <w:shd w:fill="DCE6F1" w:val="clear"/>
+            <w:tcMar>
+              <w:top w:type="dxa" w:w="60"/>
+              <w:left w:type="dxa" w:w="100"/>
+              <w:bottom w:type="dxa" w:w="60"/>
+              <w:right w:type="dxa" w:w="100"/>
+            </w:tcMar>
+          </w:tcPr>
+          <w:p>
+            <w:pPr>
+              <w:spacing w:after="0"/>
+            </w:pPr>
+            <w:r>
+              <w:rPr>
+                <w:b/>
+                <w:bCs/>
+                <w:sz w:val="20"/>
+                <w:szCs w:val="20"/>
+              </w:rPr>
+              <w:t xml:space="preserve">¿Siempre?</w:t>
+            </w:r>
+          </w:p>
+        </w:tc>
+        <w:tc>
+          <w:tcPr>
+            <w:tcW w:type="dxa" w:w="4200"/>
+            <w:shd w:fill="DCE6F1" w:val="clear"/>
+            <w:tcMar>
+              <w:top w:type="dxa" w:w="60"/>
+              <w:left w:type="dxa" w:w="100"/>
+              <w:bottom w:type="dxa" w:w="60"/>
+              <w:right w:type="dxa" w:w="100"/>
+            </w:tcMar>
+          </w:tcPr>
+          <w:p>
+            <w:pPr>
+              <w:spacing w:after="0"/>
+            </w:pPr>
+            <w:r>
+              <w:rPr>
+                <w:b/>
+                <w:bCs/>
+                <w:sz w:val="20"/>
+                <w:szCs w:val="20"/>
+              </w:rPr>
+              <w:t xml:space="preserve">Para qué</w:t>
+            </w:r>
+          </w:p>
+        </w:tc>
+      </w:tr>
+      <w:tr>
+        <w:tc>
+          <w:tcPr>
+            <w:tcW w:type="dxa" w:w="2800"/>
+            <w:tcMar>
+              <w:top w:type="dxa" w:w="60"/>
+              <w:left w:type="dxa" w:w="100"/>
+              <w:bottom w:type="dxa" w:w="60"/>
+              <w:right w:type="dxa" w:w="100"/>
+            </w:tcMar>
+          </w:tcPr>
+          <w:p>
+            <w:pPr>
+              <w:spacing w:after="0"/>
+            </w:pPr>
+            <w:r>
+              <w:rPr>
+                <w:rFonts w:ascii="Consolas" w:cs="Consolas" w:eastAsia="Consolas" w:hAnsi="Consolas"/>
+                <w:sz w:val="18"/>
+                <w:szCs w:val="18"/>
+              </w:rPr>
+              <w:t xml:space="preserve">Entity_Summon</w:t>
+            </w:r>
+          </w:p>
+        </w:tc>
+        <w:tc>
+          <w:tcPr>
+            <w:tcW w:type="dxa" w:w="2400"/>
+            <w:tcMar>
+              <w:top w:type="dxa" w:w="60"/>
+              <w:left w:type="dxa" w:w="100"/>
+              <w:bottom w:type="dxa" w:w="60"/>
+              <w:right w:type="dxa" w:w="100"/>
+            </w:tcMar>
+          </w:tcPr>
+          <w:p>
+            <w:pPr>
+              <w:spacing w:after="0"/>
+            </w:pPr>
+            <w:r>
+              <w:rPr>
+                <w:sz w:val="20"/>
+                <w:szCs w:val="20"/>
+              </w:rPr>
+              <w:t xml:space="preserve">Sí</w:t>
+            </w:r>
+          </w:p>
+        </w:tc>
+        <w:tc>
+          <w:tcPr>
+            <w:tcW w:type="dxa" w:w="4200"/>
+            <w:tcMar>
+              <w:top w:type="dxa" w:w="60"/>
+              <w:left w:type="dxa" w:w="100"/>
+              <w:bottom w:type="dxa" w:w="60"/>
+              <w:right w:type="dxa" w:w="100"/>
+            </w:tcMar>
+          </w:tcPr>
+          <w:p>
+            <w:pPr>
+              <w:spacing w:after="0"/>
+            </w:pPr>
+            <w:r>
+              <w:rPr>
+                <w:sz w:val="20"/>
+                <w:szCs w:val="20"/>
+              </w:rPr>
+              <w:t xml:space="preserve">Dueño, equipo, cuánto dura, el límite por dueño, qué pasa si el dueño muere y quién la ve.</w:t>
+            </w:r>
+          </w:p>
+        </w:tc>
+      </w:tr>
+      <w:tr>
+        <w:tc>
+          <w:tcPr>
+            <w:tcW w:type="dxa" w:w="2800"/>
+            <w:tcMar>
+              <w:top w:type="dxa" w:w="60"/>
+              <w:left w:type="dxa" w:w="100"/>
+              <w:bottom w:type="dxa" w:w="60"/>
+              <w:right w:type="dxa" w:w="100"/>
+            </w:tcMar>
+          </w:tcPr>
+          <w:p>
+            <w:pPr>
+              <w:spacing w:after="0"/>
+            </w:pPr>
+            <w:r>
+              <w:rPr>
+                <w:rFonts w:ascii="Consolas" w:cs="Consolas" w:eastAsia="Consolas" w:hAnsi="Consolas"/>
+                <w:sz w:val="18"/>
+                <w:szCs w:val="18"/>
+              </w:rPr>
+              <w:t xml:space="preserve">Summon_Zone</w:t>
+            </w:r>
+          </w:p>
+        </w:tc>
+        <w:tc>
+          <w:tcPr>
+            <w:tcW w:type="dxa" w:w="2400"/>
+            <w:tcMar>
+              <w:top w:type="dxa" w:w="60"/>
+              <w:left w:type="dxa" w:w="100"/>
+              <w:bottom w:type="dxa" w:w="60"/>
+              <w:right w:type="dxa" w:w="100"/>
+            </w:tcMar>
+          </w:tcPr>
+          <w:p>
+            <w:pPr>
+              <w:spacing w:after="0"/>
+            </w:pPr>
+            <w:r>
+              <w:rPr>
+                <w:sz w:val="20"/>
+                <w:szCs w:val="20"/>
+              </w:rPr>
+              <w:t xml:space="preserve">Opcional</w:t>
+            </w:r>
+          </w:p>
+        </w:tc>
+        <w:tc>
+          <w:tcPr>
+            <w:tcW w:type="dxa" w:w="4200"/>
+            <w:tcMar>
+              <w:top w:type="dxa" w:w="60"/>
+              <w:left w:type="dxa" w:w="100"/>
+              <w:bottom w:type="dxa" w:w="60"/>
+              <w:right w:type="dxa" w:w="100"/>
+            </w:tcMar>
+          </w:tcPr>
+          <w:p>
+            <w:pPr>
+              <w:spacing w:after="0"/>
+            </w:pPr>
+            <w:r>
+              <w:rPr>
+                <w:sz w:val="20"/>
+                <w:szCs w:val="20"/>
+              </w:rPr>
+              <w:t xml:space="preserve">"A los que estén en este radio, cada tanto, estos efectos": el aura del tótem, la zona de espinas, un muro de fuego.</w:t>
+            </w:r>
+          </w:p>
+        </w:tc>
+      </w:tr>
+      <w:tr>
+        <w:tc>
+          <w:tcPr>
+            <w:tcW w:type="dxa" w:w="2800"/>
+            <w:tcMar>
+              <w:top w:type="dxa" w:w="60"/>
+              <w:left w:type="dxa" w:w="100"/>
+              <w:bottom w:type="dxa" w:w="60"/>
+              <w:right w:type="dxa" w:w="100"/>
+            </w:tcMar>
+          </w:tcPr>
+          <w:p>
+            <w:pPr>
+              <w:spacing w:after="0"/>
+            </w:pPr>
+            <w:r>
+              <w:rPr>
+                <w:sz w:val="20"/>
+                <w:szCs w:val="20"/>
+              </w:rPr>
+              <w:t xml:space="preserve">Su propio ASC (</w:t>
+            </w:r>
+            <w:r>
+              <w:rPr>
+                <w:rFonts w:ascii="Consolas" w:cs="Consolas" w:eastAsia="Consolas" w:hAnsi="Consolas"/>
+                <w:sz w:val="18"/>
+                <w:szCs w:val="18"/>
+              </w:rPr>
+              <w:t xml:space="preserve">AbilitySystemComponent</w:t>
+            </w:r>
+            <w:r>
+              <w:rPr>
+                <w:sz w:val="20"/>
+                <w:szCs w:val="20"/>
+              </w:rPr>
+              <w:t xml:space="preserve"> + </w:t>
+            </w:r>
+            <w:r>
+              <w:rPr>
+                <w:rFonts w:ascii="Consolas" w:cs="Consolas" w:eastAsia="Consolas" w:hAnsi="Consolas"/>
+                <w:sz w:val="18"/>
+                <w:szCs w:val="18"/>
+              </w:rPr>
+              <w:t xml:space="preserve">NetworkAbilitySystemComponent</w:t>
+            </w:r>
+            <w:r>
+              <w:rPr>
+                <w:sz w:val="20"/>
+                <w:szCs w:val="20"/>
+              </w:rPr>
+              <w:t xml:space="preserve">)</w:t>
+            </w:r>
+          </w:p>
+        </w:tc>
+        <w:tc>
+          <w:tcPr>
+            <w:tcW w:type="dxa" w:w="2400"/>
+            <w:tcMar>
+              <w:top w:type="dxa" w:w="60"/>
+              <w:left w:type="dxa" w:w="100"/>
+              <w:bottom w:type="dxa" w:w="60"/>
+              <w:right w:type="dxa" w:w="100"/>
+            </w:tcMar>
+          </w:tcPr>
+          <w:p>
+            <w:pPr>
+              <w:spacing w:after="0"/>
+            </w:pPr>
+            <w:r>
+              <w:rPr>
+                <w:sz w:val="20"/>
+                <w:szCs w:val="20"/>
+              </w:rPr>
+              <w:t xml:space="preserve">Opcional</w:t>
+            </w:r>
+          </w:p>
+        </w:tc>
+        <w:tc>
+          <w:tcPr>
+            <w:tcW w:type="dxa" w:w="4200"/>
+            <w:tcMar>
+              <w:top w:type="dxa" w:w="60"/>
+              <w:left w:type="dxa" w:w="100"/>
+              <w:bottom w:type="dxa" w:w="60"/>
+              <w:right w:type="dxa" w:w="100"/>
+            </w:tcMar>
+          </w:tcPr>
+          <w:p>
+            <w:pPr>
+              <w:spacing w:after="0"/>
+            </w:pPr>
+            <w:r>
+              <w:rPr>
+                <w:sz w:val="20"/>
+                <w:szCs w:val="20"/>
+              </w:rPr>
+              <w:t xml:space="preserve">Vida y barra: se le puede pegar, con la vida a 0 se rompe, y puede ser AUTORA de efectos (el empuje que sale desde ella).</w:t>
+            </w:r>
+          </w:p>
+        </w:tc>
+      </w:tr>
+    </w:tbl>
+    <w:p>
+      <w:pPr>
+        <w:spacing w:after="120" w:line="276"/>
+      </w:pPr>
+      <w:r>
+        <w:t xml:space="preserve">Si tiene que HACER algo propio (caminar, perseguir, explotar al pisarla), eso es una subclase de </w:t>
+      </w:r>
+      <w:r>
+        <w:rPr>
+          <w:rFonts w:ascii="Consolas" w:cs="Consolas" w:eastAsia="Consolas" w:hAnsi="Consolas"/>
+          <w:sz w:val="20"/>
+          <w:szCs w:val="20"/>
+        </w:rPr>
+        <w:t xml:space="preserve">Entity_Summon</w:t>
+      </w:r>
+      <w:r>
+        <w:t xml:space="preserve">. Los proyectiles (</w:t>
+      </w:r>
+      <w:r>
+        <w:rPr>
+          <w:rFonts w:ascii="Consolas" w:cs="Consolas" w:eastAsia="Consolas" w:hAnsi="Consolas"/>
+          <w:sz w:val="20"/>
+          <w:szCs w:val="20"/>
+        </w:rPr>
+        <w:t xml:space="preserve">GC_Projectile</w:t>
+      </w:r>
+      <w:r>
+        <w:t xml:space="preserve">) no son invocaciones, a propósito: viven poco y tienen su propio choque por barrido.</w:t>
+      </w:r>
+    </w:p>
+    <w:p>
+      <w:pPr>
+        <w:pStyle w:val="Heading2"/>
+        <w:spacing w:after="120" w:before="280"/>
+      </w:pPr>
+      <w:r>
+        <w:rPr>
+          <w:b/>
+          <w:bCs/>
+          <w:color w:val="2E74B5"/>
+          <w:sz w:val="26"/>
+          <w:szCs w:val="26"/>
+        </w:rPr>
+        <w:t xml:space="preserve">8.1 Cómo nace (en el servidor)</w:t>
+      </w:r>
+    </w:p>
+    <w:p>
+      <w:pPr>
+        <w:pStyle w:val="ListParagraph"/>
+        <w:numPr>
+          <w:ilvl w:val="0"/>
+          <w:numId w:val="4"/>
+        </w:numPr>
+        <w:spacing w:after="60"/>
+      </w:pPr>
+      <w:r>
+        <w:rPr>
+          <w:b/>
+          <w:bCs/>
+        </w:rPr>
+        <w:t xml:space="preserve">Dónde.</w:t>
+      </w:r>
+      <w:r>
+        <w:t xml:space="preserve"> La habilidad apoya el punto en el piso con </w:t>
+      </w:r>
+      <w:r>
+        <w:rPr>
+          <w:rFonts w:ascii="Consolas" w:cs="Consolas" w:eastAsia="Consolas" w:hAnsi="Consolas"/>
+          <w:sz w:val="20"/>
+          <w:szCs w:val="20"/>
+        </w:rPr>
+        <w:t xml:space="preserve">Entity_Summon.GroundUnderAim</w:t>
+      </w:r>
+      <w:r>
+        <w:t xml:space="preserve"> (donde apunta la mira) o </w:t>
+      </w:r>
+      <w:r>
+        <w:rPr>
+          <w:rFonts w:ascii="Consolas" w:cs="Consolas" w:eastAsia="Consolas" w:hAnsi="Consolas"/>
+          <w:sz w:val="20"/>
+          <w:szCs w:val="20"/>
+        </w:rPr>
+        <w:t xml:space="preserve">GroundNear</w:t>
+      </w:r>
+      <w:r>
+        <w:t xml:space="preserve"> (lo que se reparte alrededor). Los dos buscan el piso desde el lado desde donde se miró: nunca queda arriba de un techo.</w:t>
+      </w:r>
+    </w:p>
+    <w:p>
+      <w:pPr>
+        <w:pStyle w:val="ListParagraph"/>
+        <w:numPr>
+          <w:ilvl w:val="0"/>
+          <w:numId w:val="4"/>
+        </w:numPr>
+        <w:spacing w:after="60"/>
+      </w:pPr>
+      <w:r>
+        <w:rPr>
+          <w:b/>
+          <w:bCs/>
+        </w:rPr>
+        <w:t xml:space="preserve">Spawn.</w:t>
+      </w:r>
+      <w:r>
+        <w:t xml:space="preserve"> </w:t>
+      </w:r>
+      <w:r>
+        <w:rPr>
+          <w:rFonts w:ascii="Consolas" w:cs="Consolas" w:eastAsia="Consolas" w:hAnsi="Consolas"/>
+          <w:sz w:val="20"/>
+          <w:szCs w:val="20"/>
+        </w:rPr>
+        <w:t xml:space="preserve">Entity_Summon.Spawn(prefab, dueño, posición, rotación, máximo, cuentaParaElLímite)</w:t>
+      </w:r>
+      <w:r>
+        <w:t xml:space="preserve"> instancia el prefab y lo spawnea en red. Devuelve null (y avisa) si el prefab no tiene un </w:t>
+      </w:r>
+      <w:r>
+        <w:rPr>
+          <w:rFonts w:ascii="Consolas" w:cs="Consolas" w:eastAsia="Consolas" w:hAnsi="Consolas"/>
+          <w:sz w:val="20"/>
+          <w:szCs w:val="20"/>
+        </w:rPr>
+        <w:t xml:space="preserve">Entity_Summon</w:t>
+      </w:r>
+      <w:r>
+        <w:t xml:space="preserve">.</w:t>
+      </w:r>
+    </w:p>
+    <w:p>
+      <w:pPr>
+        <w:pStyle w:val="ListParagraph"/>
+        <w:numPr>
+          <w:ilvl w:val="0"/>
+          <w:numId w:val="4"/>
+        </w:numPr>
+        <w:spacing w:after="60"/>
+      </w:pPr>
+      <w:r>
+        <w:rPr>
+          <w:b/>
+          <w:bCs/>
+        </w:rPr>
+        <w:t xml:space="preserve">Setup.</w:t>
+      </w:r>
+      <w:r>
+        <w:t xml:space="preserve"> Guarda el dueño (</w:t>
+      </w:r>
+      <w:r>
+        <w:rPr>
+          <w:rFonts w:ascii="Consolas" w:cs="Consolas" w:eastAsia="Consolas" w:hAnsi="Consolas"/>
+          <w:sz w:val="20"/>
+          <w:szCs w:val="20"/>
+        </w:rPr>
+        <w:t xml:space="preserve">Summoner</w:t>
+      </w:r>
+      <w:r>
+        <w:t xml:space="preserve">), copia su equipo a un SyncVar, arranca el reloj de "Dura" y anota la clase del dueño. Si tiene ASC propio: le asigna el equipo por el NetworkASC, escucha su muerte y manda su vida a todas las pantallas (</w:t>
+      </w:r>
+      <w:r>
+        <w:rPr>
+          <w:rFonts w:ascii="Consolas" w:cs="Consolas" w:eastAsia="Consolas" w:hAnsi="Consolas"/>
+          <w:sz w:val="20"/>
+          <w:szCs w:val="20"/>
+        </w:rPr>
+        <w:t xml:space="preserve">SyncAllAttributesToNet</w:t>
+      </w:r>
+      <w:r>
+        <w:t xml:space="preserve">: el ASC la carga en Awake, antes de estar en red, y el NetworkASC solo manda los CAMBIOS; sin esto la barra salía vacía hasta el primer golpe).</w:t>
+      </w:r>
+    </w:p>
+    <w:p>
+      <w:pPr>
+        <w:pStyle w:val="ListParagraph"/>
+        <w:numPr>
+          <w:ilvl w:val="0"/>
+          <w:numId w:val="4"/>
+        </w:numPr>
+        <w:spacing w:after="60"/>
+      </w:pPr>
+      <w:r>
+        <w:rPr>
+          <w:b/>
+          <w:bCs/>
+        </w:rPr>
+        <w:t xml:space="preserve">El límite.</w:t>
+      </w:r>
+      <w:r>
+        <w:t xml:space="preserve"> Entra a la lista de su dueño y su grupo; si se pasa del máximo, se va la más vieja (ver 8.3).</w:t>
+      </w:r>
+    </w:p>
+    <w:p>
+      <w:pPr>
+        <w:pStyle w:val="ListParagraph"/>
+        <w:numPr>
+          <w:ilvl w:val="0"/>
+          <w:numId w:val="4"/>
+        </w:numPr>
+        <w:spacing w:after="60"/>
+      </w:pPr>
+      <w:r>
+        <w:rPr>
+          <w:b/>
+          <w:bCs/>
+        </w:rPr>
+        <w:t xml:space="preserve">Lo propio.</w:t>
+      </w:r>
+      <w:r>
+        <w:t xml:space="preserve"> Llama a </w:t>
+      </w:r>
+      <w:r>
+        <w:rPr>
+          <w:rFonts w:ascii="Consolas" w:cs="Consolas" w:eastAsia="Consolas" w:hAnsi="Consolas"/>
+          <w:sz w:val="20"/>
+          <w:szCs w:val="20"/>
+        </w:rPr>
+        <w:t xml:space="preserve">OnSummoned()</w:t>
+      </w:r>
+      <w:r>
+        <w:t xml:space="preserve"> de la subclase y prende su zona si tiene "Empieza prendida".</w:t>
+      </w:r>
+    </w:p>
+    <w:p>
+      <w:pPr>
+        <w:pStyle w:val="Heading2"/>
+        <w:spacing w:after="120" w:before="280"/>
+      </w:pPr>
+      <w:r>
+        <w:rPr>
+          <w:b/>
+          <w:bCs/>
+          <w:color w:val="2E74B5"/>
+          <w:sz w:val="26"/>
+          <w:szCs w:val="26"/>
+        </w:rPr>
+        <w:t xml:space="preserve">8.2 Cada frame</w:t>
+      </w:r>
+    </w:p>
+    <w:p>
+      <w:pPr>
+        <w:spacing w:after="120" w:line="276"/>
+      </w:pPr>
+      <w:r>
+        <w:t xml:space="preserve">En todas las pantallas, </w:t>
+      </w:r>
+      <w:r>
+        <w:rPr>
+          <w:rFonts w:ascii="Consolas" w:cs="Consolas" w:eastAsia="Consolas" w:hAnsi="Consolas"/>
+          <w:sz w:val="20"/>
+          <w:szCs w:val="20"/>
+        </w:rPr>
+        <w:t xml:space="preserve">Update</w:t>
+      </w:r>
+      <w:r>
+        <w:t xml:space="preserve"> resuelve la visibilidad. En el servidor revisa, en este orden:</w:t>
+      </w:r>
+    </w:p>
+    <w:p>
+      <w:pPr>
+        <w:pStyle w:val="ListParagraph"/>
+        <w:numPr>
+          <w:ilvl w:val="0"/>
+          <w:numId w:val="5"/>
+        </w:numPr>
+        <w:spacing w:after="60"/>
+      </w:pPr>
+      <w:r>
+        <w:t xml:space="preserve">Su propia vida llegó a 0 → </w:t>
+      </w:r>
+      <w:r>
+        <w:rPr>
+          <w:rFonts w:ascii="Consolas" w:cs="Consolas" w:eastAsia="Consolas" w:hAnsi="Consolas"/>
+          <w:sz w:val="20"/>
+          <w:szCs w:val="20"/>
+        </w:rPr>
+        <w:t xml:space="preserve">OnOwnDeath()</w:t>
+      </w:r>
+      <w:r>
+        <w:t xml:space="preserve">.</w:t>
+      </w:r>
+    </w:p>
+    <w:p>
+      <w:pPr>
+        <w:pStyle w:val="ListParagraph"/>
+        <w:numPr>
+          <w:ilvl w:val="0"/>
+          <w:numId w:val="5"/>
+        </w:numPr>
+        <w:spacing w:after="60"/>
+      </w:pPr>
+      <w:r>
+        <w:t xml:space="preserve">El dueño se fue del juego o cambió de clase → </w:t>
+      </w:r>
+      <w:r>
+        <w:rPr>
+          <w:rFonts w:ascii="Consolas" w:cs="Consolas" w:eastAsia="Consolas" w:hAnsi="Consolas"/>
+          <w:sz w:val="20"/>
+          <w:szCs w:val="20"/>
+        </w:rPr>
+        <w:t xml:space="preserve">OnOwnerGone()</w:t>
+      </w:r>
+      <w:r>
+        <w:t xml:space="preserve">.</w:t>
+      </w:r>
+    </w:p>
+    <w:p>
+      <w:pPr>
+        <w:pStyle w:val="ListParagraph"/>
+        <w:numPr>
+          <w:ilvl w:val="0"/>
+          <w:numId w:val="5"/>
+        </w:numPr>
+        <w:spacing w:after="60"/>
+      </w:pPr>
+      <w:r>
+        <w:t xml:space="preserve">El dueño murió y "Si el dueño muere" es Desaparece → </w:t>
+      </w:r>
+      <w:r>
+        <w:rPr>
+          <w:rFonts w:ascii="Consolas" w:cs="Consolas" w:eastAsia="Consolas" w:hAnsi="Consolas"/>
+          <w:sz w:val="20"/>
+          <w:szCs w:val="20"/>
+        </w:rPr>
+        <w:t xml:space="preserve">OnOwnerGone()</w:t>
+      </w:r>
+      <w:r>
+        <w:t xml:space="preserve">.</w:t>
+      </w:r>
+    </w:p>
+    <w:p>
+      <w:pPr>
+        <w:pStyle w:val="ListParagraph"/>
+        <w:numPr>
+          <w:ilvl w:val="0"/>
+          <w:numId w:val="5"/>
+        </w:numPr>
+        <w:spacing w:after="60"/>
+      </w:pPr>
+      <w:r>
+        <w:t xml:space="preserve">Se cumplió "Dura" → </w:t>
+      </w:r>
+      <w:r>
+        <w:rPr>
+          <w:rFonts w:ascii="Consolas" w:cs="Consolas" w:eastAsia="Consolas" w:hAnsi="Consolas"/>
+          <w:sz w:val="20"/>
+          <w:szCs w:val="20"/>
+        </w:rPr>
+        <w:t xml:space="preserve">OnExpired()</w:t>
+      </w:r>
+      <w:r>
+        <w:t xml:space="preserve">.</w:t>
+      </w:r>
+    </w:p>
+    <w:p>
+      <w:pPr>
+        <w:spacing w:after="120" w:line="276"/>
+      </w:pPr>
+      <w:r>
+        <w:t xml:space="preserve">Por defecto los cuatro la despawnean (</w:t>
+      </w:r>
+      <w:r>
+        <w:rPr>
+          <w:rFonts w:ascii="Consolas" w:cs="Consolas" w:eastAsia="Consolas" w:hAnsi="Consolas"/>
+          <w:sz w:val="20"/>
+          <w:szCs w:val="20"/>
+        </w:rPr>
+        <w:t xml:space="preserve">ServerDespawn</w:t>
+      </w:r>
+      <w:r>
+        <w:t xml:space="preserve">); una subclase puede cambiarlo: la bomba del Trampero explota al vencerse. Las muertes llegan en medio del pipeline de daño: los avisos solo las ANOTAN y se resuelven acá, porque despawnear dentro del recorrido de efectos de la víctima lo rompía.</w:t>
+      </w:r>
+    </w:p>
+    <w:p>
+      <w:pPr>
+        <w:pStyle w:val="Heading2"/>
+        <w:spacing w:after="120" w:before="280"/>
+      </w:pPr>
+      <w:r>
+        <w:rPr>
+          <w:b/>
+          <w:bCs/>
+          <w:color w:val="2E74B5"/>
+          <w:sz w:val="26"/>
+          <w:szCs w:val="26"/>
+        </w:rPr>
+        <w:t xml:space="preserve">8.3 Lo que se configura</w:t>
+      </w:r>
+    </w:p>
+    <w:tbl>
+      <w:tblPr>
+        <w:tblW w:type="dxa" w:w="9400"/>
+        <w:tblBorders>
+          <w:top w:val="single" w:color="auto" w:sz="4"/>
+          <w:left w:val="single" w:color="auto" w:sz="4"/>
+          <w:bottom w:val="single" w:color="auto" w:sz="4"/>
+          <w:right w:val="single" w:color="auto" w:sz="4"/>
+          <w:insideH w:val="single" w:color="auto" w:sz="4"/>
+          <w:insideV w:val="single" w:color="auto" w:sz="4"/>
+        </w:tblBorders>
+      </w:tblPr>
+      <w:tblGrid>
+        <w:gridCol w:w="2600"/>
+        <w:gridCol w:w="6800"/>
+      </w:tblGrid>
+      <w:tr>
+        <w:trPr>
+          <w:tblHeader/>
+        </w:trPr>
+        <w:tc>
+          <w:tcPr>
+            <w:tcW w:type="dxa" w:w="2600"/>
+            <w:shd w:fill="DCE6F1" w:val="clear"/>
+            <w:tcMar>
+              <w:top w:type="dxa" w:w="60"/>
+              <w:left w:type="dxa" w:w="100"/>
+              <w:bottom w:type="dxa" w:w="60"/>
+              <w:right w:type="dxa" w:w="100"/>
+            </w:tcMar>
+          </w:tcPr>
+          <w:p>
+            <w:pPr>
+              <w:spacing w:after="0"/>
+            </w:pPr>
+            <w:r>
+              <w:rPr>
+                <w:b/>
+                <w:bCs/>
+                <w:sz w:val="20"/>
+                <w:szCs w:val="20"/>
+              </w:rPr>
+              <w:t xml:space="preserve">Campo</w:t>
+            </w:r>
+          </w:p>
+        </w:tc>
+        <w:tc>
+          <w:tcPr>
+            <w:tcW w:type="dxa" w:w="6800"/>
+            <w:shd w:fill="DCE6F1" w:val="clear"/>
+            <w:tcMar>
+              <w:top w:type="dxa" w:w="60"/>
+              <w:left w:type="dxa" w:w="100"/>
+              <w:bottom w:type="dxa" w:w="60"/>
+              <w:right w:type="dxa" w:w="100"/>
+            </w:tcMar>
+          </w:tcPr>
+          <w:p>
+            <w:pPr>
+              <w:spacing w:after="0"/>
+            </w:pPr>
+            <w:r>
+              <w:rPr>
+                <w:b/>
+                <w:bCs/>
+                <w:sz w:val="20"/>
+                <w:szCs w:val="20"/>
+              </w:rPr>
+              <w:t xml:space="preserve">Qué hace</w:t>
+            </w:r>
+          </w:p>
+        </w:tc>
+      </w:tr>
+      <w:tr>
+        <w:tc>
+          <w:tcPr>
+            <w:tcW w:type="dxa" w:w="2600"/>
+            <w:tcMar>
+              <w:top w:type="dxa" w:w="60"/>
+              <w:left w:type="dxa" w:w="100"/>
+              <w:bottom w:type="dxa" w:w="60"/>
+              <w:right w:type="dxa" w:w="100"/>
+            </w:tcMar>
+          </w:tcPr>
+          <w:p>
+            <w:pPr>
+              <w:spacing w:after="0"/>
+            </w:pPr>
+            <w:r>
+              <w:rPr>
+                <w:sz w:val="20"/>
+                <w:szCs w:val="20"/>
+              </w:rPr>
+              <w:t xml:space="preserve">Dura (s)</w:t>
+            </w:r>
+          </w:p>
+        </w:tc>
+        <w:tc>
+          <w:tcPr>
+            <w:tcW w:type="dxa" w:w="6800"/>
+            <w:tcMar>
+              <w:top w:type="dxa" w:w="60"/>
+              <w:left w:type="dxa" w:w="100"/>
+              <w:bottom w:type="dxa" w:w="60"/>
+              <w:right w:type="dxa" w:w="100"/>
+            </w:tcMar>
+          </w:tcPr>
+          <w:p>
+            <w:pPr>
+              <w:spacing w:after="0"/>
+            </w:pPr>
+            <w:r>
+              <w:rPr>
+                <w:sz w:val="20"/>
+                <w:szCs w:val="20"/>
+              </w:rPr>
+              <w:t xml:space="preserve">0 = hasta que la quite el límite, el dueño o su vida.</w:t>
+            </w:r>
+          </w:p>
+        </w:tc>
+      </w:tr>
+      <w:tr>
+        <w:tc>
+          <w:tcPr>
+            <w:tcW w:type="dxa" w:w="2600"/>
+            <w:tcMar>
+              <w:top w:type="dxa" w:w="60"/>
+              <w:left w:type="dxa" w:w="100"/>
+              <w:bottom w:type="dxa" w:w="60"/>
+              <w:right w:type="dxa" w:w="100"/>
+            </w:tcMar>
+          </w:tcPr>
+          <w:p>
+            <w:pPr>
+              <w:spacing w:after="0"/>
+            </w:pPr>
+            <w:r>
+              <w:rPr>
+                <w:sz w:val="20"/>
+                <w:szCs w:val="20"/>
+              </w:rPr>
+              <w:t xml:space="preserve">Máximo por dueño</w:t>
+            </w:r>
+          </w:p>
+        </w:tc>
+        <w:tc>
+          <w:tcPr>
+            <w:tcW w:type="dxa" w:w="6800"/>
+            <w:tcMar>
+              <w:top w:type="dxa" w:w="60"/>
+              <w:left w:type="dxa" w:w="100"/>
+              <w:bottom w:type="dxa" w:w="60"/>
+              <w:right w:type="dxa" w:w="100"/>
+            </w:tcMar>
+          </w:tcPr>
+          <w:p>
+            <w:pPr>
+              <w:spacing w:after="0"/>
+            </w:pPr>
+            <w:r>
+              <w:rPr>
+                <w:sz w:val="20"/>
+                <w:szCs w:val="20"/>
+              </w:rPr>
+              <w:t xml:space="preserve">Al pasarse, se va la más vieja. Quien la invoca puede pedir otro número (la rueda de trampas pide 6; </w:t>
+            </w:r>
+            <w:r>
+              <w:rPr>
+                <w:rFonts w:ascii="Consolas" w:cs="Consolas" w:eastAsia="Consolas" w:hAnsi="Consolas"/>
+                <w:sz w:val="18"/>
+                <w:szCs w:val="18"/>
+              </w:rPr>
+              <w:t xml:space="preserve">GA_SpawnSummon</w:t>
+            </w:r>
+            <w:r>
+              <w:rPr>
+                <w:sz w:val="20"/>
+                <w:szCs w:val="20"/>
+              </w:rPr>
+              <w:t xml:space="preserve"> tiene "Máximo a la vez"). 0 = sin límite.</w:t>
+            </w:r>
+          </w:p>
+        </w:tc>
+      </w:tr>
+      <w:tr>
+        <w:tc>
+          <w:tcPr>
+            <w:tcW w:type="dxa" w:w="2600"/>
+            <w:tcMar>
+              <w:top w:type="dxa" w:w="60"/>
+              <w:left w:type="dxa" w:w="100"/>
+              <w:bottom w:type="dxa" w:w="60"/>
+              <w:right w:type="dxa" w:w="100"/>
+            </w:tcMar>
+          </w:tcPr>
+          <w:p>
+            <w:pPr>
+              <w:spacing w:after="0"/>
+            </w:pPr>
+            <w:r>
+              <w:rPr>
+                <w:sz w:val="20"/>
+                <w:szCs w:val="20"/>
+              </w:rPr>
+              <w:t xml:space="preserve">Grupo del límite</w:t>
+            </w:r>
+          </w:p>
+        </w:tc>
+        <w:tc>
+          <w:tcPr>
+            <w:tcW w:type="dxa" w:w="6800"/>
+            <w:tcMar>
+              <w:top w:type="dxa" w:w="60"/>
+              <w:left w:type="dxa" w:w="100"/>
+              <w:bottom w:type="dxa" w:w="60"/>
+              <w:right w:type="dxa" w:w="100"/>
+            </w:tcMar>
+          </w:tcPr>
+          <w:p>
+            <w:pPr>
+              <w:spacing w:after="0"/>
+            </w:pPr>
+            <w:r>
+              <w:rPr>
+                <w:sz w:val="20"/>
+                <w:szCs w:val="20"/>
+              </w:rPr>
+              <w:t xml:space="preserve">Las que comparten el límite. Vacío = las de su tipo: con subclase, las de su clase (todos los tótems juntos); una genérica (sin subclase), solo las de su mismo prefab: el muro de fuego no comparte límite con el elemental.</w:t>
+            </w:r>
+          </w:p>
+        </w:tc>
+      </w:tr>
+      <w:tr>
+        <w:tc>
+          <w:tcPr>
+            <w:tcW w:type="dxa" w:w="2600"/>
+            <w:tcMar>
+              <w:top w:type="dxa" w:w="60"/>
+              <w:left w:type="dxa" w:w="100"/>
+              <w:bottom w:type="dxa" w:w="60"/>
+              <w:right w:type="dxa" w:w="100"/>
+            </w:tcMar>
+          </w:tcPr>
+          <w:p>
+            <w:pPr>
+              <w:spacing w:after="0"/>
+            </w:pPr>
+            <w:r>
+              <w:rPr>
+                <w:sz w:val="20"/>
+                <w:szCs w:val="20"/>
+              </w:rPr>
+              <w:t xml:space="preserve">Cuenta para el límite</w:t>
+            </w:r>
+          </w:p>
+        </w:tc>
+        <w:tc>
+          <w:tcPr>
+            <w:tcW w:type="dxa" w:w="6800"/>
+            <w:tcMar>
+              <w:top w:type="dxa" w:w="60"/>
+              <w:left w:type="dxa" w:w="100"/>
+              <w:bottom w:type="dxa" w:w="60"/>
+              <w:right w:type="dxa" w:w="100"/>
+            </w:tcMar>
+          </w:tcPr>
+          <w:p>
+            <w:pPr>
+              <w:spacing w:after="0"/>
+            </w:pPr>
+            <w:r>
+              <w:rPr>
+                <w:sz w:val="20"/>
+                <w:szCs w:val="20"/>
+              </w:rPr>
+              <w:t xml:space="preserve">Apagado = ni cuenta ni saca a ninguna: las bombas de la definitiva del Trampero, los tótems de la Furia elemental. También lo puede pedir quien la invoca.</w:t>
+            </w:r>
+          </w:p>
+        </w:tc>
+      </w:tr>
+      <w:tr>
+        <w:tc>
+          <w:tcPr>
+            <w:tcW w:type="dxa" w:w="2600"/>
+            <w:tcMar>
+              <w:top w:type="dxa" w:w="60"/>
+              <w:left w:type="dxa" w:w="100"/>
+              <w:bottom w:type="dxa" w:w="60"/>
+              <w:right w:type="dxa" w:w="100"/>
+            </w:tcMar>
+          </w:tcPr>
+          <w:p>
+            <w:pPr>
+              <w:spacing w:after="0"/>
+            </w:pPr>
+            <w:r>
+              <w:rPr>
+                <w:sz w:val="20"/>
+                <w:szCs w:val="20"/>
+              </w:rPr>
+              <w:t xml:space="preserve">Si el dueño muere</w:t>
+            </w:r>
+          </w:p>
+        </w:tc>
+        <w:tc>
+          <w:tcPr>
+            <w:tcW w:type="dxa" w:w="6800"/>
+            <w:tcMar>
+              <w:top w:type="dxa" w:w="60"/>
+              <w:left w:type="dxa" w:w="100"/>
+              <w:bottom w:type="dxa" w:w="60"/>
+              <w:right w:type="dxa" w:w="100"/>
+            </w:tcMar>
+          </w:tcPr>
+          <w:p>
+            <w:pPr>
+              <w:spacing w:after="0"/>
+            </w:pPr>
+            <w:r>
+              <w:rPr>
+                <w:sz w:val="20"/>
+                <w:szCs w:val="20"/>
+              </w:rPr>
+              <w:t xml:space="preserve">Se queda o desaparece. Si el dueño se va del juego o cambia de clase, desaparece siempre: no tiene a quién darle lo que haga.</w:t>
+            </w:r>
+          </w:p>
+        </w:tc>
+      </w:tr>
+      <w:tr>
+        <w:tc>
+          <w:tcPr>
+            <w:tcW w:type="dxa" w:w="2600"/>
+            <w:tcMar>
+              <w:top w:type="dxa" w:w="60"/>
+              <w:left w:type="dxa" w:w="100"/>
+              <w:bottom w:type="dxa" w:w="60"/>
+              <w:right w:type="dxa" w:w="100"/>
+            </w:tcMar>
+          </w:tcPr>
+          <w:p>
+            <w:pPr>
+              <w:spacing w:after="0"/>
+            </w:pPr>
+            <w:r>
+              <w:rPr>
+                <w:sz w:val="20"/>
+                <w:szCs w:val="20"/>
+              </w:rPr>
+              <w:t xml:space="preserve">La ven</w:t>
+            </w:r>
+          </w:p>
+        </w:tc>
+        <w:tc>
+          <w:tcPr>
+            <w:tcW w:type="dxa" w:w="6800"/>
+            <w:tcMar>
+              <w:top w:type="dxa" w:w="60"/>
+              <w:left w:type="dxa" w:w="100"/>
+              <w:bottom w:type="dxa" w:w="60"/>
+              <w:right w:type="dxa" w:w="100"/>
+            </w:tcMar>
+          </w:tcPr>
+          <w:p>
+            <w:pPr>
+              <w:spacing w:after="0"/>
+            </w:pPr>
+            <w:r>
+              <w:rPr>
+                <w:sz w:val="20"/>
+                <w:szCs w:val="20"/>
+              </w:rPr>
+              <w:t xml:space="preserve">Todos, o solo su equipo (invisible para los enemigos: las trampas). </w:t>
+            </w:r>
+            <w:r>
+              <w:rPr>
+                <w:rFonts w:ascii="Consolas" w:cs="Consolas" w:eastAsia="Consolas" w:hAnsi="Consolas"/>
+                <w:sz w:val="18"/>
+                <w:szCs w:val="18"/>
+              </w:rPr>
+              <w:t xml:space="preserve">SetRevealed</w:t>
+            </w:r>
+            <w:r>
+              <w:rPr>
+                <w:sz w:val="20"/>
+                <w:szCs w:val="20"/>
+              </w:rPr>
+              <w:t xml:space="preserve"> la muestra a todos (el aviso de la trampa) y </w:t>
+            </w:r>
+            <w:r>
+              <w:rPr>
+                <w:rFonts w:ascii="Consolas" w:cs="Consolas" w:eastAsia="Consolas" w:hAnsi="Consolas"/>
+                <w:sz w:val="18"/>
+                <w:szCs w:val="18"/>
+              </w:rPr>
+              <w:t xml:space="preserve">SetModelHidden</w:t>
+            </w:r>
+            <w:r>
+              <w:rPr>
+                <w:sz w:val="20"/>
+                <w:szCs w:val="20"/>
+              </w:rPr>
+              <w:t xml:space="preserve"> la esconde.</w:t>
+            </w:r>
+          </w:p>
+        </w:tc>
+      </w:tr>
+      <w:tr>
+        <w:tc>
+          <w:tcPr>
+            <w:tcW w:type="dxa" w:w="2600"/>
+            <w:tcMar>
+              <w:top w:type="dxa" w:w="60"/>
+              <w:left w:type="dxa" w:w="100"/>
+              <w:bottom w:type="dxa" w:w="60"/>
+              <w:right w:type="dxa" w:w="100"/>
+            </w:tcMar>
+          </w:tcPr>
+          <w:p>
+            <w:pPr>
+              <w:spacing w:after="0"/>
+            </w:pPr>
+            <w:r>
+              <w:rPr>
+                <w:sz w:val="20"/>
+                <w:szCs w:val="20"/>
+              </w:rPr>
+              <w:t xml:space="preserve">Modelo</w:t>
+            </w:r>
+          </w:p>
+        </w:tc>
+        <w:tc>
+          <w:tcPr>
+            <w:tcW w:type="dxa" w:w="6800"/>
+            <w:tcMar>
+              <w:top w:type="dxa" w:w="60"/>
+              <w:left w:type="dxa" w:w="100"/>
+              <w:bottom w:type="dxa" w:w="60"/>
+              <w:right w:type="dxa" w:w="100"/>
+            </w:tcMar>
+          </w:tcPr>
+          <w:p>
+            <w:pPr>
+              <w:spacing w:after="0"/>
+            </w:pPr>
+            <w:r>
+              <w:rPr>
+                <w:sz w:val="20"/>
+                <w:szCs w:val="20"/>
+              </w:rPr>
+              <w:t xml:space="preserve">Lo que se esconde. Vacío = todo lo que cuelga de la invocación.</w:t>
+            </w:r>
+          </w:p>
+        </w:tc>
+      </w:tr>
+      <w:tr>
+        <w:tc>
+          <w:tcPr>
+            <w:tcW w:type="dxa" w:w="2600"/>
+            <w:tcMar>
+              <w:top w:type="dxa" w:w="60"/>
+              <w:left w:type="dxa" w:w="100"/>
+              <w:bottom w:type="dxa" w:w="60"/>
+              <w:right w:type="dxa" w:w="100"/>
+            </w:tcMar>
+          </w:tcPr>
+          <w:p>
+            <w:pPr>
+              <w:spacing w:after="0"/>
+            </w:pPr>
+            <w:r>
+              <w:rPr>
+                <w:sz w:val="20"/>
+                <w:szCs w:val="20"/>
+              </w:rPr>
+              <w:t xml:space="preserve">Recibe zonas</w:t>
+            </w:r>
+          </w:p>
+        </w:tc>
+        <w:tc>
+          <w:tcPr>
+            <w:tcW w:type="dxa" w:w="6800"/>
+            <w:tcMar>
+              <w:top w:type="dxa" w:w="60"/>
+              <w:left w:type="dxa" w:w="100"/>
+              <w:bottom w:type="dxa" w:w="60"/>
+              <w:right w:type="dxa" w:w="100"/>
+            </w:tcMar>
+          </w:tcPr>
+          <w:p>
+            <w:pPr>
+              <w:spacing w:after="0"/>
+            </w:pPr>
+            <w:r>
+              <w:rPr>
+                <w:sz w:val="20"/>
+                <w:szCs w:val="20"/>
+              </w:rPr>
+              <w:t xml:space="preserve">Si las zonas de otras invocaciones la alcanzan. Apagado en los tótems: no se dan el aura entre ellos.</w:t>
+            </w:r>
+          </w:p>
+        </w:tc>
+      </w:tr>
+    </w:tbl>
+    <w:p>
+      <w:pPr>
+        <w:pStyle w:val="Heading2"/>
+        <w:spacing w:after="120" w:before="280"/>
+      </w:pPr>
+      <w:r>
+        <w:rPr>
+          <w:b/>
+          <w:bCs/>
+          <w:color w:val="2E74B5"/>
+          <w:sz w:val="26"/>
+          <w:szCs w:val="26"/>
+        </w:rPr>
+        <w:t xml:space="preserve">8.4 La zona (Summon_Zone)</w:t>
+      </w:r>
+    </w:p>
+    <w:p>
+      <w:pPr>
+        <w:spacing w:after="120" w:line="276"/>
+      </w:pPr>
+      <w:r>
+        <w:t xml:space="preserve">Va al lado de un </w:t>
+      </w:r>
+      <w:r>
+        <w:rPr>
+          <w:rFonts w:ascii="Consolas" w:cs="Consolas" w:eastAsia="Consolas" w:hAnsi="Consolas"/>
+          <w:sz w:val="20"/>
+          <w:szCs w:val="20"/>
+        </w:rPr>
+        <w:t xml:space="preserve">Entity_Summon</w:t>
+      </w:r>
+      <w:r>
+        <w:t xml:space="preserve"> en el mismo prefab, una por invocación. Aplica sus efectos solo en el servidor.</w:t>
+      </w:r>
+    </w:p>
+    <w:p>
+      <w:pPr>
+        <w:pStyle w:val="ListParagraph"/>
+        <w:numPr>
+          <w:ilvl w:val="0"/>
+          <w:numId w:val="2"/>
+        </w:numPr>
+        <w:spacing w:after="60"/>
+      </w:pPr>
+      <w:r>
+        <w:rPr>
+          <w:b/>
+          <w:bCs/>
+        </w:rPr>
+        <w:t xml:space="preserve">Radio y cada cuánto.</w:t>
+      </w:r>
+      <w:r>
+        <w:t xml:space="preserve"> A los que estén dentro, cada "Cada cuánto" segundos.</w:t>
+      </w:r>
+    </w:p>
+    <w:p>
+      <w:pPr>
+        <w:pStyle w:val="ListParagraph"/>
+        <w:numPr>
+          <w:ilvl w:val="0"/>
+          <w:numId w:val="2"/>
+        </w:numPr>
+        <w:spacing w:after="60"/>
+      </w:pPr>
+      <w:r>
+        <w:rPr>
+          <w:b/>
+          <w:bCs/>
+        </w:rPr>
+        <w:t xml:space="preserve">A quién.</w:t>
+      </w:r>
+      <w:r>
+        <w:t xml:space="preserve"> Aliados (y el dueño) o enemigos; "Solo jugadores" deja afuera a los NPCs.</w:t>
+      </w:r>
+    </w:p>
+    <w:p>
+      <w:pPr>
+        <w:pStyle w:val="ListParagraph"/>
+        <w:numPr>
+          <w:ilvl w:val="0"/>
+          <w:numId w:val="2"/>
+        </w:numPr>
+        <w:spacing w:after="60"/>
+      </w:pPr>
+      <w:r>
+        <w:rPr>
+          <w:b/>
+          <w:bCs/>
+        </w:rPr>
+        <w:t xml:space="preserve">Autor de los efectos.</w:t>
+      </w:r>
+      <w:r>
+        <w:t xml:space="preserve"> El DUEÑO: escalan con sus stats y la baja es suya (lo normal para el daño). La INVOCACIÓN: necesita su propio ASC; sirve para que un empuje salga desde ella.</w:t>
+      </w:r>
+    </w:p>
+    <w:p>
+      <w:pPr>
+        <w:pStyle w:val="ListParagraph"/>
+        <w:numPr>
+          <w:ilvl w:val="0"/>
+          <w:numId w:val="2"/>
+        </w:numPr>
+        <w:spacing w:after="60"/>
+      </w:pPr>
+      <w:r>
+        <w:rPr>
+          <w:b/>
+          <w:bCs/>
+        </w:rPr>
+        <w:t xml:space="preserve">Potenciada.</w:t>
+      </w:r>
+      <w:r>
+        <w:t xml:space="preserve"> Otros efectos si el dueño tiene un tag: el aura del tótem con el Frenesí del Chamán.</w:t>
+      </w:r>
+    </w:p>
+    <w:p>
+      <w:pPr>
+        <w:pStyle w:val="ListParagraph"/>
+        <w:numPr>
+          <w:ilvl w:val="0"/>
+          <w:numId w:val="2"/>
+        </w:numPr>
+        <w:spacing w:after="60"/>
+      </w:pPr>
+      <w:r>
+        <w:rPr>
+          <w:b/>
+          <w:bCs/>
+        </w:rPr>
+        <w:t xml:space="preserve">Cuándo.</w:t>
+      </w:r>
+      <w:r>
+        <w:t xml:space="preserve"> "Empieza prendida", o la prende la invocación con </w:t>
+      </w:r>
+      <w:r>
+        <w:rPr>
+          <w:rFonts w:ascii="Consolas" w:cs="Consolas" w:eastAsia="Consolas" w:hAnsi="Consolas"/>
+          <w:sz w:val="20"/>
+          <w:szCs w:val="20"/>
+        </w:rPr>
+        <w:t xml:space="preserve">Begin()</w:t>
+      </w:r>
+      <w:r>
+        <w:t xml:space="preserve"> (la trampa de espinas, al explotar). Dura lo que la invocación o sus propios segundos; al terminar llama a </w:t>
+      </w:r>
+      <w:r>
+        <w:rPr>
+          <w:rFonts w:ascii="Consolas" w:cs="Consolas" w:eastAsia="Consolas" w:hAnsi="Consolas"/>
+          <w:sz w:val="20"/>
+          <w:szCs w:val="20"/>
+        </w:rPr>
+        <w:t xml:space="preserve">OnZoneEnded()</w:t>
+      </w:r>
+      <w:r>
+        <w:t xml:space="preserve">.</w:t>
+      </w:r>
+    </w:p>
+    <w:p>
+      <w:pPr>
+        <w:pStyle w:val="ListParagraph"/>
+        <w:numPr>
+          <w:ilvl w:val="0"/>
+          <w:numId w:val="2"/>
+        </w:numPr>
+        <w:spacing w:after="60"/>
+      </w:pPr>
+      <w:r>
+        <w:rPr>
+          <w:b/>
+          <w:bCs/>
+        </w:rPr>
+        <w:t xml:space="preserve">El VFX.</w:t>
+      </w:r>
+      <w:r>
+        <w:t xml:space="preserve"> Se ve en todas las pantallas mientras está prendida, del tamaño del radio (con </w:t>
+      </w:r>
+      <w:r>
+        <w:rPr>
+          <w:rFonts w:ascii="Consolas" w:cs="Consolas" w:eastAsia="Consolas" w:hAnsi="Consolas"/>
+          <w:sz w:val="20"/>
+          <w:szCs w:val="20"/>
+        </w:rPr>
+        <w:t xml:space="preserve">VFX_AreaVisual</w:t>
+      </w:r>
+      <w:r>
+        <w:t xml:space="preserve"> calza exacto): el "prendida" viaja en un SyncVar de la invocación.</w:t>
+      </w:r>
+    </w:p>
+    <w:p>
+      <w:pPr>
+        <w:pStyle w:val="Heading2"/>
+        <w:spacing w:after="120" w:before="280"/>
+      </w:pPr>
+      <w:r>
+        <w:rPr>
+          <w:b/>
+          <w:bCs/>
+          <w:color w:val="2E74B5"/>
+          <w:sz w:val="26"/>
+          <w:szCs w:val="26"/>
+        </w:rPr>
+        <w:t xml:space="preserve">8.5 Qué hay en cada pantalla</w:t>
+      </w:r>
+    </w:p>
+    <w:p>
+      <w:pPr>
+        <w:pStyle w:val="ListParagraph"/>
+        <w:numPr>
+          <w:ilvl w:val="0"/>
+          <w:numId w:val="2"/>
+        </w:numPr>
+        <w:spacing w:after="60"/>
+      </w:pPr>
+      <w:r>
+        <w:rPr>
+          <w:b/>
+          <w:bCs/>
+        </w:rPr>
+        <w:t xml:space="preserve">Solo en el servidor:</w:t>
+      </w:r>
+      <w:r>
+        <w:t xml:space="preserve"> los efectos, el límite (una lista por dueño y grupo), el reloj y las muertes.</w:t>
+      </w:r>
+    </w:p>
+    <w:p>
+      <w:pPr>
+        <w:pStyle w:val="ListParagraph"/>
+        <w:numPr>
+          <w:ilvl w:val="0"/>
+          <w:numId w:val="2"/>
+        </w:numPr>
+        <w:spacing w:after="60"/>
+      </w:pPr>
+      <w:r>
+        <w:rPr>
+          <w:b/>
+          <w:bCs/>
+        </w:rPr>
+        <w:t xml:space="preserve">En todas (SyncVars de la invocación):</w:t>
+      </w:r>
+      <w:r>
+        <w:t xml:space="preserve"> el equipo, si está revelada, si su zona está prendida y el dueño como </w:t>
+      </w:r>
+      <w:r>
+        <w:rPr>
+          <w:rFonts w:ascii="Consolas" w:cs="Consolas" w:eastAsia="Consolas" w:hAnsi="Consolas"/>
+          <w:sz w:val="20"/>
+          <w:szCs w:val="20"/>
+        </w:rPr>
+        <w:t xml:space="preserve">SummonerObject</w:t>
+      </w:r>
+      <w:r>
+        <w:t xml:space="preserve"> (su NetworkObject: el HUD del Explorador encuentra así a su compañero).</w:t>
+      </w:r>
+    </w:p>
+    <w:p>
+      <w:pPr>
+        <w:pStyle w:val="ListParagraph"/>
+        <w:numPr>
+          <w:ilvl w:val="0"/>
+          <w:numId w:val="2"/>
+        </w:numPr>
+        <w:spacing w:after="60"/>
+      </w:pPr>
+      <w:r>
+        <w:rPr>
+          <w:b/>
+          <w:bCs/>
+        </w:rPr>
+        <w:t xml:space="preserve">Ojo con el nombre del dueño.</w:t>
+      </w:r>
+      <w:r>
+        <w:t xml:space="preserve"> </w:t>
+      </w:r>
+      <w:r>
+        <w:rPr>
+          <w:rFonts w:ascii="Consolas" w:cs="Consolas" w:eastAsia="Consolas" w:hAnsi="Consolas"/>
+          <w:sz w:val="20"/>
+          <w:szCs w:val="20"/>
+        </w:rPr>
+        <w:t xml:space="preserve">Summoner</w:t>
+      </w:r>
+      <w:r>
+        <w:t xml:space="preserve"> es el ASC del dueño y existe solo en el servidor. Nunca se llama </w:t>
+      </w:r>
+      <w:r>
+        <w:rPr>
+          <w:rFonts w:ascii="Consolas" w:cs="Consolas" w:eastAsia="Consolas" w:hAnsi="Consolas"/>
+          <w:sz w:val="20"/>
+          <w:szCs w:val="20"/>
+        </w:rPr>
+        <w:t xml:space="preserve">Owner</w:t>
+      </w:r>
+      <w:r>
+        <w:t xml:space="preserve">: en un NetworkBehaviour ese nombre ya es de FishNet (la conexión dueña del objeto) y taparlo da el aviso CS0108.</w:t>
+      </w:r>
+    </w:p>
+    <w:p>
+      <w:pPr>
+        <w:pStyle w:val="ListParagraph"/>
+        <w:numPr>
+          <w:ilvl w:val="0"/>
+          <w:numId w:val="2"/>
+        </w:numPr>
+        <w:spacing w:after="60"/>
+      </w:pPr>
+      <w:r>
+        <w:rPr>
+          <w:b/>
+          <w:bCs/>
+        </w:rPr>
+        <w:t xml:space="preserve">Enemigo o aliado.</w:t>
+      </w:r>
+      <w:r>
+        <w:t xml:space="preserve"> </w:t>
+      </w:r>
+      <w:r>
+        <w:rPr>
+          <w:rFonts w:ascii="Consolas" w:cs="Consolas" w:eastAsia="Consolas" w:hAnsi="Consolas"/>
+          <w:sz w:val="20"/>
+          <w:szCs w:val="20"/>
+        </w:rPr>
+        <w:t xml:space="preserve">IsEnemy</w:t>
+      </w:r>
+      <w:r>
+        <w:t xml:space="preserve"> / </w:t>
+      </w:r>
+      <w:r>
+        <w:rPr>
+          <w:rFonts w:ascii="Consolas" w:cs="Consolas" w:eastAsia="Consolas" w:hAnsi="Consolas"/>
+          <w:sz w:val="20"/>
+          <w:szCs w:val="20"/>
+        </w:rPr>
+        <w:t xml:space="preserve">IsAlly</w:t>
+      </w:r>
+      <w:r>
+        <w:t xml:space="preserve"> usan la misma regla que el ASC: por equipo, y los NPCs (equipo 4) son hostiles para todos.</w:t>
+      </w:r>
+    </w:p>
+    <w:p>
+      <w:pPr>
+        <w:pStyle w:val="Heading2"/>
+        <w:spacing w:after="120" w:before="280"/>
+      </w:pPr>
+      <w:r>
+        <w:rPr>
+          <w:b/>
+          <w:bCs/>
+          <w:color w:val="2E74B5"/>
+          <w:sz w:val="26"/>
+          <w:szCs w:val="26"/>
+        </w:rPr>
+        <w:t xml:space="preserve">8.6 Las que existen hoy</w:t>
+      </w:r>
+    </w:p>
+    <w:tbl>
+      <w:tblPr>
+        <w:tblW w:type="dxa" w:w="9400"/>
+        <w:tblBorders>
+          <w:top w:val="single" w:color="auto" w:sz="4"/>
+          <w:left w:val="single" w:color="auto" w:sz="4"/>
+          <w:bottom w:val="single" w:color="auto" w:sz="4"/>
+          <w:right w:val="single" w:color="auto" w:sz="4"/>
+          <w:insideH w:val="single" w:color="auto" w:sz="4"/>
+          <w:insideV w:val="single" w:color="auto" w:sz="4"/>
+        </w:tblBorders>
+      </w:tblPr>
+      <w:tblGrid>
+        <w:gridCol w:w="2600"/>
+        <w:gridCol w:w="6800"/>
+      </w:tblGrid>
+      <w:tr>
+        <w:trPr>
+          <w:tblHeader/>
+        </w:trPr>
+        <w:tc>
+          <w:tcPr>
+            <w:tcW w:type="dxa" w:w="2600"/>
+            <w:shd w:fill="DCE6F1" w:val="clear"/>
+            <w:tcMar>
+              <w:top w:type="dxa" w:w="60"/>
+              <w:left w:type="dxa" w:w="100"/>
+              <w:bottom w:type="dxa" w:w="60"/>
+              <w:right w:type="dxa" w:w="100"/>
+            </w:tcMar>
+          </w:tcPr>
+          <w:p>
+            <w:pPr>
+              <w:spacing w:after="0"/>
+            </w:pPr>
+            <w:r>
+              <w:rPr>
+                <w:b/>
+                <w:bCs/>
+                <w:sz w:val="20"/>
+                <w:szCs w:val="20"/>
+              </w:rPr>
+              <w:t xml:space="preserve">Invocación</w:t>
+            </w:r>
+          </w:p>
+        </w:tc>
+        <w:tc>
+          <w:tcPr>
+            <w:tcW w:type="dxa" w:w="6800"/>
+            <w:shd w:fill="DCE6F1" w:val="clear"/>
+            <w:tcMar>
+              <w:top w:type="dxa" w:w="60"/>
+              <w:left w:type="dxa" w:w="100"/>
+              <w:bottom w:type="dxa" w:w="60"/>
+              <w:right w:type="dxa" w:w="100"/>
+            </w:tcMar>
+          </w:tcPr>
+          <w:p>
+            <w:pPr>
+              <w:spacing w:after="0"/>
+            </w:pPr>
+            <w:r>
+              <w:rPr>
+                <w:b/>
+                <w:bCs/>
+                <w:sz w:val="20"/>
+                <w:szCs w:val="20"/>
+              </w:rPr>
+              <w:t xml:space="preserve">Lo suyo</w:t>
+            </w:r>
+          </w:p>
+        </w:tc>
+      </w:tr>
+      <w:tr>
+        <w:tc>
+          <w:tcPr>
+            <w:tcW w:type="dxa" w:w="2600"/>
+            <w:tcMar>
+              <w:top w:type="dxa" w:w="60"/>
+              <w:left w:type="dxa" w:w="100"/>
+              <w:bottom w:type="dxa" w:w="60"/>
+              <w:right w:type="dxa" w:w="100"/>
+            </w:tcMar>
+          </w:tcPr>
+          <w:p>
+            <w:pPr>
+              <w:spacing w:after="0"/>
+            </w:pPr>
+            <w:r>
+              <w:rPr>
+                <w:rFonts w:ascii="Consolas" w:cs="Consolas" w:eastAsia="Consolas" w:hAnsi="Consolas"/>
+                <w:sz w:val="18"/>
+                <w:szCs w:val="18"/>
+              </w:rPr>
+              <w:t xml:space="preserve">Entity_Totem</w:t>
+            </w:r>
+          </w:p>
+        </w:tc>
+        <w:tc>
+          <w:tcPr>
+            <w:tcW w:type="dxa" w:w="6800"/>
+            <w:tcMar>
+              <w:top w:type="dxa" w:w="60"/>
+              <w:left w:type="dxa" w:w="100"/>
+              <w:bottom w:type="dxa" w:w="60"/>
+              <w:right w:type="dxa" w:w="100"/>
+            </w:tcMar>
+          </w:tcPr>
+          <w:p>
+            <w:pPr>
+              <w:spacing w:after="0"/>
+            </w:pPr>
+            <w:r>
+              <w:rPr>
+                <w:sz w:val="20"/>
+                <w:szCs w:val="20"/>
+              </w:rPr>
+              <w:t xml:space="preserve">Nada de código propio: su aura es su zona (potenciada con el Frenesí). Máximo 2 ("Máximo a la vez" de </w:t>
+            </w:r>
+            <w:r>
+              <w:rPr>
+                <w:rFonts w:ascii="Consolas" w:cs="Consolas" w:eastAsia="Consolas" w:hAnsi="Consolas"/>
+                <w:sz w:val="18"/>
+                <w:szCs w:val="18"/>
+              </w:rPr>
+              <w:t xml:space="preserve">GA_SpawnTotem</w:t>
+            </w:r>
+            <w:r>
+              <w:rPr>
+                <w:sz w:val="20"/>
+                <w:szCs w:val="20"/>
+              </w:rPr>
+              <w:t xml:space="preserve">); desaparece si muere el Chamán; no recibe zonas.</w:t>
+            </w:r>
+          </w:p>
+        </w:tc>
+      </w:tr>
+      <w:tr>
+        <w:tc>
+          <w:tcPr>
+            <w:tcW w:type="dxa" w:w="2600"/>
+            <w:tcMar>
+              <w:top w:type="dxa" w:w="60"/>
+              <w:left w:type="dxa" w:w="100"/>
+              <w:bottom w:type="dxa" w:w="60"/>
+              <w:right w:type="dxa" w:w="100"/>
+            </w:tcMar>
+          </w:tcPr>
+          <w:p>
+            <w:pPr>
+              <w:spacing w:after="0"/>
+            </w:pPr>
+            <w:r>
+              <w:rPr>
+                <w:rFonts w:ascii="Consolas" w:cs="Consolas" w:eastAsia="Consolas" w:hAnsi="Consolas"/>
+                <w:sz w:val="18"/>
+                <w:szCs w:val="18"/>
+              </w:rPr>
+              <w:t xml:space="preserve">Entity_Trap</w:t>
+            </w:r>
+          </w:p>
+        </w:tc>
+        <w:tc>
+          <w:tcPr>
+            <w:tcW w:type="dxa" w:w="6800"/>
+            <w:tcMar>
+              <w:top w:type="dxa" w:w="60"/>
+              <w:left w:type="dxa" w:w="100"/>
+              <w:bottom w:type="dxa" w:w="60"/>
+              <w:right w:type="dxa" w:w="100"/>
+            </w:tcMar>
+          </w:tcPr>
+          <w:p>
+            <w:pPr>
+              <w:spacing w:after="0"/>
+            </w:pPr>
+            <w:r>
+              <w:rPr>
+                <w:sz w:val="20"/>
+                <w:szCs w:val="20"/>
+              </w:rPr>
+              <w:t xml:space="preserve">Armarse (1.5 s), saltar solo con jugadores, el aviso y explotar; la zona de espinas se prende al explotar. Solo la ve su equipo; máximo 6; las bombas de la definitiva no cuentan y explotan al vencerse. Las 4 trampas son variantes de </w:t>
+            </w:r>
+            <w:r>
+              <w:rPr>
+                <w:rFonts w:ascii="Consolas" w:cs="Consolas" w:eastAsia="Consolas" w:hAnsi="Consolas"/>
+                <w:sz w:val="18"/>
+                <w:szCs w:val="18"/>
+              </w:rPr>
+              <w:t xml:space="preserve">Prefabs/Summons/Trap_Base</w:t>
+            </w:r>
+            <w:r>
+              <w:rPr>
+                <w:sz w:val="20"/>
+                <w:szCs w:val="20"/>
+              </w:rPr>
+              <w:t xml:space="preserve">.</w:t>
+            </w:r>
+          </w:p>
+        </w:tc>
+      </w:tr>
+      <w:tr>
+        <w:tc>
+          <w:tcPr>
+            <w:tcW w:type="dxa" w:w="2600"/>
+            <w:tcMar>
+              <w:top w:type="dxa" w:w="60"/>
+              <w:left w:type="dxa" w:w="100"/>
+              <w:bottom w:type="dxa" w:w="60"/>
+              <w:right w:type="dxa" w:w="100"/>
+            </w:tcMar>
+          </w:tcPr>
+          <w:p>
+            <w:pPr>
+              <w:spacing w:after="0"/>
+            </w:pPr>
+            <w:r>
+              <w:rPr>
+                <w:rFonts w:ascii="Consolas" w:cs="Consolas" w:eastAsia="Consolas" w:hAnsi="Consolas"/>
+                <w:sz w:val="18"/>
+                <w:szCs w:val="18"/>
+              </w:rPr>
+              <w:t xml:space="preserve">Entity_IllusoryBlade</w:t>
+            </w:r>
+          </w:p>
+        </w:tc>
+        <w:tc>
+          <w:tcPr>
+            <w:tcW w:type="dxa" w:w="6800"/>
+            <w:tcMar>
+              <w:top w:type="dxa" w:w="60"/>
+              <w:left w:type="dxa" w:w="100"/>
+              <w:bottom w:type="dxa" w:w="60"/>
+              <w:right w:type="dxa" w:w="100"/>
+            </w:tcMar>
+          </w:tcPr>
+          <w:p>
+            <w:pPr>
+              <w:spacing w:after="0"/>
+            </w:pPr>
+            <w:r>
+              <w:rPr>
+                <w:rFonts w:ascii="Consolas" w:cs="Consolas" w:eastAsia="Consolas" w:hAnsi="Consolas"/>
+                <w:sz w:val="18"/>
+                <w:szCs w:val="18"/>
+              </w:rPr>
+              <w:t xml:space="preserve">Launch(objetivo, herida)</w:t>
+            </w:r>
+            <w:r>
+              <w:rPr>
+                <w:sz w:val="20"/>
+                <w:szCs w:val="20"/>
+              </w:rPr>
+              <w:t xml:space="preserve">: sube, viaja hacia el enemigo y le deja una herida; se corta en las paredes.</w:t>
+            </w:r>
+          </w:p>
+        </w:tc>
+      </w:tr>
+      <w:tr>
+        <w:tc>
+          <w:tcPr>
+            <w:tcW w:type="dxa" w:w="2600"/>
+            <w:tcMar>
+              <w:top w:type="dxa" w:w="60"/>
+              <w:left w:type="dxa" w:w="100"/>
+              <w:bottom w:type="dxa" w:w="60"/>
+              <w:right w:type="dxa" w:w="100"/>
+            </w:tcMar>
+          </w:tcPr>
+          <w:p>
+            <w:pPr>
+              <w:spacing w:after="0"/>
+            </w:pPr>
+            <w:r>
+              <w:rPr>
+                <w:rFonts w:ascii="Consolas" w:cs="Consolas" w:eastAsia="Consolas" w:hAnsi="Consolas"/>
+                <w:sz w:val="18"/>
+                <w:szCs w:val="18"/>
+              </w:rPr>
+              <w:t xml:space="preserve">Entity_PlayerCopy</w:t>
+            </w:r>
+          </w:p>
+        </w:tc>
+        <w:tc>
+          <w:tcPr>
+            <w:tcW w:type="dxa" w:w="6800"/>
+            <w:tcMar>
+              <w:top w:type="dxa" w:w="60"/>
+              <w:left w:type="dxa" w:w="100"/>
+              <w:bottom w:type="dxa" w:w="60"/>
+              <w:right w:type="dxa" w:w="100"/>
+            </w:tcMar>
+          </w:tcPr>
+          <w:p>
+            <w:pPr>
+              <w:spacing w:after="0"/>
+            </w:pPr>
+            <w:r>
+              <w:rPr>
+                <w:rFonts w:ascii="Consolas" w:cs="Consolas" w:eastAsia="Consolas" w:hAnsi="Consolas"/>
+                <w:sz w:val="18"/>
+                <w:szCs w:val="18"/>
+              </w:rPr>
+              <w:t xml:space="preserve">Begin(...)</w:t>
+            </w:r>
+            <w:r>
+              <w:rPr>
+                <w:sz w:val="20"/>
+                <w:szCs w:val="20"/>
+              </w:rPr>
+              <w:t xml:space="preserve">: camina siguiendo el piso, muestra la barra del jugador copiado (</w:t>
+            </w:r>
+            <w:r>
+              <w:rPr>
+                <w:rFonts w:ascii="Consolas" w:cs="Consolas" w:eastAsia="Consolas" w:hAnsi="Consolas"/>
+                <w:sz w:val="18"/>
+                <w:szCs w:val="18"/>
+              </w:rPr>
+              <w:t xml:space="preserve">UI_WorldHealthbar.Mirror</w:t>
+            </w:r>
+            <w:r>
+              <w:rPr>
+                <w:sz w:val="20"/>
+                <w:szCs w:val="20"/>
+              </w:rPr>
+              <w:t xml:space="preserve">) y explota al golpearla. Máximo 4 (las de la Fiesta no cuentan); se va si muere el Ilusionista.</w:t>
+            </w:r>
+          </w:p>
+        </w:tc>
+      </w:tr>
+      <w:tr>
+        <w:tc>
+          <w:tcPr>
+            <w:tcW w:type="dxa" w:w="2600"/>
+            <w:tcMar>
+              <w:top w:type="dxa" w:w="60"/>
+              <w:left w:type="dxa" w:w="100"/>
+              <w:bottom w:type="dxa" w:w="60"/>
+              <w:right w:type="dxa" w:w="100"/>
+            </w:tcMar>
+          </w:tcPr>
+          <w:p>
+            <w:pPr>
+              <w:spacing w:after="0"/>
+            </w:pPr>
+            <w:r>
+              <w:rPr>
+                <w:rFonts w:ascii="Consolas" w:cs="Consolas" w:eastAsia="Consolas" w:hAnsi="Consolas"/>
+                <w:sz w:val="18"/>
+                <w:szCs w:val="18"/>
+              </w:rPr>
+              <w:t xml:space="preserve">Entity_Companion</w:t>
+            </w:r>
+          </w:p>
+        </w:tc>
+        <w:tc>
+          <w:tcPr>
+            <w:tcW w:type="dxa" w:w="6800"/>
+            <w:tcMar>
+              <w:top w:type="dxa" w:w="60"/>
+              <w:left w:type="dxa" w:w="100"/>
+              <w:bottom w:type="dxa" w:w="60"/>
+              <w:right w:type="dxa" w:w="100"/>
+            </w:tcMar>
+          </w:tcPr>
+          <w:p>
+            <w:pPr>
+              <w:spacing w:after="0"/>
+            </w:pPr>
+            <w:r>
+              <w:rPr>
+                <w:sz w:val="20"/>
+                <w:szCs w:val="20"/>
+              </w:rPr>
+              <w:t xml:space="preserve">La IA en el servidor; las órdenes, cuál está afuera y la espera para volver los lleva el </w:t>
+            </w:r>
+            <w:r>
+              <w:rPr>
+                <w:rFonts w:ascii="Consolas" w:cs="Consolas" w:eastAsia="Consolas" w:hAnsi="Consolas"/>
+                <w:sz w:val="18"/>
+                <w:szCs w:val="18"/>
+              </w:rPr>
+              <w:t xml:space="preserve">CompanionManager</w:t>
+            </w:r>
+            <w:r>
+              <w:rPr>
+                <w:sz w:val="20"/>
+                <w:szCs w:val="20"/>
+              </w:rPr>
+              <w:t xml:space="preserve">. Cambia </w:t>
+            </w:r>
+            <w:r>
+              <w:rPr>
+                <w:rFonts w:ascii="Consolas" w:cs="Consolas" w:eastAsia="Consolas" w:hAnsi="Consolas"/>
+                <w:sz w:val="18"/>
+                <w:szCs w:val="18"/>
+              </w:rPr>
+              <w:t xml:space="preserve">OnOwnDeath</w:t>
+            </w:r>
+            <w:r>
+              <w:rPr>
+                <w:sz w:val="20"/>
+                <w:szCs w:val="20"/>
+              </w:rPr>
+              <w:t xml:space="preserve">: no se va sola, el manager anota su vida para cuando vuelva.</w:t>
+            </w:r>
+          </w:p>
+        </w:tc>
+      </w:tr>
+    </w:tbl>
+    <w:p>
+      <w:pPr>
+        <w:pStyle w:val="Heading2"/>
+        <w:spacing w:after="120" w:before="280"/>
+      </w:pPr>
+      <w:r>
+        <w:rPr>
+          <w:b/>
+          <w:bCs/>
+          <w:color w:val="2E74B5"/>
+          <w:sz w:val="26"/>
+          <w:szCs w:val="26"/>
+        </w:rPr>
+        <w:t xml:space="preserve">8.7 Hacer una nueva</w:t>
+      </w:r>
+    </w:p>
+    <w:p>
+      <w:pPr>
+        <w:pStyle w:val="ListParagraph"/>
+        <w:numPr>
+          <w:ilvl w:val="0"/>
+          <w:numId w:val="2"/>
+        </w:numPr>
+        <w:spacing w:after="60"/>
+      </w:pPr>
+      <w:r>
+        <w:rPr>
+          <w:b/>
+          <w:bCs/>
+        </w:rPr>
+        <w:t xml:space="preserve">Sin código</w:t>
+      </w:r>
+      <w:r>
+        <w:t xml:space="preserve"> (solo tiene que estar ahí y aplicar algo): una variante de una plantilla de </w:t>
+      </w:r>
+      <w:r>
+        <w:rPr>
+          <w:rFonts w:ascii="Consolas" w:cs="Consolas" w:eastAsia="Consolas" w:hAnsi="Consolas"/>
+          <w:sz w:val="20"/>
+          <w:szCs w:val="20"/>
+        </w:rPr>
+        <w:t xml:space="preserve">Prefabs/Summons</w:t>
+      </w:r>
+      <w:r>
+        <w:t xml:space="preserve"> —</w:t>
+      </w:r>
+      <w:r>
+        <w:rPr>
+          <w:rFonts w:ascii="Consolas" w:cs="Consolas" w:eastAsia="Consolas" w:hAnsi="Consolas"/>
+          <w:sz w:val="20"/>
+          <w:szCs w:val="20"/>
+        </w:rPr>
+        <w:t xml:space="preserve">Summon_Base</w:t>
+      </w:r>
+      <w:r>
+        <w:t xml:space="preserve"> (con vida: ASC con </w:t>
+      </w:r>
+      <w:r>
+        <w:rPr>
+          <w:rFonts w:ascii="Consolas" w:cs="Consolas" w:eastAsia="Consolas" w:hAnsi="Consolas"/>
+          <w:sz w:val="20"/>
+          <w:szCs w:val="20"/>
+        </w:rPr>
+        <w:t xml:space="preserve">ASDef_SummonBase</w:t>
+      </w:r>
+      <w:r>
+        <w:t xml:space="preserve"> de 100, barra, collider trigger en la capa 7 y una cápsula de muestra) o </w:t>
+      </w:r>
+      <w:r>
+        <w:rPr>
+          <w:rFonts w:ascii="Consolas" w:cs="Consolas" w:eastAsia="Consolas" w:hAnsi="Consolas"/>
+          <w:sz w:val="20"/>
+          <w:szCs w:val="20"/>
+        </w:rPr>
+        <w:t xml:space="preserve">SummonZone_Base</w:t>
+      </w:r>
+      <w:r>
+        <w:t xml:space="preserve"> (solo zona: 6 s, 4 m, a enemigos)— y un </w:t>
+      </w:r>
+      <w:r>
+        <w:rPr>
+          <w:rFonts w:ascii="Consolas" w:cs="Consolas" w:eastAsia="Consolas" w:hAnsi="Consolas"/>
+          <w:sz w:val="20"/>
+          <w:szCs w:val="20"/>
+        </w:rPr>
+        <w:t xml:space="preserve">GA_SpawnSummon</w:t>
+      </w:r>
+      <w:r>
+        <w:t xml:space="preserve"> que la ponga (donde apunta con marcador, a los pies o delante; "Máximo a la vez"). Los pasos: guía de habilidades, 7.1.</w:t>
+      </w:r>
+    </w:p>
+    <w:p>
+      <w:pPr>
+        <w:pStyle w:val="ListParagraph"/>
+        <w:numPr>
+          <w:ilvl w:val="0"/>
+          <w:numId w:val="2"/>
+        </w:numPr>
+        <w:spacing w:after="60"/>
+      </w:pPr>
+      <w:r>
+        <w:rPr>
+          <w:b/>
+          <w:bCs/>
+        </w:rPr>
+        <w:t xml:space="preserve">Con código:</w:t>
+      </w:r>
+      <w:r>
+        <w:t xml:space="preserve"> una subclase que sobreescriba </w:t>
+      </w:r>
+      <w:r>
+        <w:rPr>
+          <w:rFonts w:ascii="Consolas" w:cs="Consolas" w:eastAsia="Consolas" w:hAnsi="Consolas"/>
+          <w:sz w:val="20"/>
+          <w:szCs w:val="20"/>
+        </w:rPr>
+        <w:t xml:space="preserve">OnSummoned</w:t>
+      </w:r>
+      <w:r>
+        <w:t xml:space="preserve">, </w:t>
+      </w:r>
+      <w:r>
+        <w:rPr>
+          <w:rFonts w:ascii="Consolas" w:cs="Consolas" w:eastAsia="Consolas" w:hAnsi="Consolas"/>
+          <w:sz w:val="20"/>
+          <w:szCs w:val="20"/>
+        </w:rPr>
+        <w:t xml:space="preserve">OnExpired</w:t>
+      </w:r>
+      <w:r>
+        <w:t xml:space="preserve">, </w:t>
+      </w:r>
+      <w:r>
+        <w:rPr>
+          <w:rFonts w:ascii="Consolas" w:cs="Consolas" w:eastAsia="Consolas" w:hAnsi="Consolas"/>
+          <w:sz w:val="20"/>
+          <w:szCs w:val="20"/>
+        </w:rPr>
+        <w:t xml:space="preserve">OnOwnerGone</w:t>
+      </w:r>
+      <w:r>
+        <w:t xml:space="preserve">, </w:t>
+      </w:r>
+      <w:r>
+        <w:rPr>
+          <w:rFonts w:ascii="Consolas" w:cs="Consolas" w:eastAsia="Consolas" w:hAnsi="Consolas"/>
+          <w:sz w:val="20"/>
+          <w:szCs w:val="20"/>
+        </w:rPr>
+        <w:t xml:space="preserve">OnOwnDeath</w:t>
+      </w:r>
+      <w:r>
+        <w:t xml:space="preserve"> u </w:t>
+      </w:r>
+      <w:r>
+        <w:rPr>
+          <w:rFonts w:ascii="Consolas" w:cs="Consolas" w:eastAsia="Consolas" w:hAnsi="Consolas"/>
+          <w:sz w:val="20"/>
+          <w:szCs w:val="20"/>
+        </w:rPr>
+        <w:t xml:space="preserve">OnZoneEnded</w:t>
+      </w:r>
+      <w:r>
+        <w:t xml:space="preserve">; la variante cambia su </w:t>
+      </w:r>
+      <w:r>
+        <w:rPr>
+          <w:rFonts w:ascii="Consolas" w:cs="Consolas" w:eastAsia="Consolas" w:hAnsi="Consolas"/>
+          <w:sz w:val="20"/>
+          <w:szCs w:val="20"/>
+        </w:rPr>
+        <w:t xml:space="preserve">Entity_Summon</w:t>
+      </w:r>
+      <w:r>
+        <w:t xml:space="preserve"> por la subclase.</w:t>
+      </w:r>
+    </w:p>
+    <w:p>
+      <w:pPr>
+        <w:pStyle w:val="ListParagraph"/>
+        <w:numPr>
+          <w:ilvl w:val="0"/>
+          <w:numId w:val="2"/>
+        </w:numPr>
+        <w:spacing w:after="60"/>
+      </w:pPr>
+      <w:r>
+        <w:rPr>
+          <w:b/>
+          <w:bCs/>
+        </w:rPr>
+        <w:t xml:space="preserve">Trampa 1:</w:t>
+      </w:r>
+      <w:r>
+        <w:t xml:space="preserve"> </w:t>
+      </w:r>
+      <w:r>
+        <w:rPr>
+          <w:rFonts w:ascii="Consolas" w:cs="Consolas" w:eastAsia="Consolas" w:hAnsi="Consolas"/>
+          <w:sz w:val="20"/>
+          <w:szCs w:val="20"/>
+        </w:rPr>
+        <w:t xml:space="preserve">Awake</w:t>
+      </w:r>
+      <w:r>
+        <w:t xml:space="preserve"> y </w:t>
+      </w:r>
+      <w:r>
+        <w:rPr>
+          <w:rFonts w:ascii="Consolas" w:cs="Consolas" w:eastAsia="Consolas" w:hAnsi="Consolas"/>
+          <w:sz w:val="20"/>
+          <w:szCs w:val="20"/>
+        </w:rPr>
+        <w:t xml:space="preserve">Update</w:t>
+      </w:r>
+      <w:r>
+        <w:t xml:space="preserve"> de la subclase van con </w:t>
+      </w:r>
+      <w:r>
+        <w:rPr>
+          <w:rFonts w:ascii="Consolas" w:cs="Consolas" w:eastAsia="Consolas" w:hAnsi="Consolas"/>
+          <w:sz w:val="20"/>
+          <w:szCs w:val="20"/>
+        </w:rPr>
+        <w:t xml:space="preserve">override</w:t>
+      </w:r>
+      <w:r>
+        <w:t xml:space="preserve"> y llamando a </w:t>
+      </w:r>
+      <w:r>
+        <w:rPr>
+          <w:rFonts w:ascii="Consolas" w:cs="Consolas" w:eastAsia="Consolas" w:hAnsi="Consolas"/>
+          <w:sz w:val="20"/>
+          <w:szCs w:val="20"/>
+        </w:rPr>
+        <w:t xml:space="preserve">base.Awake()</w:t>
+      </w:r>
+      <w:r>
+        <w:t xml:space="preserve"> / </w:t>
+      </w:r>
+      <w:r>
+        <w:rPr>
+          <w:rFonts w:ascii="Consolas" w:cs="Consolas" w:eastAsia="Consolas" w:hAnsi="Consolas"/>
+          <w:sz w:val="20"/>
+          <w:szCs w:val="20"/>
+        </w:rPr>
+        <w:t xml:space="preserve">base.Update()</w:t>
+      </w:r>
+      <w:r>
+        <w:t xml:space="preserve">. Si no, la base no corre: ni el reloj, ni el dueño, ni la visibilidad.</w:t>
+      </w:r>
+    </w:p>
+    <w:p>
+      <w:pPr>
+        <w:pStyle w:val="ListParagraph"/>
+        <w:numPr>
+          <w:ilvl w:val="0"/>
+          <w:numId w:val="2"/>
+        </w:numPr>
+        <w:spacing w:after="60"/>
+      </w:pPr>
+      <w:r>
+        <w:rPr>
+          <w:b/>
+          <w:bCs/>
+        </w:rPr>
+        <w:t xml:space="preserve">Trampa 2:</w:t>
+      </w:r>
+      <w:r>
+        <w:t xml:space="preserve"> un campo de la subclase con el MISMO nombre que uno de la base (pasó con </w:t>
+      </w:r>
+      <w:r>
+        <w:rPr>
+          <w:rFonts w:ascii="Consolas" w:cs="Consolas" w:eastAsia="Consolas" w:hAnsi="Consolas"/>
+          <w:sz w:val="20"/>
+          <w:szCs w:val="20"/>
+        </w:rPr>
+        <w:t xml:space="preserve">Visual</w:t>
+      </w:r>
+      <w:r>
+        <w:t xml:space="preserve"> en la cuchilla y el compañero) rompe la serialización. Se borra el de la subclase y el dato pasa a la base.</w:t>
+      </w:r>
+    </w:p>
+    <w:p>
+      <w:pPr>
+        <w:spacing w:after="120" w:line="276"/>
+      </w:pPr>
+    </w:p>
+    <w:p>
+      <w:pPr>
+        <w:pStyle w:val="Heading1"/>
+        <w:spacing w:after="160" w:before="360"/>
+      </w:pPr>
+      <w:r>
+        <w:rPr>
+          <w:b/>
+          <w:bCs/>
+          <w:color w:val="1F4E79"/>
+          <w:sz w:val="32"/>
+          <w:szCs w:val="32"/>
+        </w:rPr>
+        <w:t xml:space="preserve">9. Glosario — EAttributeType</w:t>
       </w:r>
     </w:p>
     <w:p>
@@ -8900,7 +11258,7 @@
           <w:sz w:val="32"/>
           <w:szCs w:val="32"/>
         </w:rPr>
-        <w:t xml:space="preserve">9. Glosario — EGameplayTag</w:t>
+        <w:t xml:space="preserve">10. Glosario — EGameplayTag</w:t>
       </w:r>
     </w:p>
     <w:p>
@@ -8933,7 +11291,7 @@
           <w:sz w:val="26"/>
           <w:szCs w:val="26"/>
         </w:rPr>
-        <w:t xml:space="preserve">9.1 Control</w:t>
+        <w:t xml:space="preserve">10.1 Control</w:t>
       </w:r>
     </w:p>
     <w:tbl>
@@ -9268,7 +11626,7 @@
           <w:sz w:val="26"/>
           <w:szCs w:val="26"/>
         </w:rPr>
-        <w:t xml:space="preserve">9.2 Defensa y supervivencia</w:t>
+        <w:t xml:space="preserve">10.2 Defensa y supervivencia</w:t>
       </w:r>
     </w:p>
     <w:tbl>
@@ -9701,7 +12059,7 @@
           <w:sz w:val="26"/>
           <w:szCs w:val="26"/>
         </w:rPr>
-        <w:t xml:space="preserve">9.2.1 Movimiento</w:t>
+        <w:t xml:space="preserve">10.2.1 Movimiento</w:t>
       </w:r>
     </w:p>
     <w:tbl>
@@ -9856,7 +12214,7 @@
           <w:sz w:val="26"/>
           <w:szCs w:val="26"/>
         </w:rPr>
-        <w:t xml:space="preserve">9.3 Marcas y estados</w:t>
+        <w:t xml:space="preserve">10.3 Marcas y estados</w:t>
       </w:r>
     </w:p>
     <w:tbl>
@@ -10873,7 +13231,7 @@
           <w:sz w:val="26"/>
           <w:szCs w:val="26"/>
         </w:rPr>
-        <w:t xml:space="preserve">9.4 Cooldowns</w:t>
+        <w:t xml:space="preserve">10.4 Cooldowns</w:t>
       </w:r>
     </w:p>
     <w:p>
@@ -10985,7 +13343,7 @@
           <w:sz w:val="26"/>
           <w:szCs w:val="26"/>
         </w:rPr>
-        <w:t xml:space="preserve">9.5 Obsoletos</w:t>
+        <w:t xml:space="preserve">10.5 Obsoletos</w:t>
       </w:r>
     </w:p>
     <w:p>
@@ -11054,7 +13412,7 @@
           <w:sz w:val="32"/>
           <w:szCs w:val="32"/>
         </w:rPr>
-        <w:t xml:space="preserve">10. Otros enums, interfaces y assets</w:t>
+        <w:t xml:space="preserve">11. Otros enums, interfaces y assets</w:t>
       </w:r>
     </w:p>
     <w:p>
@@ -11070,7 +13428,7 @@
           <w:sz w:val="26"/>
           <w:szCs w:val="26"/>
         </w:rPr>
-        <w:t xml:space="preserve">10.1 EAbilityInput</w:t>
+        <w:t xml:space="preserve">11.1 EAbilityInput</w:t>
       </w:r>
     </w:p>
     <w:p>
@@ -11180,7 +13538,7 @@
           <w:sz w:val="26"/>
           <w:szCs w:val="26"/>
         </w:rPr>
-        <w:t xml:space="preserve">10.2 Los registros</w:t>
+        <w:t xml:space="preserve">11.2 Los registros</w:t>
       </w:r>
     </w:p>
     <w:p>
@@ -11267,7 +13625,7 @@
           <w:sz w:val="26"/>
           <w:szCs w:val="26"/>
         </w:rPr>
-        <w:t xml:space="preserve">10.3 Interfaces de habilidad</w:t>
+        <w:t xml:space="preserve">11.3 Interfaces de habilidad</w:t>
       </w:r>
     </w:p>
     <w:tbl>
@@ -11896,7 +14254,7 @@
           <w:sz w:val="26"/>
           <w:szCs w:val="26"/>
         </w:rPr>
-        <w:t xml:space="preserve">10.4 Pasivas por prefab</w:t>
+        <w:t xml:space="preserve">11.4 Pasivas por prefab</w:t>
       </w:r>
     </w:p>
     <w:p>
@@ -11973,7 +14331,7 @@
           <w:sz w:val="32"/>
           <w:szCs w:val="32"/>
         </w:rPr>
-        <w:t xml:space="preserve">11. Reglas que rompen fácil</w:t>
+        <w:t xml:space="preserve">12. Reglas que rompen fácil</w:t>
       </w:r>
     </w:p>
     <w:p>
@@ -12645,6 +15003,74 @@
     </w:p>
     <w:p>
       <w:pPr>
+        <w:pStyle w:val="ListParagraph"/>
+        <w:numPr>
+          <w:ilvl w:val="0"/>
+          <w:numId w:val="2"/>
+        </w:numPr>
+        <w:spacing w:after="60"/>
+      </w:pPr>
+      <w:r>
+        <w:t xml:space="preserve">Una subclase de </w:t>
+      </w:r>
+      <w:r>
+        <w:rPr>
+          <w:rFonts w:ascii="Consolas" w:cs="Consolas" w:eastAsia="Consolas" w:hAnsi="Consolas"/>
+          <w:sz w:val="20"/>
+          <w:szCs w:val="20"/>
+        </w:rPr>
+        <w:t xml:space="preserve">Entity_Summon</w:t>
+      </w:r>
+      <w:r>
+        <w:t xml:space="preserve"> con su propio </w:t>
+      </w:r>
+      <w:r>
+        <w:rPr>
+          <w:rFonts w:ascii="Consolas" w:cs="Consolas" w:eastAsia="Consolas" w:hAnsi="Consolas"/>
+          <w:sz w:val="20"/>
+          <w:szCs w:val="20"/>
+        </w:rPr>
+        <w:t xml:space="preserve">Awake</w:t>
+      </w:r>
+      <w:r>
+        <w:t xml:space="preserve"> o </w:t>
+      </w:r>
+      <w:r>
+        <w:rPr>
+          <w:rFonts w:ascii="Consolas" w:cs="Consolas" w:eastAsia="Consolas" w:hAnsi="Consolas"/>
+          <w:sz w:val="20"/>
+          <w:szCs w:val="20"/>
+        </w:rPr>
+        <w:t xml:space="preserve">Update</w:t>
+      </w:r>
+      <w:r>
+        <w:t xml:space="preserve"> sin </w:t>
+      </w:r>
+      <w:r>
+        <w:rPr>
+          <w:rFonts w:ascii="Consolas" w:cs="Consolas" w:eastAsia="Consolas" w:hAnsi="Consolas"/>
+          <w:sz w:val="20"/>
+          <w:szCs w:val="20"/>
+        </w:rPr>
+        <w:t xml:space="preserve">override</w:t>
+      </w:r>
+      <w:r>
+        <w:t xml:space="preserve"> ni </w:t>
+      </w:r>
+      <w:r>
+        <w:rPr>
+          <w:rFonts w:ascii="Consolas" w:cs="Consolas" w:eastAsia="Consolas" w:hAnsi="Consolas"/>
+          <w:sz w:val="20"/>
+          <w:szCs w:val="20"/>
+        </w:rPr>
+        <w:t xml:space="preserve">base.</w:t>
+      </w:r>
+      <w:r>
+        <w:t xml:space="preserve">: la base deja de correr (el reloj, el dueño, la visibilidad). Ver 8.7.</w:t>
+      </w:r>
+    </w:p>
+    <w:p>
+      <w:pPr>
         <w:pStyle w:val="Heading1"/>
         <w:spacing w:after="160" w:before="360"/>
       </w:pPr>
@@ -12656,7 +15082,7 @@
           <w:sz w:val="32"/>
           <w:szCs w:val="32"/>
         </w:rPr>
-        <w:t xml:space="preserve">12. Referencia rápida de archivos</w:t>
+        <w:t xml:space="preserve">13. Referencia rápida de archivos</w:t>
       </w:r>
     </w:p>
     <w:tbl>
@@ -13816,6 +16242,18 @@
     </w:lvlOverride>
   </w:num>
   <w:num w:numId="3">
+    <w:abstractNumId w:val="3"/>
+    <w:lvlOverride w:ilvl="0">
+      <w:startOverride w:val="1"/>
+    </w:lvlOverride>
+  </w:num>
+  <w:num w:numId="4">
+    <w:abstractNumId w:val="3"/>
+    <w:lvlOverride w:ilvl="0">
+      <w:startOverride w:val="1"/>
+    </w:lvlOverride>
+  </w:num>
+  <w:num w:numId="5">
     <w:abstractNumId w:val="3"/>
     <w:lvlOverride w:ilvl="0">
       <w:startOverride w:val="1"/>

</xml_diff>

<commit_message>
Mago, etapa 4: los bots juegan el Mago y el Mago pasa a los documentos
- Bots: rol nuevo "a distancia" (EBotRole.Ranged) para el Daño cuyo básico pega
  de lejos (el Mago y también el Explorador): se queda a 11 m, tira si lo ve y
  herido se va a curar. El libro (GA_RadialChoice) se elige con criterio (en
  apuros el hielo para la Tumba, sin maná los misiles, si no otro cada ~8 s); la
  Q se juzga por la variante que saldría; no corta lo que canaliza; el rol de una
  clase sin subclases sale de su rol de los menús.
- Bots: aturdido o enraizado ya no caminan.
- Documentos: el Mago en el diseño de clases; la guía con el catálogo al día y
  "3.2 Un kit entero con genéricos: el Mago"; arquitectura del GAS y de red con
  lo técnico de las etapas 2 y 3. CLAUDE.md: el marcador del piso en la cámara.

Co-Authored-By: Claude Opus 5.5 <noreply@anthropic.com>
</commit_message>
<xml_diff>
--- a/DesignDocuments/GAS_Arquitectura.docx
+++ b/DesignDocuments/GAS_Arquitectura.docx
@@ -6393,6 +6393,69 @@
         <w:spacing w:after="120" w:line="276"/>
       </w:pPr>
       <w:r>
+        <w:rPr>
+          <w:b/>
+          <w:bCs/>
+        </w:rPr>
+        <w:t xml:space="preserve">Canalizar a través de un switch (21 de octubre de 2026).</w:t>
+      </w:r>
+      <w:r>
+        <w:t xml:space="preserve"> </w:t>
+      </w:r>
+      <w:r>
+        <w:rPr>
+          <w:rFonts w:ascii="Consolas" w:cs="Consolas" w:eastAsia="Consolas" w:hAnsi="Consolas"/>
+          <w:sz w:val="20"/>
+          <w:szCs w:val="20"/>
+        </w:rPr>
+        <w:t xml:space="preserve">GameplayAbility.CastSettingsSource</w:t>
+      </w:r>
+      <w:r>
+        <w:t xml:space="preserve"> dice de dónde salen los datos de canalizar: de la propia habilidad, o de la variante que va a salir en un GA_TagSwitch con VariantsPayOwnCost (la Bola de fuego 0.5 s, la Recarga de maná continua 3 s). En un continuo, el switch corre la variante como REPETICIÓN (</w:t>
+      </w:r>
+      <w:r>
+        <w:rPr>
+          <w:rFonts w:ascii="Consolas" w:cs="Consolas" w:eastAsia="Consolas" w:hAnsi="Consolas"/>
+          <w:sz w:val="20"/>
+          <w:szCs w:val="20"/>
+        </w:rPr>
+        <w:t xml:space="preserve">ActivateAsCastTick</w:t>
+      </w:r>
+      <w:r>
+        <w:t xml:space="preserve">): no mira el cooldown, no anima ni avisa su fin, y solo la primera cobra (después </w:t>
+      </w:r>
+      <w:r>
+        <w:rPr>
+          <w:rFonts w:ascii="Consolas" w:cs="Consolas" w:eastAsia="Consolas" w:hAnsi="Consolas"/>
+          <w:sz w:val="20"/>
+          <w:szCs w:val="20"/>
+        </w:rPr>
+        <w:t xml:space="preserve">MarkCastPaid</w:t>
+      </w:r>
+      <w:r>
+        <w:t xml:space="preserve">). Los efectos “al activarse” se repiten en cada pulso del continuo.</w:t>
+      </w:r>
+    </w:p>
+    <w:p>
+      <w:pPr>
+        <w:spacing w:after="120" w:line="276"/>
+      </w:pPr>
+      <w:r>
+        <w:rPr>
+          <w:b/>
+          <w:bCs/>
+        </w:rPr>
+        <w:t xml:space="preserve">Lo que la variante arrancó cuenta como del switch</w:t>
+      </w:r>
+      <w:r>
+        <w:t xml:space="preserve"> (GA_HoldTagSwitch, 21 de octubre de 2026): copia CommittedThisActivation y StartedThisActivation de la variante. Sin eso, una variante que no es de mantener (los misiles del Mago, la Defensa paciente del Monje) no se animaba en las otras pantallas: ServerActivateAbility mira esas marcas en lo que se apretó.</w:t>
+      </w:r>
+    </w:p>
+    <w:p>
+      <w:pPr>
+        <w:spacing w:after="120" w:line="276"/>
+      </w:pPr>
+      <w:r>
         <w:t xml:space="preserve">El choque de los proyectiles es un BARRIDO (19 de octubre de 2026). GC_Projectile ya no usa OnTriggerEnter: en cada FixedUpdate el servidor barre el tramo que recorrió con la forma del proyectil (BoxCast o SphereCast contra paredes, escudos y gente, con la matriz de colisiones de su capa) y con una esfera de CharacterHitRadius solo contra personajes, y procesa lo encontrado en orden de distancia: un escudo frena antes que el que está detrás, y cada collider cuenta una vez. Antes, a 100 m/s avanzaba 2 m por paso y se saltaba paredes o escudos finos. El primer tramo sale del cuerpo del que tira (pegado a una pared, de frente, pega en la pared). La caja se ajusta al arma que se ve volar (FitColliderToModel), así un tiro que pasa cerca de una pared ya no pega en ella; acertarle a la gente lo decide el radio aparte (0.5 m; la flecha, 0: su caja).</w:t>
       </w:r>
     </w:p>
@@ -6778,6 +6841,14 @@
       </w:r>
       <w:r>
         <w:t xml:space="preserve"> — así los GE que ya existían obedecen sin migrarlos uno por uno.</w:t>
+      </w:r>
+    </w:p>
+    <w:p>
+      <w:pPr>
+        <w:spacing w:after="120" w:line="276"/>
+      </w:pPr>
+      <w:r>
+        <w:t xml:space="preserve">Un efecto de tipo BUFF nunca cuenta como control aunque otorgue uno de esos tags (21 de octubre de 2026): se lo pone uno mismo (la Tumba helada del Mago da State_Rooted para quedarse quieto) y la resistencia no lo recorta. Un control de verdad va como Debuff (u Oculto).</w:t>
       </w:r>
     </w:p>
     <w:p>
@@ -8940,6 +9011,26 @@
           <w:b/>
           <w:bCs/>
         </w:rPr>
+        <w:t xml:space="preserve">Forma.</w:t>
+      </w:r>
+      <w:r>
+        <w:t xml:space="preserve"> Círculo (el radio) o Caja (ancho × alto × largo, apoyada en el piso y girada con la invocación: el Muro de fuego del Mago, 10 × 2 × 2 m). Con caja, el VFX va como hijos del prefab.</w:t>
+      </w:r>
+    </w:p>
+    <w:p>
+      <w:pPr>
+        <w:pStyle w:val="ListParagraph"/>
+        <w:numPr>
+          <w:ilvl w:val="0"/>
+          <w:numId w:val="2"/>
+        </w:numPr>
+        <w:spacing w:after="60"/>
+      </w:pPr>
+      <w:r>
+        <w:rPr>
+          <w:b/>
+          <w:bCs/>
+        </w:rPr>
         <w:t xml:space="preserve">El VFX.</w:t>
       </w:r>
       <w:r>
@@ -9529,6 +9620,55 @@
                 <w:szCs w:val="20"/>
               </w:rPr>
               <w:t xml:space="preserve">: no se va sola, el manager anota su vida para cuando vuelva.</w:t>
+            </w:r>
+          </w:p>
+        </w:tc>
+      </w:tr>
+      <w:tr>
+        <w:tc>
+          <w:tcPr>
+            <w:tcW w:type="dxa" w:w="2600"/>
+            <w:tcMar>
+              <w:top w:type="dxa" w:w="60"/>
+              <w:left w:type="dxa" w:w="100"/>
+              <w:bottom w:type="dxa" w:w="60"/>
+              <w:right w:type="dxa" w:w="100"/>
+            </w:tcMar>
+          </w:tcPr>
+          <w:p>
+            <w:pPr>
+              <w:spacing w:after="0"/>
+            </w:pPr>
+            <w:r>
+              <w:rPr>
+                <w:rFonts w:ascii="Consolas" w:cs="Consolas" w:eastAsia="Consolas" w:hAnsi="Consolas"/>
+                <w:sz w:val="18"/>
+                <w:szCs w:val="18"/>
+              </w:rPr>
+              <w:t xml:space="preserve">Summon_FireWall, Summon_LightningStorm</w:t>
+            </w:r>
+          </w:p>
+        </w:tc>
+        <w:tc>
+          <w:tcPr>
+            <w:tcW w:type="dxa" w:w="6800"/>
+            <w:tcMar>
+              <w:top w:type="dxa" w:w="60"/>
+              <w:left w:type="dxa" w:w="100"/>
+              <w:bottom w:type="dxa" w:w="60"/>
+              <w:right w:type="dxa" w:w="100"/>
+            </w:tcMar>
+          </w:tcPr>
+          <w:p>
+            <w:pPr>
+              <w:spacing w:after="0"/>
+            </w:pPr>
+            <w:r>
+              <w:rPr>
+                <w:sz w:val="20"/>
+                <w:szCs w:val="20"/>
+              </w:rPr>
+              <w:t xml:space="preserve">Sin código propio (variantes de SummonZone_Base): el muro es una zona en caja con una llama por casilla; la tormenta, una zona de 4 m con el tornado de VFX y un Summon_LightningRod: un cilindro sin collider que solo ven los rayos. La Descarga del Mago (o de un aliado) que lo cruza se frena ahí y el tornado reparte un rayo a cada enemigo a su alcance (GA_HitscanShot.StopDistance).</w:t>
             </w:r>
           </w:p>
         </w:tc>
@@ -13159,6 +13299,153 @@
                 <w:sz w:val="18"/>
                 <w:szCs w:val="18"/>
               </w:rPr>
+              <w:t xml:space="preserve">Status_ArcanePoint</w:t>
+            </w:r>
+          </w:p>
+        </w:tc>
+        <w:tc>
+          <w:tcPr>
+            <w:tcW w:type="dxa" w:w="6800"/>
+            <w:tcMar>
+              <w:top w:type="dxa" w:w="60"/>
+              <w:left w:type="dxa" w:w="100"/>
+              <w:bottom w:type="dxa" w:w="60"/>
+              <w:right w:type="dxa" w:w="100"/>
+            </w:tcMar>
+          </w:tcPr>
+          <w:p>
+            <w:pPr>
+              <w:spacing w:after="0"/>
+            </w:pPr>
+            <w:r>
+              <w:rPr>
+                <w:sz w:val="20"/>
+                <w:szCs w:val="20"/>
+              </w:rPr>
+              <w:t xml:space="preserve">Un punto arcano del Mago (GE_ArcanePoint, hasta 5, 6 s): lo dejan los misiles; cada uno suma +2 a cada golpe del Mago (ArcaneVulnerabilityPassive) y los hechizos escalan con ellos.</w:t>
+            </w:r>
+          </w:p>
+        </w:tc>
+      </w:tr>
+      <w:tr>
+        <w:tc>
+          <w:tcPr>
+            <w:tcW w:type="dxa" w:w="2600"/>
+            <w:tcMar>
+              <w:top w:type="dxa" w:w="60"/>
+              <w:left w:type="dxa" w:w="100"/>
+              <w:bottom w:type="dxa" w:w="60"/>
+              <w:right w:type="dxa" w:w="100"/>
+            </w:tcMar>
+          </w:tcPr>
+          <w:p>
+            <w:pPr>
+              <w:spacing w:after="0"/>
+            </w:pPr>
+            <w:r>
+              <w:rPr>
+                <w:rFonts w:ascii="Consolas" w:cs="Consolas" w:eastAsia="Consolas" w:hAnsi="Consolas"/>
+                <w:sz w:val="18"/>
+                <w:szCs w:val="18"/>
+              </w:rPr>
+              <w:t xml:space="preserve">Status_SpellSelected, Status_SpellFire / _Ice / _Earth / _Lightning</w:t>
+            </w:r>
+          </w:p>
+        </w:tc>
+        <w:tc>
+          <w:tcPr>
+            <w:tcW w:type="dxa" w:w="6800"/>
+            <w:tcMar>
+              <w:top w:type="dxa" w:w="60"/>
+              <w:left w:type="dxa" w:w="100"/>
+              <w:bottom w:type="dxa" w:w="60"/>
+              <w:right w:type="dxa" w:w="100"/>
+            </w:tcMar>
+          </w:tcPr>
+          <w:p>
+            <w:pPr>
+              <w:spacing w:after="0"/>
+            </w:pPr>
+            <w:r>
+              <w:rPr>
+                <w:sz w:val="20"/>
+                <w:szCs w:val="20"/>
+              </w:rPr>
+              <w:t xml:space="preserve">El hechizo elegido en el libro (los GE_Spell_*): cambian el clic izquierdo y la Q del Mago.</w:t>
+            </w:r>
+          </w:p>
+        </w:tc>
+      </w:tr>
+      <w:tr>
+        <w:tc>
+          <w:tcPr>
+            <w:tcW w:type="dxa" w:w="2600"/>
+            <w:tcMar>
+              <w:top w:type="dxa" w:w="60"/>
+              <w:left w:type="dxa" w:w="100"/>
+              <w:bottom w:type="dxa" w:w="60"/>
+              <w:right w:type="dxa" w:w="100"/>
+            </w:tcMar>
+          </w:tcPr>
+          <w:p>
+            <w:pPr>
+              <w:spacing w:after="0"/>
+            </w:pPr>
+            <w:r>
+              <w:rPr>
+                <w:rFonts w:ascii="Consolas" w:cs="Consolas" w:eastAsia="Consolas" w:hAnsi="Consolas"/>
+                <w:sz w:val="18"/>
+                <w:szCs w:val="18"/>
+              </w:rPr>
+              <w:t xml:space="preserve">Status_IceTomb</w:t>
+            </w:r>
+          </w:p>
+        </w:tc>
+        <w:tc>
+          <w:tcPr>
+            <w:tcW w:type="dxa" w:w="6800"/>
+            <w:tcMar>
+              <w:top w:type="dxa" w:w="60"/>
+              <w:left w:type="dxa" w:w="100"/>
+              <w:bottom w:type="dxa" w:w="60"/>
+              <w:right w:type="dxa" w:w="100"/>
+            </w:tcMar>
+          </w:tcPr>
+          <w:p>
+            <w:pPr>
+              <w:spacing w:after="0"/>
+            </w:pPr>
+            <w:r>
+              <w:rPr>
+                <w:sz w:val="20"/>
+                <w:szCs w:val="20"/>
+              </w:rPr>
+              <w:t xml:space="preserve">Encerrado en la Tumba helada: lo llevan en ActivationBlockedTags las otras habilidades del Mago, y apretar la Q otra vez lo saca (GA_SelfBuff.EndTag).</w:t>
+            </w:r>
+          </w:p>
+        </w:tc>
+      </w:tr>
+      <w:tr>
+        <w:tc>
+          <w:tcPr>
+            <w:tcW w:type="dxa" w:w="2600"/>
+            <w:tcMar>
+              <w:top w:type="dxa" w:w="60"/>
+              <w:left w:type="dxa" w:w="100"/>
+              <w:bottom w:type="dxa" w:w="60"/>
+              <w:right w:type="dxa" w:w="100"/>
+            </w:tcMar>
+          </w:tcPr>
+          <w:p>
+            <w:pPr>
+              <w:spacing w:after="0"/>
+            </w:pPr>
+            <w:r>
+              <w:rPr>
+                <w:rFonts w:ascii="Consolas" w:cs="Consolas" w:eastAsia="Consolas" w:hAnsi="Consolas"/>
+                <w:sz w:val="18"/>
+                <w:szCs w:val="18"/>
+              </w:rPr>
               <w:t xml:space="preserve">Status_Buff_*</w:t>
             </w:r>
             <w:r>
@@ -13794,7 +14081,7 @@
                 <w:sz w:val="20"/>
                 <w:szCs w:val="20"/>
               </w:rPr>
-              <w:t xml:space="preserve">Mantener ▸ marcador en el suelo ▸ soltar lanza. El marcador (UI_GroundTargetIndicator) se crea solo y dibuja un círculo relleno con borde.</w:t>
+              <w:t xml:space="preserve">Mantener ▸ marcador en el suelo ▸ soltar lanza. El marcador (UI_GroundTargetIndicator) vive en el prefab de la cámara (Player Camera ▸ GroundTargetIndicator): círculo, franja o muro; al jugar se suelta de la cámara.</w:t>
             </w:r>
           </w:p>
         </w:tc>
@@ -13844,6 +14131,55 @@
                 <w:szCs w:val="20"/>
               </w:rPr>
               <w:t xml:space="preserve">Mantener ▸ franja en el suelo (LineLength × LineWidth) que se corta en la primera pared y marca con un contorno a los enemigos de adentro ▸ soltar. El Corte final (GA_RushAttack con AimFirst).</w:t>
+            </w:r>
+          </w:p>
+        </w:tc>
+      </w:tr>
+      <w:tr>
+        <w:tc>
+          <w:tcPr>
+            <w:tcW w:type="dxa" w:w="2800"/>
+            <w:tcMar>
+              <w:top w:type="dxa" w:w="60"/>
+              <w:left w:type="dxa" w:w="100"/>
+              <w:bottom w:type="dxa" w:w="60"/>
+              <w:right w:type="dxa" w:w="100"/>
+            </w:tcMar>
+          </w:tcPr>
+          <w:p>
+            <w:pPr>
+              <w:spacing w:after="0"/>
+            </w:pPr>
+            <w:r>
+              <w:rPr>
+                <w:rFonts w:ascii="Consolas" w:cs="Consolas" w:eastAsia="Consolas" w:hAnsi="Consolas"/>
+                <w:sz w:val="18"/>
+                <w:szCs w:val="18"/>
+              </w:rPr>
+              <w:t xml:space="preserve">IWallTargetAbility</w:t>
+            </w:r>
+          </w:p>
+        </w:tc>
+        <w:tc>
+          <w:tcPr>
+            <w:tcW w:type="dxa" w:w="6600"/>
+            <w:tcMar>
+              <w:top w:type="dxa" w:w="60"/>
+              <w:left w:type="dxa" w:w="100"/>
+              <w:bottom w:type="dxa" w:w="60"/>
+              <w:right w:type="dxa" w:w="100"/>
+            </w:tcMar>
+          </w:tcPr>
+          <w:p>
+            <w:pPr>
+              <w:spacing w:after="0"/>
+            </w:pPr>
+            <w:r>
+              <w:rPr>
+                <w:sz w:val="20"/>
+                <w:szCs w:val="20"/>
+              </w:rPr>
+              <w:t xml:space="preserve">Mantener ▸ muro de casillas atravesado a la mira, que la rueda del mouse gira ▸ soltar. El giro viaja con el pedido (placementYaw → PlayerController.NetworkPlacementYaw). Lo implementan GA_SpawnSummon (con zona en caja) y el GA_TagSwitch (por su variante).</w:t>
             </w:r>
           </w:p>
         </w:tc>
@@ -15067,6 +15403,43 @@
       </w:r>
       <w:r>
         <w:t xml:space="preserve">: la base deja de correr (el reloj, el dueño, la visibilidad). Ver 8.7.</w:t>
+      </w:r>
+    </w:p>
+    <w:p>
+      <w:pPr>
+        <w:pStyle w:val="ListParagraph"/>
+        <w:numPr>
+          <w:ilvl w:val="0"/>
+          <w:numId w:val="2"/>
+        </w:numPr>
+        <w:spacing w:after="60"/>
+      </w:pPr>
+      <w:r>
+        <w:t xml:space="preserve">Repetir la variante de un switch que canaliza en continuo con Activate() a secas: la segunda repetición choca con el cooldown que puso la primera. Va por </w:t>
+      </w:r>
+      <w:r>
+        <w:rPr>
+          <w:rFonts w:ascii="Consolas" w:cs="Consolas" w:eastAsia="Consolas" w:hAnsi="Consolas"/>
+          <w:sz w:val="20"/>
+          <w:szCs w:val="20"/>
+        </w:rPr>
+        <w:t xml:space="preserve">ActivateAsCastTick</w:t>
+      </w:r>
+      <w:r>
+        <w:t xml:space="preserve"> (ver 6.2).</w:t>
+      </w:r>
+    </w:p>
+    <w:p>
+      <w:pPr>
+        <w:pStyle w:val="ListParagraph"/>
+        <w:numPr>
+          <w:ilvl w:val="0"/>
+          <w:numId w:val="2"/>
+        </w:numPr>
+        <w:spacing w:after="60"/>
+      </w:pPr>
+      <w:r>
+        <w:t xml:space="preserve">Un movimiento de bot que no mira los tags de control: el agente del NavMesh no sabe de aturdidos. BotController frena el agente con State_Stunned o State_Rooted (desde el 21 de octubre de 2026; antes un bot aturdido seguía caminando).</w:t>
       </w:r>
     </w:p>
     <w:p>

</xml_diff>

<commit_message>
Documentos: las subclases del Mago y los cambios al kit base
- Diseño de clases: el kit base al día (puntos de 15 s con +1, misiles en ráfaga de 3, las Q
  que canalizan 2 s) y la Evocación, la Abjuración y el Filo danzante como quedaron.
- Guía de habilidades: las opciones nuevas en el catálogo de genéricos, la 3.3 (las subclases
  del Mago, hechas con qué), los puntos del objetivo con mínimo/máximo y "al terminar de
  golpear", los ecos y el escudo dinámico en las pasivas, el costo que escala.
- Arquitectura del GAS: la 4.7 (los ecos y las copias de efectos), el costo que escala, el
  escudo a la vista y el escrito a mano, el switch al instante, la mira fija al canalizar, la
  zona que crece, el potenciador de proyectiles, los tags y las pasivas nuevas.
- Red: cómo juegan los bots del Filo danzante y de la Abjuración.

Co-Authored-By: Claude Opus 5.5 <noreply@anthropic.com>
</commit_message>
<xml_diff>
--- a/DesignDocuments/GAS_Arquitectura.docx
+++ b/DesignDocuments/GAS_Arquitectura.docx
@@ -2534,6 +2534,9 @@
       <w:r>
         <w:t xml:space="preserve"> y lanza la secuencia de VFX automática.</w:t>
       </w:r>
+      <w:r>
+        <w:t xml:space="preserve"> El costo se cobra con CostSource de fuente: la habilidad, salvo que el costo escale con un stat (el 50 % del maná MÁXIMO del corte avanzando del Filo danzante, 23 de octubre de 2026), que va con el dueño, porque el escalado lee los stats de la fuente y con la habilidad daba 0. CanAffordGameplayEffect también calcula esos costos con los stats del dueño.</w:t>
+      </w:r>
     </w:p>
     <w:p>
       <w:pPr>
@@ -3196,6 +3199,9 @@
         </w:rPr>
         <w:t xml:space="preserve">Vuelo libre (GA_Flight, desde el 6 de octubre de 2026). Es un GA_SelfBuff cuyo GE otorga Status_Flying; además manda por TargetRpc al dueño los números del vuelo (LaunchSpeed, SpeedMultiplier, ForwardBoost, VerticalSpeed, IdleSinkSpeed). El movimiento lo hace el dueño en HandleMovementInput mientras exista el tag: sin gravedad, cámara 3D, Espacio (Jump) sube y la acción nueva Descend (Ctrl / L3; Ctrl dejó de ser ataque principal) baja; quieto, cae hasta IdleSinkSpeed. Al perder el tag en el aire cae con la gravedad de la caída de pluma (sin aleteos); aturdido en pleno vuelo también, y enraizado queda quieto un instante hasta que el ASC le quita el tag. El Animator lo ve siempre en el aire. Los bots no la usan (MovesThroughOwner).</w:t>
       </w:r>
+      <w:r>
+        <w:t xml:space="preserve"> Vuelo firme (22 de octubre de 2026): con Status_SteadyFlight el daño no le saca el vuelo (la Sobrecarga de hechizos de la Evocación levita a voluntad).</w:t>
+      </w:r>
     </w:p>
     <w:p>
       <w:pPr>
@@ -3407,6 +3413,153 @@
           <w:szCs w:val="20"/>
         </w:rPr>
         <w:t xml:space="preserve">Desde el 8 de octubre de 2026. Una habilidad puede GASTAR las acumulaciones de un tag: StacksTag (hoy Status_MartialArts, que da cada acumulación de Artes marciales del Monje) y ConsumeStacks (no, al activarse o al terminar). CommitAbility las lee (ReadStacks, que deja StackSnapshot) ANTES de gastarlas, así los efectos usan lo que había; las que se gastan al terminar las quita EndAbility. Cada entrada de Effects elige cómo escala con ese número (StackScaling): sin escalar, solo con acumulaciones, una vez por acumulación, o duración por acumulación (PerStack segundos cada una). La regla de diseño: sin acumulaciones, lo que escala no se aplica; con ellas, más. Un combo les pasa su StackSnapshot a sus pasos (la Ráfaga aturdidora), y GA_InstantAoE.ExtraHitsPerStack repite el golpe una vez por acumulación (los Cortes devastadores).</w:t>
+      </w:r>
+    </w:p>
+    <w:p>
+      <w:pPr>
+        <w:spacing w:after="120" w:line="276"/>
+      </w:pPr>
+      <w:r>
+        <w:rPr>
+          <w:b/>
+          <w:bCs/>
+        </w:rPr>
+        <w:t xml:space="preserve">Con los puntos del objetivo, con mínimo y máximo</w:t>
+      </w:r>
+      <w:r>
+        <w:t xml:space="preserve"> (23 de octubre de 2026). Cada entrada de Effects escala también con un tag del GOLPEADO (TargetStacksTag: los puntos arcanos), y ScaleByTargetPoints resuelve los tres modos: duración por punto, duración extra por punto y </w:t>
+      </w:r>
+      <w:r>
+        <w:rPr>
+          <w:b/>
+          <w:bCs/>
+        </w:rPr>
+        <w:t xml:space="preserve">veces por punto</w:t>
+      </w:r>
+      <w:r>
+        <w:t xml:space="preserve"> (TimesPerStack, redondeado: para un buff que se acumula de a 1 %). TargetMinimum (&gt; 0) la aplica aunque no tenga puntos, con ese mínimo; TargetMaximum le pone tope.</w:t>
+      </w:r>
+    </w:p>
+    <w:p>
+      <w:pPr>
+        <w:spacing w:after="120" w:line="276"/>
+      </w:pPr>
+      <w:r>
+        <w:rPr>
+          <w:b/>
+          <w:bCs/>
+        </w:rPr>
+        <w:t xml:space="preserve">Al terminar de golpear</w:t>
+      </w:r>
+      <w:r>
+        <w:t xml:space="preserve"> (EEffectWhen.AfterHits). Va UNA vez al lanzador, después de golpear a todos y solo si golpeó a algún enemigo, con los puntos de TODOS los golpeados sumados. ApplyHitEffects lleva la cuenta (TallyForAfterHits, al principio de cada golpe a un enemigo, ANTES de que las entradas de abajo gasten los puntos); CommitAbility la pone en cero, y la habilidad llama ApplyAfterHitsEffects() cuando terminó: GA_Dash después del recorrido y GA_InstantAoE después del estallido (SupportsAfterHits). Así el corte avanzando y el Baile final del Filo danzante se dan su beneficio, 4 % por punto de 5 % a 20 %.</w:t>
+      </w:r>
+    </w:p>
+    <w:p>
+      <w:pPr>
+        <w:pStyle w:val="Heading2"/>
+        <w:spacing w:after="120" w:before="280"/>
+      </w:pPr>
+      <w:r>
+        <w:rPr>
+          <w:b/>
+          <w:bCs/>
+          <w:color w:val="2E74B5"/>
+          <w:sz w:val="26"/>
+          <w:szCs w:val="26"/>
+        </w:rPr>
+        <w:t xml:space="preserve">4.7 Ecos: lo que sale además desde otro personaje</w:t>
+      </w:r>
+    </w:p>
+    <w:p>
+      <w:pPr>
+        <w:spacing w:after="120" w:line="276"/>
+      </w:pPr>
+      <w:r>
+        <w:t xml:space="preserve">Desde el 22 de octubre de 2026 (la Proyección arcana de la Abjuración). Un </w:t>
+      </w:r>
+      <w:r>
+        <w:rPr>
+          <w:b/>
+          <w:bCs/>
+        </w:rPr>
+        <w:t xml:space="preserve">IAbilityEchoSource</w:t>
+      </w:r>
+      <w:r>
+        <w:t xml:space="preserve"> registrado en el ASC del dueño (RegisterEchoSource, desde su prefab de pasivas, como un IDamageModifier) dice desde quiénes sale además lo que el dueño dispara, y con qué parte del daño (AbilityEcho: From y DamageScale). Cada habilidad que dispara llama </w:t>
+      </w:r>
+      <w:r>
+        <w:rPr>
+          <w:b/>
+          <w:bCs/>
+        </w:rPr>
+        <w:t xml:space="preserve">GameplayAbility.FireEchoes</w:t>
+      </w:r>
+      <w:r>
+        <w:t xml:space="preserve"> en el momento en que sale lo suyo: GA_ProjectileShoot al soltar cada proyectil (también cada uno de una ráfaga), GA_HitscanShot al resolver el tiro y GA_GroundFissure al arrancar las grietas. La copia sale del otro personaje (del pecho; las grietas, de sus pies) hacia el PUNTO DE MIRA del dueño.</w:t>
+      </w:r>
+    </w:p>
+    <w:p>
+      <w:pPr>
+        <w:spacing w:after="120" w:line="276"/>
+      </w:pPr>
+      <w:r>
+        <w:t xml:space="preserve">La copia es otra instancia de la misma habilidad, una por habilidad y reusada (EchoInstance: Instantiate de la instancia, con el mismo dueño, el mismo SourceTemplate para la red, IsEcho y sin costo, cooldown ni cargas). Los golpes son del dueño: la baja, los puntos, sus pasivas (la Protección arcana gana escudo también con lo que pegan las copias). Una copia no hace ecos propios y no carga la definitiva (ChargeUltimate la saltea; su proyectil sale con 0 de carga). Lo que la habilidad suelta al chocar (la explosión y la zona de la Bola de fuego) hereda DamageScale e IsEcho. La fuente decide a qué habilidades copiar: la Abjuración solo al ataque básico, que se pregunta con </w:t>
+      </w:r>
+      <w:r>
+        <w:rPr>
+          <w:b/>
+          <w:bCs/>
+        </w:rPr>
+        <w:t xml:space="preserve">CountsAsBasicAttack</w:t>
+      </w:r>
+      <w:r>
+        <w:t xml:space="preserve"> (ella misma o el switch que la lanzó).</w:t>
+      </w:r>
+    </w:p>
+    <w:p>
+      <w:pPr>
+        <w:spacing w:after="120" w:line="276"/>
+      </w:pPr>
+      <w:r>
+        <w:rPr>
+          <w:b/>
+          <w:bCs/>
+        </w:rPr>
+        <w:t xml:space="preserve">Copias de efectos hechas en juego.</w:t>
+      </w:r>
+      <w:r>
+        <w:t xml:space="preserve"> El daño de una copia sale escalado: ApplyHitEffects cambia cada efecto que baja vida por </w:t>
+      </w:r>
+      <w:r>
+        <w:rPr>
+          <w:b/>
+          <w:bCs/>
+        </w:rPr>
+        <w:t xml:space="preserve">GameplayEffect.CreateDamageScaledCopy(DamageScale)</w:t>
+      </w:r>
+      <w:r>
+        <w:t xml:space="preserve"> (los modificadores sumados sobre Health con algo negativo —fijos, escalados por stat o por la vida del objetivo, y su piso— × la escala; la quemadura también), cacheada por habilidad. Igual, con el tag de </w:t>
+      </w:r>
+      <w:r>
+        <w:rPr>
+          <w:b/>
+          <w:bCs/>
+        </w:rPr>
+        <w:t xml:space="preserve">Daño mágico con el tag</w:t>
+      </w:r>
+      <w:r>
+        <w:t xml:space="preserve"> (MagicDamageTag; los cortes y el dash del Filo danzante con Status_MagicBlade) cambia el efecto por </w:t>
+      </w:r>
+      <w:r>
+        <w:rPr>
+          <w:b/>
+          <w:bCs/>
+        </w:rPr>
+        <w:t xml:space="preserve">CreateMagicCopy</w:t>
+      </w:r>
+      <w:r>
+        <w:t xml:space="preserve">: los modificadores de daño que escalan del Ataque pasan a escalar del Daño mágico, con el mismo coeficiente. El orden en ApplyHitEffects: el reemplazo del parry (la copia congelada), después el mágico, después el escalado. Todas apuntan a su original con SourceTemplate: la red y la barra de efectos las tratan como él.</w:t>
       </w:r>
     </w:p>
     <w:p>
@@ -4884,6 +5037,36 @@
       </w:pPr>
       <w:r>
         <w:t xml:space="preserve">El tag lo trae el mismo GE que otorga el escudo, así que al agotarse el escudo la curación deja de sumar sola aunque al tag le quede duración. Lo usan Cubrir con escudo del Juramento de la conquista y, más adelante, la defensa mejorada del Monje.</w:t>
+      </w:r>
+    </w:p>
+    <w:p>
+      <w:pPr>
+        <w:spacing w:after="120" w:line="276"/>
+      </w:pPr>
+      <w:r>
+        <w:rPr>
+          <w:b/>
+          <w:bCs/>
+        </w:rPr>
+        <w:t xml:space="preserve">El escudo a la vista</w:t>
+      </w:r>
+      <w:r>
+        <w:t xml:space="preserve"> (22 de octubre de 2026). La barra de arriba de la cabeza lo dibuja como vida extra: UI_Nameplate.ShieldFill, una copia del relleno de vida que va detrás de él, la estira UI_WorldHealthbar de 0 a vida + escudo (con NetShield), y si pasa de la vida máxima sale por la derecha de la barra, hasta el doble. La forma la lee en vivo del relleno de vida: el de un Slider lo maneja el Slider y en el prefab sus anclas quedan guardadas en 0. Lo que se ve alrededor de un personaje con escudo NO es un componente: va en el TargetVFX del GE que lo da (la burbuja de la Abjuración es GE_ArcaneShield).</w:t>
+      </w:r>
+    </w:p>
+    <w:p>
+      <w:pPr>
+        <w:spacing w:after="120" w:line="276"/>
+      </w:pPr>
+      <w:r>
+        <w:rPr>
+          <w:b/>
+          <w:bCs/>
+        </w:rPr>
+        <w:t xml:space="preserve">Un escudo escrito a mano</w:t>
+      </w:r>
+      <w:r>
+        <w:t xml:space="preserve"> (la Protección arcana de la Abjuración: un % del daño hecho, que un GE no sabe dar). Shield es UN pozo para todos los escudos, así que quien lo escribe con SetCurrentAttributeValue lleva la cuenta de lo suyo: si el escudo real queda por debajo de lo anotado (golpes), descuenta primero lo que baja solo y después lo demás; al terminar saca lo que le queda de lo suyo y no toca el de otros. Si va a un aliado, avisa NotifyHealedAlly: para la definitiva del Soporte, dar escudo cuenta como curar.</w:t>
       </w:r>
     </w:p>
     <w:p>
@@ -6456,6 +6639,51 @@
         <w:spacing w:after="120" w:line="276"/>
       </w:pPr>
       <w:r>
+        <w:rPr>
+          <w:b/>
+          <w:bCs/>
+        </w:rPr>
+        <w:t xml:space="preserve">Al instante y sin cooldown con tag</w:t>
+      </w:r>
+      <w:r>
+        <w:t xml:space="preserve"> (GA_TagSwitch.InstantTag, 22 de octubre de 2026: la Memoria perfecta de la Evocación). Con ese tag en el dueño, la variante sale con ActivateInstant: ActivateFree (PayCostAndCooldown sale sin cobrar, SetFreeActivation), CastSettingsSource devuelve el switch (que no canaliza), y si de verdad salió (CommittedThisActivation o StartedThisActivation) gasta UNA acumulación del tag. InstantSkipsDefault deja afuera la de por defecto (la recarga de maná). Con la habilidad en cooldown no sale: dice “sin PONER cooldown”.</w:t>
+      </w:r>
+    </w:p>
+    <w:p>
+      <w:pPr>
+        <w:spacing w:after="120" w:line="276"/>
+      </w:pPr>
+      <w:r>
+        <w:rPr>
+          <w:b/>
+          <w:bCs/>
+        </w:rPr>
+        <w:t xml:space="preserve">Sin para pagarla: le quita el tag</w:t>
+      </w:r>
+      <w:r>
+        <w:t xml:space="preserve"> (DropTagWhenUnaffordable, 23 de octubre de 2026). Con FallBackWhenUnaffordable, una variante que no alcanza a pagar no sale y sale la de por defecto; por defecto además se le quita el tag (DropUnpayableVariants: el Mago base pierde el hechizo). Apagado, el tag se queda y la variante vuelve a salir cuando alcance (el Filo danzante: corte normal hasta juntar el maná del corte avanzando). El ícono del botón ya muestra la que va a salir (CanPay).</w:t>
+      </w:r>
+    </w:p>
+    <w:p>
+      <w:pPr>
+        <w:spacing w:after="120" w:line="276"/>
+      </w:pPr>
+      <w:r>
+        <w:rPr>
+          <w:b/>
+          <w:bCs/>
+        </w:rPr>
+        <w:t xml:space="preserve">La mira fija al canalizar lo apuntado en el piso</w:t>
+      </w:r>
+      <w:r>
+        <w:t xml:space="preserve"> (22 de octubre de 2026: las Q del Mago que canalizan 2 s). CastRoutine guarda al empezar el punto de mira, la posición desde la que se pidió (NetworkRequestPosition) y el giro del muro (NetworkPlacementYaw), y llama PlayerController.LockAim: mientras dura, GetAimPoint devuelve el guardado, también en el host, que si no lee su cámara en vivo. Antes de Activate() los restaura, y UnlockAim al terminar o al cortarse. Así cae donde se soltó aunque el jugador mire a otro lado o se mueva.</w:t>
+      </w:r>
+    </w:p>
+    <w:p>
+      <w:pPr>
+        <w:spacing w:after="120" w:line="276"/>
+      </w:pPr>
+      <w:r>
         <w:t xml:space="preserve">El choque de los proyectiles es un BARRIDO (19 de octubre de 2026). GC_Projectile ya no usa OnTriggerEnter: en cada FixedUpdate el servidor barre el tramo que recorrió con la forma del proyectil (BoxCast o SphereCast contra paredes, escudos y gente, con la matriz de colisiones de su capa) y con una esfera de CharacterHitRadius solo contra personajes, y procesa lo encontrado en orden de distancia: un escudo frena antes que el que está detrás, y cada collider cuenta una vez. Antes, a 100 m/s avanzaba 2 m por paso y se saltaba paredes o escudos finos. El primer tramo sale del cuerpo del que tira (pegado a una pared, de frente, pega en la pared). La caja se ajusta al arma que se ve volar (FitColliderToModel), así un tiro que pasa cerca de una pared ya no pega en ella; acertarle a la gente lo decide el radio aparte (0.5 m; la flecha, 0: su caja).</w:t>
       </w:r>
     </w:p>
@@ -9031,6 +9259,26 @@
           <w:b/>
           <w:bCs/>
         </w:rPr>
+        <w:t xml:space="preserve">Crecer.</w:t>
+      </w:r>
+      <w:r>
+        <w:t xml:space="preserve"> Entity_Summon.GrowZone(metros, tope) agranda la zona en juego: viaja en un SyncVar (ZoneGrowth), Summon_Zone.CurrentRadius lo suma y su VFX crece con ella (la Tormenta de la Evocación, con cada rayo de la Descarga).</w:t>
+      </w:r>
+    </w:p>
+    <w:p>
+      <w:pPr>
+        <w:pStyle w:val="ListParagraph"/>
+        <w:numPr>
+          <w:ilvl w:val="0"/>
+          <w:numId w:val="2"/>
+        </w:numPr>
+        <w:spacing w:after="60"/>
+      </w:pPr>
+      <w:r>
+        <w:rPr>
+          <w:b/>
+          <w:bCs/>
+        </w:rPr>
         <w:t xml:space="preserve">El VFX.</w:t>
       </w:r>
       <w:r>
@@ -9699,6 +9947,29 @@
                 <w:szCs w:val="20"/>
               </w:rPr>
               <w:t xml:space="preserve">).</w:t>
+            </w:r>
+            <w:r>
+              <w:rPr>
+                <w:sz w:val="20"/>
+                <w:szCs w:val="20"/>
+              </w:rPr>
+              <w:t xml:space="preserve"> El Muro lleva además un </w:t>
+            </w:r>
+            <w:r>
+              <w:rPr>
+                <w:b/>
+                <w:bCs/>
+                <w:sz w:val="20"/>
+                <w:szCs w:val="20"/>
+              </w:rPr>
+              <w:t xml:space="preserve">Summon_ProjectileBooster</w:t>
+            </w:r>
+            <w:r>
+              <w:rPr>
+                <w:sz w:val="20"/>
+                <w:szCs w:val="20"/>
+              </w:rPr>
+              <w:t xml:space="preserve">: sin collider, la caja de su zona se mira con cuentas contra el tramo que recorre cada proyectil en el servidor, y uno del MISMO dueño que la cruza queda potenciado (GC_Projectile.Boost: crece en todas las pantallas por un SyncVar y al chocar suelta la Explosión potenciada de su habilidad). En la de la Evocación el pararrayos crece con cada rayo (GrowthPerStrike, MaxGrowth: CurrentStrikeRange y la zona con GrowZone).</w:t>
             </w:r>
           </w:p>
         </w:tc>
@@ -13352,7 +13623,7 @@
                 <w:sz w:val="20"/>
                 <w:szCs w:val="20"/>
               </w:rPr>
-              <w:t xml:space="preserve">Un punto arcano del Mago (GE_ArcanePoint, hasta 5, 6 s): lo dejan los misiles; cada uno suma +2 a cada golpe del Mago (ArcaneVulnerabilityPassive) y los hechizos escalan con ellos.</w:t>
+              <w:t xml:space="preserve">Un punto arcano del Mago (GE_ArcanePoint, hasta 5, 15 s): lo dejan los misiles y los cortes del Filo danzante; cada uno suma +1 a cada golpe del Mago (ArcaneVulnerabilityPassive) y los hechizos escalan con ellos.</w:t>
             </w:r>
           </w:p>
         </w:tc>
@@ -13451,6 +13722,153 @@
                 <w:szCs w:val="20"/>
               </w:rPr>
               <w:t xml:space="preserve">Encerrado en la Tumba helada: lo llevan en ActivationBlockedTags las otras habilidades del Mago, y apretar la Q otra vez lo saca (GA_SelfBuff.EndTag).</w:t>
+            </w:r>
+          </w:p>
+        </w:tc>
+      </w:tr>
+      <w:tr>
+        <w:tc>
+          <w:tcPr>
+            <w:tcW w:type="dxa" w:w="2600"/>
+            <w:tcMar>
+              <w:top w:type="dxa" w:w="60"/>
+              <w:left w:type="dxa" w:w="100"/>
+              <w:bottom w:type="dxa" w:w="60"/>
+              <w:right w:type="dxa" w:w="100"/>
+            </w:tcMar>
+          </w:tcPr>
+          <w:p>
+            <w:pPr>
+              <w:spacing w:after="0"/>
+            </w:pPr>
+            <w:r>
+              <w:rPr>
+                <w:rFonts w:ascii="Consolas" w:cs="Consolas" w:eastAsia="Consolas" w:hAnsi="Consolas"/>
+                <w:sz w:val="18"/>
+                <w:szCs w:val="18"/>
+              </w:rPr>
+              <w:t xml:space="preserve">Status_PerfectMemory / Status_SteadyFlight</w:t>
+            </w:r>
+          </w:p>
+        </w:tc>
+        <w:tc>
+          <w:tcPr>
+            <w:tcW w:type="dxa" w:w="6800"/>
+            <w:tcMar>
+              <w:top w:type="dxa" w:w="60"/>
+              <w:left w:type="dxa" w:w="100"/>
+              <w:bottom w:type="dxa" w:w="60"/>
+              <w:right w:type="dxa" w:w="100"/>
+            </w:tcMar>
+          </w:tcPr>
+          <w:p>
+            <w:pPr>
+              <w:spacing w:after="0"/>
+            </w:pPr>
+            <w:r>
+              <w:rPr>
+                <w:sz w:val="20"/>
+                <w:szCs w:val="20"/>
+              </w:rPr>
+              <w:t xml:space="preserve">Evocación: la próxima Q sale al instante y sin cooldown, y gasta una (GA_TagSwitch.InstantTag; la Sobrecarga da 3). Vuelo firme: el daño no corta el vuelo libre.</w:t>
+            </w:r>
+          </w:p>
+        </w:tc>
+      </w:tr>
+      <w:tr>
+        <w:tc>
+          <w:tcPr>
+            <w:tcW w:type="dxa" w:w="2600"/>
+            <w:tcMar>
+              <w:top w:type="dxa" w:w="60"/>
+              <w:left w:type="dxa" w:w="100"/>
+              <w:bottom w:type="dxa" w:w="60"/>
+              <w:right w:type="dxa" w:w="100"/>
+            </w:tcMar>
+          </w:tcPr>
+          <w:p>
+            <w:pPr>
+              <w:spacing w:after="0"/>
+            </w:pPr>
+            <w:r>
+              <w:rPr>
+                <w:rFonts w:ascii="Consolas" w:cs="Consolas" w:eastAsia="Consolas" w:hAnsi="Consolas"/>
+                <w:sz w:val="18"/>
+                <w:szCs w:val="18"/>
+              </w:rPr>
+              <w:t xml:space="preserve">Status_ArcaneProjection / Status_MaximumProtection / Status_DefensiveDance</w:t>
+            </w:r>
+          </w:p>
+        </w:tc>
+        <w:tc>
+          <w:tcPr>
+            <w:tcW w:type="dxa" w:w="6800"/>
+            <w:tcMar>
+              <w:top w:type="dxa" w:w="60"/>
+              <w:left w:type="dxa" w:w="100"/>
+              <w:bottom w:type="dxa" w:w="60"/>
+              <w:right w:type="dxa" w:w="100"/>
+            </w:tcMar>
+          </w:tcPr>
+          <w:p>
+            <w:pPr>
+              <w:spacing w:after="0"/>
+            </w:pPr>
+            <w:r>
+              <w:rPr>
+                <w:sz w:val="20"/>
+                <w:szCs w:val="20"/>
+              </w:rPr>
+              <w:t xml:space="preserve">Abjuración: proyectado (GE_ArcaneProjection, lo refresca la pasiva; solo para el ícono y el VFX) y la Protección máxima activa (GE_MaximumProtection, 8 s). Filo danzante: una acumulación de la Danza defensiva por cada 3 % (las pone y saca DefensiveDancePassive).</w:t>
+            </w:r>
+          </w:p>
+        </w:tc>
+      </w:tr>
+      <w:tr>
+        <w:tc>
+          <w:tcPr>
+            <w:tcW w:type="dxa" w:w="2600"/>
+            <w:tcMar>
+              <w:top w:type="dxa" w:w="60"/>
+              <w:left w:type="dxa" w:w="100"/>
+              <w:bottom w:type="dxa" w:w="60"/>
+              <w:right w:type="dxa" w:w="100"/>
+            </w:tcMar>
+          </w:tcPr>
+          <w:p>
+            <w:pPr>
+              <w:spacing w:after="0"/>
+            </w:pPr>
+            <w:r>
+              <w:rPr>
+                <w:rFonts w:ascii="Consolas" w:cs="Consolas" w:eastAsia="Consolas" w:hAnsi="Consolas"/>
+                <w:sz w:val="18"/>
+                <w:szCs w:val="18"/>
+              </w:rPr>
+              <w:t xml:space="preserve">Status_MagicBlade</w:t>
+            </w:r>
+          </w:p>
+        </w:tc>
+        <w:tc>
+          <w:tcPr>
+            <w:tcW w:type="dxa" w:w="6800"/>
+            <w:tcMar>
+              <w:top w:type="dxa" w:w="60"/>
+              <w:left w:type="dxa" w:w="100"/>
+              <w:bottom w:type="dxa" w:w="60"/>
+              <w:right w:type="dxa" w:w="100"/>
+            </w:tcMar>
+          </w:tcPr>
+          <w:p>
+            <w:pPr>
+              <w:spacing w:after="0"/>
+            </w:pPr>
+            <w:r>
+              <w:rPr>
+                <w:sz w:val="20"/>
+                <w:szCs w:val="20"/>
+              </w:rPr>
+              <w:t xml:space="preserve">La Espada mágica del Filo danzante (GE_MagicBlade, 8 s): sus cortes hacen daño mágico (“Daño mágico con el tag” de GA_ConeAttack y GA_Dash).</w:t>
             </w:r>
           </w:p>
         </w:tc>
@@ -14606,6 +15024,55 @@
           </w:p>
         </w:tc>
       </w:tr>
+      <w:tr>
+        <w:tc>
+          <w:tcPr>
+            <w:tcW w:type="dxa" w:w="2800"/>
+            <w:tcMar>
+              <w:top w:type="dxa" w:w="60"/>
+              <w:left w:type="dxa" w:w="100"/>
+              <w:bottom w:type="dxa" w:w="60"/>
+              <w:right w:type="dxa" w:w="100"/>
+            </w:tcMar>
+          </w:tcPr>
+          <w:p>
+            <w:pPr>
+              <w:spacing w:after="0"/>
+            </w:pPr>
+            <w:r>
+              <w:rPr>
+                <w:rFonts w:ascii="Consolas" w:cs="Consolas" w:eastAsia="Consolas" w:hAnsi="Consolas"/>
+                <w:sz w:val="18"/>
+                <w:szCs w:val="18"/>
+              </w:rPr>
+              <w:t xml:space="preserve">IAbilityEchoSource</w:t>
+            </w:r>
+          </w:p>
+        </w:tc>
+        <w:tc>
+          <w:tcPr>
+            <w:tcW w:type="dxa" w:w="6600"/>
+            <w:tcMar>
+              <w:top w:type="dxa" w:w="60"/>
+              <w:left w:type="dxa" w:w="100"/>
+              <w:bottom w:type="dxa" w:w="60"/>
+              <w:right w:type="dxa" w:w="100"/>
+            </w:tcMar>
+          </w:tcPr>
+          <w:p>
+            <w:pPr>
+              <w:spacing w:after="0"/>
+            </w:pPr>
+            <w:r>
+              <w:rPr>
+                <w:sz w:val="20"/>
+                <w:szCs w:val="20"/>
+              </w:rPr>
+              <w:t xml:space="preserve">Hace que lo que dispara su dueño salga además desde otros personajes, con parte del daño (los ecos, ver 4.7). Se registra en el ASC.</w:t>
+            </w:r>
+          </w:p>
+        </w:tc>
+      </w:tr>
     </w:tbl>
     <w:p>
       <w:pPr>
@@ -14686,6 +15153,19 @@
     </w:p>
     <w:p>
       <w:pPr>
+        <w:pBdr>
+          <w:left w:val="single" w:color="E0A800" w:sz="14" w:space="6"/>
+        </w:pBdr>
+        <w:shd w:fill="FFF6DA" w:val="clear"/>
+        <w:spacing w:after="160" w:before="100"/>
+        <w:ind w:left="144" w:right="144"/>
+      </w:pPr>
+      <w:r>
+        <w:t xml:space="preserve">Las del Mago: WizardBehaviours (ArcaneVulnerabilityPassive y las bolas de los puntos), que la Evocación usa tal cual; la Abjuración y el Filo danzante llevan una COPIA con lo suyo agregado: AbjurationBehaviours + ArcaneProtectionPassive (las proyecciones, su escudo, la Protección máxima y los ecos) y BladeBehaviours + DefensiveDancePassive (cuenta los puntos de los enemigos a 8 m y pone o saca acumulaciones de GE_DefensiveDance).</w:t>
+      </w:r>
+    </w:p>
+    <w:p>
+      <w:pPr>
         <w:pStyle w:val="Heading1"/>
         <w:spacing w:after="160" w:before="360"/>
       </w:pPr>
@@ -15470,6 +15950,32 @@
       </w:pPr>
       <w:r>
         <w:t xml:space="preserve">Un movimiento de bot que no mira los tags de control: el agente del NavMesh no sabe de aturdidos. BotController frena el agente con State_Stunned o State_Rooted (desde el 21 de octubre de 2026; antes un bot aturdido seguía caminando).</w:t>
+      </w:r>
+    </w:p>
+    <w:p>
+      <w:pPr>
+        <w:pStyle w:val="ListParagraph"/>
+        <w:numPr>
+          <w:ilvl w:val="0"/>
+          <w:numId w:val="2"/>
+        </w:numPr>
+        <w:spacing w:after="60"/>
+      </w:pPr>
+      <w:r>
+        <w:t xml:space="preserve">Esperar que la copia de un efecto hecha en juego (congelada por un parry, escalada por un eco, mágica por la Espada) refresque o reemplace al original: es OTRO efecto, y la acumulación compara la Definition. Por eso la quemadura de una copia convive con la del original. Para que versiones distintas se reemplacen entre sí, EffectGroup con ReplacesGroup.</w:t>
+      </w:r>
+    </w:p>
+    <w:p>
+      <w:pPr>
+        <w:pStyle w:val="ListParagraph"/>
+        <w:numPr>
+          <w:ilvl w:val="0"/>
+          <w:numId w:val="2"/>
+        </w:numPr>
+        <w:spacing w:after="60"/>
+      </w:pPr>
+      <w:r>
+        <w:t xml:space="preserve">Cobrar un costo a mano con this de fuente: un costo que escala con un stat daba 0. Va con CostSource (ver 4.1).</w:t>
       </w:r>
     </w:p>
     <w:p>
@@ -15793,71 +16299,71 @@
                 <w:sz w:val="18"/>
                 <w:szCs w:val="18"/>
               </w:rPr>
-              <w:t xml:space="preserve">EAttributeType.cs</w:t>
-            </w:r>
-            <w:r>
-              <w:rPr>
-                <w:sz w:val="20"/>
-                <w:szCs w:val="20"/>
-              </w:rPr>
-              <w:t xml:space="preserve"> / </w:t>
-            </w:r>
+              <w:t xml:space="preserve">AbilityEcho.cs</w:t>
+            </w:r>
+          </w:p>
+        </w:tc>
+        <w:tc>
+          <w:tcPr>
+            <w:tcW w:type="dxa" w:w="6000"/>
+            <w:tcMar>
+              <w:top w:type="dxa" w:w="60"/>
+              <w:left w:type="dxa" w:w="100"/>
+              <w:bottom w:type="dxa" w:w="60"/>
+              <w:right w:type="dxa" w:w="100"/>
+            </w:tcMar>
+          </w:tcPr>
+          <w:p>
+            <w:pPr>
+              <w:spacing w:after="0"/>
+            </w:pPr>
+            <w:r>
+              <w:rPr>
+                <w:sz w:val="20"/>
+                <w:szCs w:val="20"/>
+              </w:rPr>
+              <w:t xml:space="preserve">Los ecos: IAbilityEchoSource y AbilityEcho (desde quién sale además lo que dispara un personaje, ver 4.7).</w:t>
+            </w:r>
+          </w:p>
+        </w:tc>
+      </w:tr>
+      <w:tr>
+        <w:tc>
+          <w:tcPr>
+            <w:tcW w:type="dxa" w:w="3400"/>
+            <w:tcMar>
+              <w:top w:type="dxa" w:w="60"/>
+              <w:left w:type="dxa" w:w="100"/>
+              <w:bottom w:type="dxa" w:w="60"/>
+              <w:right w:type="dxa" w:w="100"/>
+            </w:tcMar>
+          </w:tcPr>
+          <w:p>
+            <w:pPr>
+              <w:spacing w:after="0"/>
+            </w:pPr>
             <w:r>
               <w:rPr>
                 <w:rFonts w:ascii="Consolas" w:cs="Consolas" w:eastAsia="Consolas" w:hAnsi="Consolas"/>
                 <w:sz w:val="18"/>
                 <w:szCs w:val="18"/>
               </w:rPr>
-              <w:t xml:space="preserve">EGameplayTag.cs</w:t>
-            </w:r>
-          </w:p>
-        </w:tc>
-        <w:tc>
-          <w:tcPr>
-            <w:tcW w:type="dxa" w:w="6000"/>
-            <w:tcMar>
-              <w:top w:type="dxa" w:w="60"/>
-              <w:left w:type="dxa" w:w="100"/>
-              <w:bottom w:type="dxa" w:w="60"/>
-              <w:right w:type="dxa" w:w="100"/>
-            </w:tcMar>
-          </w:tcPr>
-          <w:p>
-            <w:pPr>
-              <w:spacing w:after="0"/>
-            </w:pPr>
-            <w:r>
-              <w:rPr>
-                <w:sz w:val="20"/>
-                <w:szCs w:val="20"/>
-              </w:rPr>
-              <w:t xml:space="preserve">Los dos enums centrales.</w:t>
-            </w:r>
-          </w:p>
-        </w:tc>
-      </w:tr>
-      <w:tr>
-        <w:tc>
-          <w:tcPr>
-            <w:tcW w:type="dxa" w:w="3400"/>
-            <w:tcMar>
-              <w:top w:type="dxa" w:w="60"/>
-              <w:left w:type="dxa" w:w="100"/>
-              <w:bottom w:type="dxa" w:w="60"/>
-              <w:right w:type="dxa" w:w="100"/>
-            </w:tcMar>
-          </w:tcPr>
-          <w:p>
-            <w:pPr>
-              <w:spacing w:after="0"/>
-            </w:pPr>
+              <w:t xml:space="preserve">EAttributeType.cs</w:t>
+            </w:r>
+            <w:r>
+              <w:rPr>
+                <w:sz w:val="20"/>
+                <w:szCs w:val="20"/>
+              </w:rPr>
+              <w:t xml:space="preserve"> / </w:t>
+            </w:r>
             <w:r>
               <w:rPr>
                 <w:rFonts w:ascii="Consolas" w:cs="Consolas" w:eastAsia="Consolas" w:hAnsi="Consolas"/>
                 <w:sz w:val="18"/>
                 <w:szCs w:val="18"/>
               </w:rPr>
-              <w:t xml:space="preserve">CharacterClassDefinition.cs</w:t>
+              <w:t xml:space="preserve">EGameplayTag.cs</w:t>
             </w:r>
           </w:p>
         </w:tc>
@@ -15880,7 +16386,7 @@
                 <w:sz w:val="20"/>
                 <w:szCs w:val="20"/>
               </w:rPr>
-              <w:t xml:space="preserve">El molde de una clase jugable.</w:t>
+              <w:t xml:space="preserve">Los dos enums centrales.</w:t>
             </w:r>
           </w:p>
         </w:tc>
@@ -15906,7 +16412,7 @@
                 <w:sz w:val="18"/>
                 <w:szCs w:val="18"/>
               </w:rPr>
-              <w:t xml:space="preserve">NetworkAbilitySystemComponent.cs</w:t>
+              <w:t xml:space="preserve">CharacterClassDefinition.cs</w:t>
             </w:r>
           </w:p>
         </w:tc>
@@ -15929,7 +16435,7 @@
                 <w:sz w:val="20"/>
                 <w:szCs w:val="20"/>
               </w:rPr>
-              <w:t xml:space="preserve">Toda la capa de red.</w:t>
+              <w:t xml:space="preserve">El molde de una clase jugable.</w:t>
             </w:r>
           </w:p>
         </w:tc>
@@ -15955,7 +16461,7 @@
                 <w:sz w:val="18"/>
                 <w:szCs w:val="18"/>
               </w:rPr>
-              <w:t xml:space="preserve">Player Controller.cs</w:t>
+              <w:t xml:space="preserve">NetworkAbilitySystemComponent.cs</w:t>
             </w:r>
           </w:p>
         </w:tc>
@@ -15978,7 +16484,7 @@
                 <w:sz w:val="20"/>
                 <w:szCs w:val="20"/>
               </w:rPr>
-              <w:t xml:space="preserve">Input, movimiento, animación y equipamiento de clase.</w:t>
+              <w:t xml:space="preserve">Toda la capa de red.</w:t>
             </w:r>
           </w:p>
         </w:tc>
@@ -16004,7 +16510,7 @@
                 <w:sz w:val="18"/>
                 <w:szCs w:val="18"/>
               </w:rPr>
-              <w:t xml:space="preserve">WallMovementProfile.cs</w:t>
+              <w:t xml:space="preserve">Player Controller.cs</w:t>
             </w:r>
           </w:p>
         </w:tc>
@@ -16027,7 +16533,7 @@
                 <w:sz w:val="20"/>
                 <w:szCs w:val="20"/>
               </w:rPr>
-              <w:t xml:space="preserve">Cómo se mueve una clase en las paredes (pegarse o correr); lo usa PlayerController.</w:t>
+              <w:t xml:space="preserve">Input, movimiento, animación y equipamiento de clase.</w:t>
             </w:r>
           </w:p>
         </w:tc>
@@ -16053,7 +16559,7 @@
                 <w:sz w:val="18"/>
                 <w:szCs w:val="18"/>
               </w:rPr>
-              <w:t xml:space="preserve">TeamReveal.cs · TeamRevealStyle.cs · TrajectoryPreview.cs</w:t>
+              <w:t xml:space="preserve">WallMovementProfile.cs</w:t>
             </w:r>
           </w:p>
         </w:tc>
@@ -16076,7 +16582,7 @@
                 <w:sz w:val="20"/>
                 <w:szCs w:val="20"/>
               </w:rPr>
-              <w:t xml:space="preserve">La silueta a través de paredes para el equipo que reveló (el material lo da TeamRevealStyle, en la cámara), y la curva del proyectil al apuntar (en la cámara, con sus dos LineRenderer).</w:t>
+              <w:t xml:space="preserve">Cómo se mueve una clase en las paredes (pegarse o correr); lo usa PlayerController.</w:t>
             </w:r>
           </w:p>
         </w:tc>
@@ -16102,7 +16608,7 @@
                 <w:sz w:val="18"/>
                 <w:szCs w:val="18"/>
               </w:rPr>
-              <w:t xml:space="preserve">UI/ (UI_Nameplate, UI_WorldHealthbar, UI_CastBar, UI_ChargeBar, UI_CombatFeedback, UI_LowHealthVignette, UI_RadialMenu, UI_RingWedge, UI_CompanionPanel; UI_KillFeed, UI_DamageNumbers, UI_ScreenFeedback, UI_MainMenu, UI_SettingsPanel, UI_LobbyPanel)</w:t>
+              <w:t xml:space="preserve">TeamReveal.cs · TeamRevealStyle.cs · TrajectoryPreview.cs</w:t>
             </w:r>
           </w:p>
         </w:tc>
@@ -16125,7 +16631,7 @@
                 <w:sz w:val="20"/>
                 <w:szCs w:val="20"/>
               </w:rPr>
-              <w:t xml:space="preserve">La UI: el HUD del jugador armado en el prefab Player Camera, y la de partida y los menús en los prefabs Match_UI y Menus_UI (moldes si algo se repite: UI_SettingRow, UI_LobbySlot); los scripts solo leen el juego y las animan. UI_RingWedge dibuja trozos de anillo en px (la rueda), sin sprite.</w:t>
+              <w:t xml:space="preserve">La silueta a través de paredes para el equipo que reveló (el material lo da TeamRevealStyle, en la cámara), y la curva del proyectil al apuntar (en la cámara, con sus dos LineRenderer).</w:t>
             </w:r>
           </w:p>
         </w:tc>
@@ -16151,7 +16657,7 @@
                 <w:sz w:val="18"/>
                 <w:szCs w:val="18"/>
               </w:rPr>
-              <w:t xml:space="preserve">Entities/Entity_Companion.cs · Ranger/BeastMaster/CompanionManager.cs</w:t>
+              <w:t xml:space="preserve">UI/ (UI_Nameplate, UI_WorldHealthbar, UI_CastBar, UI_ChargeBar, UI_CombatFeedback, UI_LowHealthVignette, UI_RadialMenu, UI_RingWedge, UI_CompanionPanel; UI_KillFeed, UI_DamageNumbers, UI_ScreenFeedback, UI_MainMenu, UI_SettingsPanel, UI_LobbyPanel)</w:t>
             </w:r>
           </w:p>
         </w:tc>
@@ -16174,7 +16680,7 @@
                 <w:sz w:val="20"/>
                 <w:szCs w:val="20"/>
               </w:rPr>
-              <w:t xml:space="preserve">Los compañeros del Maestro de bestias: la IA de cada uno en el servidor, y cuál está activo, sus esperas y las órdenes.</w:t>
+              <w:t xml:space="preserve">La UI: el HUD del jugador armado en el prefab Player Camera, y la de partida y los menús en los prefabs Match_UI y Menus_UI (moldes si algo se repite: UI_SettingRow, UI_LobbySlot); los scripts solo leen el juego y las animan. UI_RingWedge dibuja trozos de anillo en px (la rueda), sin sprite.</w:t>
             </w:r>
           </w:p>
         </w:tc>
@@ -16200,7 +16706,7 @@
                 <w:sz w:val="18"/>
                 <w:szCs w:val="18"/>
               </w:rPr>
-              <w:t xml:space="preserve">Editor/SectionedInspector.cs · LabeledComponentEditor.cs · LabeledFieldsDrawer.cs</w:t>
+              <w:t xml:space="preserve">Entities/Entity_Companion.cs · Ranger/BeastMaster/CompanionManager.cs</w:t>
             </w:r>
           </w:p>
         </w:tc>
@@ -16223,7 +16729,7 @@
                 <w:sz w:val="20"/>
                 <w:szCs w:val="20"/>
               </w:rPr>
-              <w:t xml:space="preserve">Los inspectores en español: [Label] en GA/GE/clases/ASDef, en los componentes y en las entradas de lista.</w:t>
+              <w:t xml:space="preserve">Los compañeros del Maestro de bestias: la IA de cada uno en el servidor, y cuál está activo, sus esperas y las órdenes.</w:t>
             </w:r>
           </w:p>
         </w:tc>
@@ -16249,7 +16755,7 @@
                 <w:sz w:val="18"/>
                 <w:szCs w:val="18"/>
               </w:rPr>
-              <w:t xml:space="preserve">Localization/ (Loc, LocalizedText)</w:t>
+              <w:t xml:space="preserve">Editor/SectionedInspector.cs · LabeledComponentEditor.cs · LabeledFieldsDrawer.cs</w:t>
             </w:r>
           </w:p>
         </w:tc>
@@ -16272,7 +16778,7 @@
                 <w:sz w:val="20"/>
                 <w:szCs w:val="20"/>
               </w:rPr>
-              <w:t xml:space="preserve">Los textos del juego por clave, en español e inglés; la tabla es Resources/Localization.csv. El idioma lo guarda GameSettings.Language (arranca en español).</w:t>
+              <w:t xml:space="preserve">Los inspectores en español: [Label] en GA/GE/clases/ASDef, en los componentes y en las entradas de lista.</w:t>
             </w:r>
           </w:p>
         </w:tc>
@@ -16298,6 +16804,55 @@
                 <w:sz w:val="18"/>
                 <w:szCs w:val="18"/>
               </w:rPr>
+              <w:t xml:space="preserve">Localization/ (Loc, LocalizedText)</w:t>
+            </w:r>
+          </w:p>
+        </w:tc>
+        <w:tc>
+          <w:tcPr>
+            <w:tcW w:type="dxa" w:w="6000"/>
+            <w:tcMar>
+              <w:top w:type="dxa" w:w="60"/>
+              <w:left w:type="dxa" w:w="100"/>
+              <w:bottom w:type="dxa" w:w="60"/>
+              <w:right w:type="dxa" w:w="100"/>
+            </w:tcMar>
+          </w:tcPr>
+          <w:p>
+            <w:pPr>
+              <w:spacing w:after="0"/>
+            </w:pPr>
+            <w:r>
+              <w:rPr>
+                <w:sz w:val="20"/>
+                <w:szCs w:val="20"/>
+              </w:rPr>
+              <w:t xml:space="preserve">Los textos del juego por clave, en español e inglés; la tabla es Resources/Localization.csv. El idioma lo guarda GameSettings.Language (arranca en español).</w:t>
+            </w:r>
+          </w:p>
+        </w:tc>
+      </w:tr>
+      <w:tr>
+        <w:tc>
+          <w:tcPr>
+            <w:tcW w:type="dxa" w:w="3400"/>
+            <w:tcMar>
+              <w:top w:type="dxa" w:w="60"/>
+              <w:left w:type="dxa" w:w="100"/>
+              <w:bottom w:type="dxa" w:w="60"/>
+              <w:right w:type="dxa" w:w="100"/>
+            </w:tcMar>
+          </w:tcPr>
+          <w:p>
+            <w:pPr>
+              <w:spacing w:after="0"/>
+            </w:pPr>
+            <w:r>
+              <w:rPr>
+                <w:rFonts w:ascii="Consolas" w:cs="Consolas" w:eastAsia="Consolas" w:hAnsi="Consolas"/>
+                <w:sz w:val="18"/>
+                <w:szCs w:val="18"/>
+              </w:rPr>
               <w:t xml:space="preserve">GenericsAbilities/</w:t>
             </w:r>
           </w:p>
@@ -16322,6 +16877,55 @@
                 <w:szCs w:val="20"/>
               </w:rPr>
               <w:t xml:space="preserve">Los genéricos configurables — ver la guía de habilidades.</w:t>
+            </w:r>
+          </w:p>
+        </w:tc>
+      </w:tr>
+      <w:tr>
+        <w:tc>
+          <w:tcPr>
+            <w:tcW w:type="dxa" w:w="3400"/>
+            <w:tcMar>
+              <w:top w:type="dxa" w:w="60"/>
+              <w:left w:type="dxa" w:w="100"/>
+              <w:bottom w:type="dxa" w:w="60"/>
+              <w:right w:type="dxa" w:w="100"/>
+            </w:tcMar>
+          </w:tcPr>
+          <w:p>
+            <w:pPr>
+              <w:spacing w:after="0"/>
+            </w:pPr>
+            <w:r>
+              <w:rPr>
+                <w:rFonts w:ascii="Consolas" w:cs="Consolas" w:eastAsia="Consolas" w:hAnsi="Consolas"/>
+                <w:sz w:val="18"/>
+                <w:szCs w:val="18"/>
+              </w:rPr>
+              <w:t xml:space="preserve">Wizard/Evocation · Wizard/Abjuration · Wizard/Blade</w:t>
+            </w:r>
+          </w:p>
+        </w:tc>
+        <w:tc>
+          <w:tcPr>
+            <w:tcW w:type="dxa" w:w="6000"/>
+            <w:tcMar>
+              <w:top w:type="dxa" w:w="60"/>
+              <w:left w:type="dxa" w:w="100"/>
+              <w:bottom w:type="dxa" w:w="60"/>
+              <w:right w:type="dxa" w:w="100"/>
+            </w:tcMar>
+          </w:tcPr>
+          <w:p>
+            <w:pPr>
+              <w:spacing w:after="0"/>
+            </w:pPr>
+            <w:r>
+              <w:rPr>
+                <w:sz w:val="20"/>
+                <w:szCs w:val="20"/>
+              </w:rPr>
+              <w:t xml:space="preserve">Las tres subclases del Mago: sus assets y su código propio (GA_ArcaneProjection, ArcaneProtectionPassive, DefensiveDancePassive).</w:t>
             </w:r>
           </w:p>
         </w:tc>

</xml_diff>